<commit_message>
docs: refine role manual tone and accessibility
</commit_message>
<xml_diff>
--- a/docs/用户手册/公益智助柜App用户使用手册.docx
+++ b/docs/用户手册/公益智助柜App用户使用手册.docx
@@ -86,13 +86,7 @@
               <w:spacing w:before="40" w:after="40" w:line="300" w:lineRule="auto"/>
             </w:pPr>
             <w:r>
-              <w:rPr>
-                <w:rFonts w:ascii="Calibri" w:hAnsi="Calibri" w:eastAsia="Microsoft YaHei"/>
-                <w:b/>
-                <w:color w:val="0F766E"/>
-                <w:sz w:val="21"/>
-              </w:rPr>
-              <w:t>本手册仅供领取物资的 App 用户使用。手机号和一次性验证码不得转交他人。</w:t>
+              <w:t>这本手册是为领取物资的 App 用户准备的。手机号和一次性验证码请由本人保管和使用。</w:t>
             </w:r>
           </w:p>
         </w:tc>
@@ -145,6 +139,9 @@
         <w:gridCol w:w="6660"/>
       </w:tblGrid>
       <w:tr>
+        <w:trPr>
+          <w:tblHeader/>
+        </w:trPr>
         <w:tc>
           <w:tcPr>
             <w:tcW w:type="dxa" w:w="2700"/>
@@ -453,12 +450,7 @@
         </w:numPr>
       </w:pPr>
       <w:r>
-        <w:rPr>
-          <w:rFonts w:ascii="Calibri" w:hAnsi="Calibri" w:eastAsia="Microsoft YaHei"/>
-          <w:color w:val="0B2545"/>
-          <w:sz w:val="22"/>
-        </w:rPr>
-        <w:t>验证码使用一次后立即失效；过期、撤销或输错达到上限时应重新签发。</w:t>
+        <w:t>验证码使用一次后立即失效；过期、被撤销或输错达到上限时，请联系实例管理员重新签发。</w:t>
       </w:r>
     </w:p>
     <w:tbl>
@@ -502,7 +494,7 @@
               <w:drawing>
                 <wp:inline xmlns:a="http://schemas.openxmlformats.org/drawingml/2006/main" xmlns:pic="http://schemas.openxmlformats.org/drawingml/2006/picture">
                   <wp:extent cx="1920240" cy="4155596"/>
-                  <wp:docPr id="1" name="Picture 1"/>
+                  <wp:docPr id="1" name="身份识别页" title="身份识别页" descr="移动端身份识别页，提示用户输入本人手机号。"/>
                   <wp:cNvGraphicFramePr>
                     <a:graphicFrameLocks noChangeAspect="1"/>
                   </wp:cNvGraphicFramePr>
@@ -554,7 +546,7 @@
               <w:drawing>
                 <wp:inline xmlns:a="http://schemas.openxmlformats.org/drawingml/2006/main" xmlns:pic="http://schemas.openxmlformats.org/drawingml/2006/picture">
                   <wp:extent cx="1920240" cy="4155596"/>
-                  <wp:docPr id="2" name="Picture 2"/>
+                  <wp:docPr id="2" name="一次性验证码登录页" title="一次性验证码登录页" descr="移动端一次性验证码登录页，提示用户输入 6 位验证码。"/>
                   <wp:cNvGraphicFramePr>
                     <a:graphicFrameLocks noChangeAspect="1"/>
                   </wp:cNvGraphicFramePr>
@@ -831,13 +823,7 @@
               <w:spacing w:before="40" w:after="40" w:line="300" w:lineRule="auto"/>
             </w:pPr>
             <w:r>
-              <w:rPr>
-                <w:rFonts w:ascii="Calibri" w:hAnsi="Calibri" w:eastAsia="Microsoft YaHei"/>
-                <w:b/>
-                <w:color w:val="0F766E"/>
-                <w:sz w:val="21"/>
-              </w:rPr>
-              <w:t>预约取货不要求付款。页面出现付款要求时停止操作并联系实例管理员。</w:t>
+              <w:t>预约取货不需要付款。如果页面出现付款要求，请先暂停操作并联系实例管理员。</w:t>
             </w:r>
           </w:p>
         </w:tc>
@@ -889,7 +875,7 @@
               <w:drawing>
                 <wp:inline xmlns:a="http://schemas.openxmlformats.org/drawingml/2006/main" xmlns:pic="http://schemas.openxmlformats.org/drawingml/2006/picture">
                   <wp:extent cx="1920240" cy="4155596"/>
-                  <wp:docPr id="3" name="Picture 3"/>
+                  <wp:docPr id="3" name="预约进行中示意" title="预约进行中示意" descr="移动端预约进行中的页面示意，显示柜机、物资和预约状态。"/>
                   <wp:cNvGraphicFramePr>
                     <a:graphicFrameLocks noChangeAspect="1"/>
                   </wp:cNvGraphicFramePr>
@@ -941,7 +927,7 @@
               <w:drawing>
                 <wp:inline xmlns:a="http://schemas.openxmlformats.org/drawingml/2006/main" xmlns:pic="http://schemas.openxmlformats.org/drawingml/2006/picture">
                   <wp:extent cx="1920240" cy="4155596"/>
-                  <wp:docPr id="4" name="Picture 4"/>
+                  <wp:docPr id="4" name="预约提交成功示意" title="预约提交成功示意" descr="移动端预约提交成功的页面示意，显示当前预约和到柜提示。"/>
                   <wp:cNvGraphicFramePr>
                     <a:graphicFrameLocks noChangeAspect="1"/>
                   </wp:cNvGraphicFramePr>
@@ -1164,13 +1150,7 @@
               <w:spacing w:before="40" w:after="40" w:line="300" w:lineRule="auto"/>
             </w:pPr>
             <w:r>
-              <w:rPr>
-                <w:rFonts w:ascii="Calibri" w:hAnsi="Calibri" w:eastAsia="Microsoft YaHei"/>
-                <w:b/>
-                <w:color w:val="0F766E"/>
-                <w:sz w:val="21"/>
-              </w:rPr>
-              <w:t>页面尚未确认结果时不要重复开柜。保留当前页面，记录时间和柜机编号并联系实例管理员。</w:t>
+              <w:t>页面尚未确认结果时，请先不要重复开柜。保留当前页面，记下时间和柜机编号，再联系实例管理员。</w:t>
             </w:r>
           </w:p>
         </w:tc>
@@ -1210,6 +1190,9 @@
         <w:gridCol w:w="6660"/>
       </w:tblGrid>
       <w:tr>
+        <w:trPr>
+          <w:tblHeader/>
+        </w:trPr>
         <w:tc>
           <w:tcPr>
             <w:tcW w:type="dxa" w:w="2700"/>
@@ -1253,12 +1236,7 @@
               <w:spacing w:after="0" w:line="288" w:lineRule="auto"/>
             </w:pPr>
             <w:r>
-              <w:rPr>
-                <w:rFonts w:ascii="Calibri" w:hAnsi="Calibri" w:eastAsia="Microsoft YaHei"/>
-                <w:color w:val="0B2545"/>
-                <w:sz w:val="21"/>
-              </w:rPr>
-              <w:t>确认手机号属于本人且已建档启用；验证码必须是本次签发且尚未使用。</w:t>
+              <w:t>请确认手机号属于本人且已建档启用；验证码需要是本次签发且尚未使用的验证码。</w:t>
             </w:r>
           </w:p>
         </w:tc>
@@ -1417,12 +1395,7 @@
               <w:spacing w:after="0" w:line="288" w:lineRule="auto"/>
             </w:pPr>
             <w:r>
-              <w:rPr>
-                <w:rFonts w:ascii="Calibri" w:hAnsi="Calibri" w:eastAsia="Microsoft YaHei"/>
-                <w:color w:val="0B2545"/>
-                <w:sz w:val="21"/>
-              </w:rPr>
-              <w:t>不要重复开柜，保留页面并联系实例管理员。</w:t>
+              <w:t>请先不要重复开柜，保留页面并联系实例管理员。</w:t>
             </w:r>
           </w:p>
         </w:tc>
@@ -1471,12 +1444,7 @@
               <w:spacing w:after="0" w:line="288" w:lineRule="auto"/>
             </w:pPr>
             <w:r>
-              <w:rPr>
-                <w:rFonts w:ascii="Calibri" w:hAnsi="Calibri" w:eastAsia="Microsoft YaHei"/>
-                <w:color w:val="0B2545"/>
-                <w:sz w:val="21"/>
-              </w:rPr>
-              <w:t>停止操作并联系实例管理员核对预约设置。</w:t>
+              <w:t>请先暂停操作，并联系实例管理员核对预约设置。</w:t>
             </w:r>
           </w:p>
         </w:tc>

</xml_diff>

<commit_message>
fix(operations): harden cabinet recovery and rebuild manuals
</commit_message>
<xml_diff>
--- a/docs/用户手册/公益智助柜App用户使用手册.docx
+++ b/docs/用户手册/公益智助柜App用户使用手册.docx
@@ -2,115 +2,521 @@
 <file path=word/document.xml><?xml version="1.0" encoding="utf-8"?>
 <w:document xmlns:wpc="http://schemas.microsoft.com/office/word/2010/wordprocessingCanvas" xmlns:mo="http://schemas.microsoft.com/office/mac/office/2008/main" xmlns:mc="http://schemas.openxmlformats.org/markup-compatibility/2006" xmlns:mv="urn:schemas-microsoft-com:mac:vml" xmlns:o="urn:schemas-microsoft-com:office:office" xmlns:r="http://schemas.openxmlformats.org/officeDocument/2006/relationships" xmlns:m="http://schemas.openxmlformats.org/officeDocument/2006/math" xmlns:v="urn:schemas-microsoft-com:vml" xmlns:wp14="http://schemas.microsoft.com/office/word/2010/wordprocessingDrawing" xmlns:wp="http://schemas.openxmlformats.org/drawingml/2006/wordprocessingDrawing" xmlns:w10="urn:schemas-microsoft-com:office:word" xmlns:w="http://schemas.openxmlformats.org/wordprocessingml/2006/main" xmlns:w14="http://schemas.microsoft.com/office/word/2010/wordml" xmlns:wpg="http://schemas.microsoft.com/office/word/2010/wordprocessingGroup" xmlns:wpi="http://schemas.microsoft.com/office/word/2010/wordprocessingInk" xmlns:wne="http://schemas.microsoft.com/office/word/2006/wordml" xmlns:wps="http://schemas.microsoft.com/office/word/2010/wordprocessingShape" mc:Ignorable="w14 wp14">
   <w:body>
-    <w:p/>
-    <w:p/>
-    <w:p/>
-    <w:p/>
     <w:p>
       <w:pPr>
-        <w:jc w:val="center"/>
+        <w:keepNext/>
+        <w:spacing w:before="140" w:after="60"/>
+        <w:shd w:fill="EDF7F1"/>
+        <w:pBdr>
+          <w:top w:val="single" w:sz="14" w:space="7" w:color="087A63"/>
+          <w:left w:val="single" w:sz="14" w:space="7" w:color="087A63"/>
+          <w:right w:val="single" w:sz="14" w:space="7" w:color="087A63"/>
+        </w:pBdr>
       </w:pPr>
       <w:r>
         <w:rPr>
-          <w:rFonts w:ascii="Calibri" w:hAnsi="Calibri" w:eastAsia="Microsoft YaHei"/>
+          <w:rFonts w:ascii="Microsoft YaHei" w:hAnsi="Microsoft YaHei" w:eastAsia="微软雅黑"/>
           <w:b/>
-          <w:color w:val="0F766E"/>
-          <w:sz w:val="22"/>
+          <w:color w:val="122737"/>
+          <w:sz w:val="38"/>
         </w:rPr>
-        <w:t>公益智助柜</w:t>
+        <w:t>公益智助柜｜App 用户使用手册</w:t>
       </w:r>
     </w:p>
     <w:p>
       <w:pPr>
-        <w:spacing w:before="240" w:after="160"/>
-        <w:jc w:val="center"/>
+        <w:spacing w:before="0" w:after="140"/>
+        <w:shd w:fill="EDF7F1"/>
+        <w:pBdr>
+          <w:left w:val="single" w:sz="14" w:space="7" w:color="087A63"/>
+          <w:bottom w:val="single" w:sz="14" w:space="7" w:color="087A63"/>
+          <w:right w:val="single" w:sz="14" w:space="7" w:color="087A63"/>
+        </w:pBdr>
       </w:pPr>
       <w:r>
         <w:rPr>
-          <w:rFonts w:ascii="Calibri" w:hAnsi="Calibri" w:eastAsia="Microsoft YaHei"/>
-          <w:b/>
-          <w:color w:val="0B2545"/>
-          <w:sz w:val="56"/>
+          <w:rFonts w:ascii="Microsoft YaHei" w:hAnsi="Microsoft YaHei" w:eastAsia="微软雅黑"/>
+          <w:b w:val="0"/>
+          <w:color w:val="586C7C"/>
+          <w:sz w:val="21"/>
         </w:rPr>
-        <w:t>App 用户使用手册</w:t>
+        <w:t>按照下面的步骤，你可以完成首次登记、登录、预约和到柜领取。公益领取不会要求付款。</w:t>
       </w:r>
     </w:p>
     <w:p>
       <w:pPr>
-        <w:spacing w:after="560"/>
+        <w:spacing w:before="80" w:after="200"/>
+      </w:pPr>
+      <w:r>
+        <w:rPr>
+          <w:rFonts w:ascii="Microsoft YaHei" w:hAnsi="Microsoft YaHei" w:eastAsia="微软雅黑"/>
+          <w:b w:val="0"/>
+          <w:color w:val="586C7C"/>
+          <w:sz w:val="17"/>
+        </w:rPr>
+        <w:t>版本日期：2026 年 8 月 7 日　｜　按任务查找，图中编号对应操作顺序</w:t>
+      </w:r>
+    </w:p>
+    <w:p>
+      <w:pPr>
+        <w:pStyle w:val="Heading1"/>
+        <w:keepNext/>
+        <w:spacing w:before="40" w:after="60"/>
+      </w:pPr>
+      <w:bookmarkStart w:id="1" w:name="manual_toc"/>
+      <w:r>
+        <w:rPr>
+          <w:rFonts w:ascii="Microsoft YaHei" w:hAnsi="Microsoft YaHei" w:eastAsia="微软雅黑"/>
+          <w:b/>
+          <w:color w:val="122737"/>
+          <w:sz w:val="30"/>
+        </w:rPr>
+        <w:t>目录</w:t>
+      </w:r>
+      <w:bookmarkEnd w:id="1"/>
+    </w:p>
+    <w:p>
+      <w:pPr>
+        <w:spacing w:before="0" w:after="100"/>
+      </w:pPr>
+      <w:r>
+        <w:rPr>
+          <w:rFonts w:ascii="Microsoft YaHei" w:hAnsi="Microsoft YaHei" w:eastAsia="微软雅黑"/>
+          <w:b w:val="0"/>
+          <w:color w:val="586C7C"/>
+          <w:sz w:val="18"/>
+        </w:rPr>
+        <w:t>点击目录条目可跳转到对应任务。</w:t>
+      </w:r>
+    </w:p>
+    <w:p>
+      <w:pPr>
+        <w:spacing w:before="0" w:after="60"/>
+        <w:ind w:left="198"/>
+      </w:pPr>
+      <w:hyperlink w:anchor="manual_section_01" w:history="1">
+        <w:r>
+          <w:rPr>
+            <w:rFonts w:ascii="Microsoft YaHei" w:hAnsi="Microsoft YaHei" w:eastAsia="微软雅黑"/>
+            <w:b/>
+            <w:color w:val="006C56"/>
+            <w:sz w:val="21"/>
+            <w:u w:val="none"/>
+          </w:rPr>
+          <w:t>1. 首次登记资料</w:t>
+        </w:r>
+      </w:hyperlink>
+    </w:p>
+    <w:p>
+      <w:pPr>
+        <w:spacing w:before="0" w:after="60"/>
+        <w:ind w:left="198"/>
+      </w:pPr>
+      <w:hyperlink w:anchor="manual_section_02" w:history="1">
+        <w:r>
+          <w:rPr>
+            <w:rFonts w:ascii="Microsoft YaHei" w:hAnsi="Microsoft YaHei" w:eastAsia="微软雅黑"/>
+            <w:b/>
+            <w:color w:val="006C56"/>
+            <w:sz w:val="21"/>
+            <w:u w:val="none"/>
+          </w:rPr>
+          <w:t>2. 使用短信验证码登录</w:t>
+        </w:r>
+      </w:hyperlink>
+    </w:p>
+    <w:p>
+      <w:pPr>
+        <w:spacing w:before="0" w:after="60"/>
+        <w:ind w:left="198"/>
+      </w:pPr>
+      <w:hyperlink w:anchor="manual_section_03" w:history="1">
+        <w:r>
+          <w:rPr>
+            <w:rFonts w:ascii="Microsoft YaHei" w:hAnsi="Microsoft YaHei" w:eastAsia="微软雅黑"/>
+            <w:b/>
+            <w:color w:val="006C56"/>
+            <w:sz w:val="21"/>
+            <w:u w:val="none"/>
+          </w:rPr>
+          <w:t>3. 使用一次性人工码备用登录</w:t>
+        </w:r>
+      </w:hyperlink>
+    </w:p>
+    <w:p>
+      <w:pPr>
+        <w:spacing w:before="0" w:after="60"/>
+        <w:ind w:left="198"/>
+      </w:pPr>
+      <w:hyperlink w:anchor="manual_section_04" w:history="1">
+        <w:r>
+          <w:rPr>
+            <w:rFonts w:ascii="Microsoft YaHei" w:hAnsi="Microsoft YaHei" w:eastAsia="微软雅黑"/>
+            <w:b/>
+            <w:color w:val="006C56"/>
+            <w:sz w:val="21"/>
+            <w:u w:val="none"/>
+          </w:rPr>
+          <w:t>4. 查看今天是否可以领取</w:t>
+        </w:r>
+      </w:hyperlink>
+    </w:p>
+    <w:p>
+      <w:pPr>
+        <w:spacing w:before="0" w:after="60"/>
+        <w:ind w:left="198"/>
+      </w:pPr>
+      <w:hyperlink w:anchor="manual_section_05" w:history="1">
+        <w:r>
+          <w:rPr>
+            <w:rFonts w:ascii="Microsoft YaHei" w:hAnsi="Microsoft YaHei" w:eastAsia="微软雅黑"/>
+            <w:b/>
+            <w:color w:val="006C56"/>
+            <w:sz w:val="21"/>
+            <w:u w:val="none"/>
+          </w:rPr>
+          <w:t>5. 找到可用柜机</w:t>
+        </w:r>
+      </w:hyperlink>
+    </w:p>
+    <w:p>
+      <w:pPr>
+        <w:spacing w:before="0" w:after="60"/>
+        <w:ind w:left="198"/>
+      </w:pPr>
+      <w:hyperlink w:anchor="manual_section_06" w:history="1">
+        <w:r>
+          <w:rPr>
+            <w:rFonts w:ascii="Microsoft YaHei" w:hAnsi="Microsoft YaHei" w:eastAsia="微软雅黑"/>
+            <w:b/>
+            <w:color w:val="006C56"/>
+            <w:sz w:val="21"/>
+            <w:u w:val="none"/>
+          </w:rPr>
+          <w:t>6. 选择物资</w:t>
+        </w:r>
+      </w:hyperlink>
+    </w:p>
+    <w:p>
+      <w:pPr>
+        <w:spacing w:before="0" w:after="60"/>
+        <w:ind w:left="198"/>
+      </w:pPr>
+      <w:hyperlink w:anchor="manual_section_07" w:history="1">
+        <w:r>
+          <w:rPr>
+            <w:rFonts w:ascii="Microsoft YaHei" w:hAnsi="Microsoft YaHei" w:eastAsia="微软雅黑"/>
+            <w:b/>
+            <w:color w:val="006C56"/>
+            <w:sz w:val="21"/>
+            <w:u w:val="none"/>
+          </w:rPr>
+          <w:t>7. 提交预约</w:t>
+        </w:r>
+      </w:hyperlink>
+    </w:p>
+    <w:p>
+      <w:pPr>
+        <w:spacing w:before="0" w:after="60"/>
+        <w:ind w:left="198"/>
+      </w:pPr>
+      <w:hyperlink w:anchor="manual_section_08" w:history="1">
+        <w:r>
+          <w:rPr>
+            <w:rFonts w:ascii="Microsoft YaHei" w:hAnsi="Microsoft YaHei" w:eastAsia="微软雅黑"/>
+            <w:b/>
+            <w:color w:val="006C56"/>
+            <w:sz w:val="21"/>
+            <w:u w:val="none"/>
+          </w:rPr>
+          <w:t>8. 打开当前预约</w:t>
+        </w:r>
+      </w:hyperlink>
+    </w:p>
+    <w:p>
+      <w:pPr>
+        <w:spacing w:before="0" w:after="60"/>
+        <w:ind w:left="198"/>
+      </w:pPr>
+      <w:hyperlink w:anchor="manual_section_09" w:history="1">
+        <w:r>
+          <w:rPr>
+            <w:rFonts w:ascii="Microsoft YaHei" w:hAnsi="Microsoft YaHei" w:eastAsia="微软雅黑"/>
+            <w:b/>
+            <w:color w:val="006C56"/>
+            <w:sz w:val="21"/>
+            <w:u w:val="none"/>
+          </w:rPr>
+          <w:t>9. 开柜前最后核对</w:t>
+        </w:r>
+      </w:hyperlink>
+    </w:p>
+    <w:p>
+      <w:pPr>
+        <w:spacing w:before="0" w:after="60"/>
+        <w:ind w:left="198"/>
+      </w:pPr>
+      <w:hyperlink w:anchor="manual_section_10" w:history="1">
+        <w:r>
+          <w:rPr>
+            <w:rFonts w:ascii="Microsoft YaHei" w:hAnsi="Microsoft YaHei" w:eastAsia="微软雅黑"/>
+            <w:b/>
+            <w:color w:val="006C56"/>
+            <w:sz w:val="21"/>
+            <w:u w:val="none"/>
+          </w:rPr>
+          <w:t>10. 关门并查看领取结果</w:t>
+        </w:r>
+      </w:hyperlink>
+    </w:p>
+    <w:p>
+      <w:pPr>
+        <w:spacing w:before="0" w:after="60"/>
+        <w:ind w:left="198"/>
+      </w:pPr>
+      <w:hyperlink w:anchor="manual_section_11" w:history="1">
+        <w:r>
+          <w:rPr>
+            <w:rFonts w:ascii="Microsoft YaHei" w:hAnsi="Microsoft YaHei" w:eastAsia="微软雅黑"/>
+            <w:b/>
+            <w:color w:val="006C56"/>
+            <w:sz w:val="21"/>
+            <w:u w:val="none"/>
+          </w:rPr>
+          <w:t>遇到问题</w:t>
+        </w:r>
+      </w:hyperlink>
+    </w:p>
+    <w:p>
+      <w:r>
+        <w:br w:type="page"/>
+      </w:r>
+    </w:p>
+    <w:p>
+      <w:pPr>
+        <w:pStyle w:val="Heading1"/>
+        <w:keepNext/>
+        <w:spacing w:before="200" w:after="100"/>
+      </w:pPr>
+      <w:bookmarkStart w:id="2" w:name="manual_section_01"/>
+      <w:r>
+        <w:rPr>
+          <w:rFonts w:ascii="Microsoft YaHei" w:hAnsi="Microsoft YaHei" w:eastAsia="微软雅黑"/>
+          <w:b/>
+          <w:color w:val="122737"/>
+          <w:sz w:val="30"/>
+        </w:rPr>
+        <w:t>1. 首次登记资料</w:t>
+      </w:r>
+      <w:bookmarkEnd w:id="2"/>
+    </w:p>
+    <w:p>
+      <w:pPr>
+        <w:spacing w:before="80" w:after="80"/>
+        <w:shd w:fill="EEF5F8"/>
+        <w:pBdr>
+          <w:top w:val="single" w:sz="7" w:space="7" w:color="087A63"/>
+          <w:left w:val="single" w:sz="7" w:space="7" w:color="087A63"/>
+          <w:bottom w:val="single" w:sz="7" w:space="7" w:color="087A63"/>
+          <w:right w:val="single" w:sz="7" w:space="7" w:color="087A63"/>
+        </w:pBdr>
+      </w:pPr>
+      <w:r>
+        <w:rPr>
+          <w:rFonts w:ascii="Microsoft YaHei" w:hAnsi="Microsoft YaHei" w:eastAsia="微软雅黑"/>
+          <w:b/>
+          <w:color w:val="006C56"/>
+          <w:sz w:val="20"/>
+        </w:rPr>
+        <w:t xml:space="preserve">用途　</w:t>
+      </w:r>
+      <w:r>
+        <w:rPr>
+          <w:rFonts w:ascii="Microsoft YaHei" w:hAnsi="Microsoft YaHei" w:eastAsia="微软雅黑"/>
+          <w:b w:val="0"/>
+          <w:color w:val="122737"/>
+          <w:sz w:val="20"/>
+        </w:rPr>
+        <w:t>手机号尚未登记时，提交姓名、身份和所在区域，等待工作人员审核。</w:t>
+      </w:r>
+    </w:p>
+    <w:p>
+      <w:pPr>
+        <w:keepNext/>
+        <w:spacing w:before="120" w:after="60"/>
+      </w:pPr>
+      <w:r>
+        <w:rPr>
+          <w:rFonts w:ascii="Microsoft YaHei" w:hAnsi="Microsoft YaHei" w:eastAsia="微软雅黑"/>
+          <w:b/>
+          <w:color w:val="006C56"/>
+          <w:sz w:val="21"/>
+        </w:rPr>
+        <w:t>操作步骤</w:t>
+      </w:r>
+    </w:p>
+    <w:p>
+      <w:pPr>
+        <w:numPr>
+          <w:ilvl w:val="0"/>
+          <w:numId w:val="10"/>
+        </w:numPr>
+      </w:pPr>
+      <w:r>
+        <w:rPr>
+          <w:rFonts w:ascii="Microsoft YaHei" w:hAnsi="Microsoft YaHei" w:eastAsia="微软雅黑"/>
+          <w:b w:val="0"/>
+          <w:color w:val="122737"/>
+          <w:sz w:val="21"/>
+        </w:rPr>
+        <w:t>在登录页选择“首次使用 / 去登记”。</w:t>
+      </w:r>
+    </w:p>
+    <w:p>
+      <w:pPr>
+        <w:numPr>
+          <w:ilvl w:val="0"/>
+          <w:numId w:val="10"/>
+        </w:numPr>
+      </w:pPr>
+      <w:r>
+        <w:rPr>
+          <w:rFonts w:ascii="Microsoft YaHei" w:hAnsi="Microsoft YaHei" w:eastAsia="微软雅黑"/>
+          <w:b w:val="0"/>
+          <w:color w:val="122737"/>
+          <w:sz w:val="21"/>
+        </w:rPr>
+        <w:t>输入本人手机号，获取并填写短信验证码。</w:t>
+      </w:r>
+    </w:p>
+    <w:p>
+      <w:pPr>
+        <w:numPr>
+          <w:ilvl w:val="0"/>
+          <w:numId w:val="10"/>
+        </w:numPr>
+      </w:pPr>
+      <w:r>
+        <w:rPr>
+          <w:rFonts w:ascii="Microsoft YaHei" w:hAnsi="Microsoft YaHei" w:eastAsia="微软雅黑"/>
+          <w:b w:val="0"/>
+          <w:color w:val="122737"/>
+          <w:sz w:val="21"/>
+        </w:rPr>
+        <w:t>选择“我是用户”和实际所在区域。</w:t>
+      </w:r>
+    </w:p>
+    <w:p>
+      <w:pPr>
+        <w:numPr>
+          <w:ilvl w:val="0"/>
+          <w:numId w:val="10"/>
+        </w:numPr>
+      </w:pPr>
+      <w:r>
+        <w:rPr>
+          <w:rFonts w:ascii="Microsoft YaHei" w:hAnsi="Microsoft YaHei" w:eastAsia="微软雅黑"/>
+          <w:b w:val="0"/>
+          <w:color w:val="122737"/>
+          <w:sz w:val="21"/>
+        </w:rPr>
+        <w:t>填写姓名；需要说明的情况可写在备注中。</w:t>
+      </w:r>
+    </w:p>
+    <w:p>
+      <w:pPr>
+        <w:numPr>
+          <w:ilvl w:val="0"/>
+          <w:numId w:val="10"/>
+        </w:numPr>
+      </w:pPr>
+      <w:r>
+        <w:rPr>
+          <w:rFonts w:ascii="Microsoft YaHei" w:hAnsi="Microsoft YaHei" w:eastAsia="微软雅黑"/>
+          <w:b w:val="0"/>
+          <w:color w:val="122737"/>
+          <w:sz w:val="21"/>
+        </w:rPr>
+        <w:t>选择“提交注册资料”。</w:t>
+      </w:r>
+    </w:p>
+    <w:p>
+      <w:pPr>
+        <w:spacing w:before="80" w:after="40"/>
         <w:jc w:val="center"/>
       </w:pPr>
       <w:r>
-        <w:rPr>
-          <w:rFonts w:ascii="Calibri" w:hAnsi="Calibri" w:eastAsia="Microsoft YaHei"/>
-          <w:color w:val="1F4D78"/>
-          <w:sz w:val="27"/>
-        </w:rPr>
-        <w:t>使用本人手机号和一次性验证码登录，预约物资并在有效期内到柜领取。</w:t>
+        <w:drawing>
+          <wp:inline xmlns:a="http://schemas.openxmlformats.org/drawingml/2006/main" xmlns:pic="http://schemas.openxmlformats.org/drawingml/2006/picture">
+            <wp:extent cx="2603502" cy="4536000"/>
+            <wp:docPr id="1" name="Picture 1" descr="图 1　首次登记资料与提交按钮" title="图 1　首次登记资料与提交按钮"/>
+            <wp:cNvGraphicFramePr>
+              <a:graphicFrameLocks noChangeAspect="1"/>
+            </wp:cNvGraphicFramePr>
+            <a:graphic>
+              <a:graphicData uri="http://schemas.openxmlformats.org/drawingml/2006/picture">
+                <pic:pic>
+                  <pic:nvPicPr>
+                    <pic:cNvPr id="0" name="registration.png"/>
+                    <pic:cNvPicPr/>
+                  </pic:nvPicPr>
+                  <pic:blipFill>
+                    <a:blip r:embed="rId11"/>
+                    <a:stretch>
+                      <a:fillRect/>
+                    </a:stretch>
+                  </pic:blipFill>
+                  <pic:spPr>
+                    <a:xfrm>
+                      <a:off x="0" y="0"/>
+                      <a:ext cx="2603502" cy="4536000"/>
+                    </a:xfrm>
+                    <a:prstGeom prst="rect"/>
+                  </pic:spPr>
+                </pic:pic>
+              </a:graphicData>
+            </a:graphic>
+          </wp:inline>
+        </w:drawing>
       </w:r>
     </w:p>
-    <w:tbl>
-      <w:tblPr>
-        <w:tblW w:type="dxa" w:w="9360"/>
-        <w:jc w:val="left"/>
-        <w:tblLayout w:type="fixed"/>
-        <w:tblLook w:firstColumn="1" w:firstRow="1" w:lastColumn="0" w:lastRow="0" w:noHBand="0" w:noVBand="1" w:val="04A0"/>
-        <w:tblInd w:w="120" w:type="dxa"/>
-        <w:tblBorders>
-          <w:top w:val="single" w:sz="4" w:space="0" w:color="B8D7C8"/>
-          <w:left w:val="single" w:sz="4" w:space="0" w:color="B8D7C8"/>
-          <w:bottom w:val="single" w:sz="4" w:space="0" w:color="B8D7C8"/>
-          <w:right w:val="single" w:sz="4" w:space="0" w:color="B8D7C8"/>
-          <w:insideH w:val="single" w:sz="4" w:space="0" w:color="B8D7C8"/>
-          <w:insideV w:val="single" w:sz="4" w:space="0" w:color="B8D7C8"/>
-        </w:tblBorders>
-      </w:tblPr>
-      <w:tblGrid>
-        <w:gridCol w:w="9360"/>
-      </w:tblGrid>
-      <w:tr>
-        <w:tc>
-          <w:tcPr>
-            <w:tcW w:type="dxa" w:w="9360"/>
-            <w:tcMar>
-              <w:top w:w="80" w:type="dxa"/>
-              <w:bottom w:w="80" w:type="dxa"/>
-              <w:start w:w="120" w:type="dxa"/>
-              <w:end w:w="120" w:type="dxa"/>
-            </w:tcMar>
-            <w:vAlign w:val="top"/>
-            <w:shd w:fill="E8EEF5"/>
-          </w:tcPr>
-          <w:p>
-            <w:pPr>
-              <w:spacing w:before="40" w:after="40" w:line="300" w:lineRule="auto"/>
-            </w:pPr>
-            <w:r>
-              <w:t>这本手册是为领取物资的 App 用户准备的。手机号和一次性验证码请由本人保管和使用。</w:t>
-            </w:r>
-          </w:p>
-        </w:tc>
-      </w:tr>
-    </w:tbl>
     <w:p>
       <w:pPr>
-        <w:spacing w:after="0"/>
-      </w:pPr>
-    </w:p>
-    <w:p/>
-    <w:p/>
-    <w:p/>
-    <w:p>
-      <w:pPr>
+        <w:pStyle w:val="FigureCaption"/>
         <w:jc w:val="center"/>
       </w:pPr>
       <w:r>
+        <w:t>图 1　首次登记资料与提交按钮</w:t>
+      </w:r>
+    </w:p>
+    <w:p>
+      <w:pPr>
+        <w:spacing w:before="80" w:after="80"/>
+        <w:shd w:fill="EDF7F1"/>
+        <w:pBdr>
+          <w:top w:val="single" w:sz="7" w:space="7" w:color="087A63"/>
+          <w:left w:val="single" w:sz="7" w:space="7" w:color="087A63"/>
+          <w:bottom w:val="single" w:sz="7" w:space="7" w:color="087A63"/>
+          <w:right w:val="single" w:sz="7" w:space="7" w:color="087A63"/>
+        </w:pBdr>
+      </w:pPr>
+      <w:r>
         <w:rPr>
-          <w:rFonts w:ascii="Calibri" w:hAnsi="Calibri" w:eastAsia="Microsoft YaHei"/>
-          <w:color w:val="5B6C7E"/>
+          <w:rFonts w:ascii="Microsoft YaHei" w:hAnsi="Microsoft YaHei" w:eastAsia="微软雅黑"/>
+          <w:b/>
+          <w:color w:val="006C56"/>
           <w:sz w:val="20"/>
         </w:rPr>
-        <w:t>版本日期：2026 年 8 月 5 日</w:t>
+        <w:t xml:space="preserve">完成标志　</w:t>
+      </w:r>
+      <w:r>
+        <w:rPr>
+          <w:rFonts w:ascii="Microsoft YaHei" w:hAnsi="Microsoft YaHei" w:eastAsia="微软雅黑"/>
+          <w:b w:val="0"/>
+          <w:color w:val="122737"/>
+          <w:sz w:val="20"/>
+        </w:rPr>
+        <w:t>页面提示申请已提交；审核通过后可返回登录页使用本人手机号登录。</w:t>
       </w:r>
     </w:p>
     <w:p>
@@ -118,79 +524,2057 @@
         <w:br w:type="page"/>
       </w:r>
     </w:p>
+    <w:p>
+      <w:pPr>
+        <w:pStyle w:val="Heading1"/>
+        <w:keepNext/>
+        <w:spacing w:before="200" w:after="100"/>
+      </w:pPr>
+      <w:bookmarkStart w:id="3" w:name="manual_section_02"/>
+      <w:r>
+        <w:rPr>
+          <w:rFonts w:ascii="Microsoft YaHei" w:hAnsi="Microsoft YaHei" w:eastAsia="微软雅黑"/>
+          <w:b/>
+          <w:color w:val="122737"/>
+          <w:sz w:val="30"/>
+        </w:rPr>
+        <w:t>2. 使用短信验证码登录</w:t>
+      </w:r>
+      <w:bookmarkEnd w:id="3"/>
+    </w:p>
+    <w:p>
+      <w:pPr>
+        <w:spacing w:before="80" w:after="80"/>
+        <w:shd w:fill="EEF5F8"/>
+        <w:pBdr>
+          <w:top w:val="single" w:sz="7" w:space="7" w:color="087A63"/>
+          <w:left w:val="single" w:sz="7" w:space="7" w:color="087A63"/>
+          <w:bottom w:val="single" w:sz="7" w:space="7" w:color="087A63"/>
+          <w:right w:val="single" w:sz="7" w:space="7" w:color="087A63"/>
+        </w:pBdr>
+      </w:pPr>
+      <w:r>
+        <w:rPr>
+          <w:rFonts w:ascii="Microsoft YaHei" w:hAnsi="Microsoft YaHei" w:eastAsia="微软雅黑"/>
+          <w:b/>
+          <w:color w:val="006C56"/>
+          <w:sz w:val="20"/>
+        </w:rPr>
+        <w:t xml:space="preserve">用途　</w:t>
+      </w:r>
+      <w:r>
+        <w:rPr>
+          <w:rFonts w:ascii="Microsoft YaHei" w:hAnsi="Microsoft YaHei" w:eastAsia="微软雅黑"/>
+          <w:b w:val="0"/>
+          <w:color w:val="122737"/>
+          <w:sz w:val="20"/>
+        </w:rPr>
+        <w:t>使用本人手机号完成日常登录和身份识别。</w:t>
+      </w:r>
+    </w:p>
+    <w:p>
+      <w:pPr>
+        <w:keepNext/>
+        <w:spacing w:before="120" w:after="60"/>
+      </w:pPr>
+      <w:r>
+        <w:rPr>
+          <w:rFonts w:ascii="Microsoft YaHei" w:hAnsi="Microsoft YaHei" w:eastAsia="微软雅黑"/>
+          <w:b/>
+          <w:color w:val="006C56"/>
+          <w:sz w:val="21"/>
+        </w:rPr>
+        <w:t>操作步骤</w:t>
+      </w:r>
+    </w:p>
+    <w:p>
+      <w:pPr>
+        <w:numPr>
+          <w:ilvl w:val="0"/>
+          <w:numId w:val="11"/>
+        </w:numPr>
+      </w:pPr>
+      <w:r>
+        <w:rPr>
+          <w:rFonts w:ascii="Microsoft YaHei" w:hAnsi="Microsoft YaHei" w:eastAsia="微软雅黑"/>
+          <w:b w:val="0"/>
+          <w:color w:val="122737"/>
+          <w:sz w:val="21"/>
+        </w:rPr>
+        <w:t>打开公益智助柜移动端。</w:t>
+      </w:r>
+    </w:p>
+    <w:p>
+      <w:pPr>
+        <w:numPr>
+          <w:ilvl w:val="0"/>
+          <w:numId w:val="11"/>
+        </w:numPr>
+      </w:pPr>
+      <w:r>
+        <w:rPr>
+          <w:rFonts w:ascii="Microsoft YaHei" w:hAnsi="Microsoft YaHei" w:eastAsia="微软雅黑"/>
+          <w:b w:val="0"/>
+          <w:color w:val="122737"/>
+          <w:sz w:val="21"/>
+        </w:rPr>
+        <w:t>输入本人手机号，并勾选用户免责声明。</w:t>
+      </w:r>
+    </w:p>
+    <w:p>
+      <w:pPr>
+        <w:numPr>
+          <w:ilvl w:val="0"/>
+          <w:numId w:val="11"/>
+        </w:numPr>
+      </w:pPr>
+      <w:r>
+        <w:rPr>
+          <w:rFonts w:ascii="Microsoft YaHei" w:hAnsi="Microsoft YaHei" w:eastAsia="微软雅黑"/>
+          <w:b w:val="0"/>
+          <w:color w:val="122737"/>
+          <w:sz w:val="21"/>
+        </w:rPr>
+        <w:t>选择“获取验证码”，填写收到的短信验证码。</w:t>
+      </w:r>
+    </w:p>
+    <w:p>
+      <w:pPr>
+        <w:numPr>
+          <w:ilvl w:val="0"/>
+          <w:numId w:val="11"/>
+        </w:numPr>
+      </w:pPr>
+      <w:r>
+        <w:rPr>
+          <w:rFonts w:ascii="Microsoft YaHei" w:hAnsi="Microsoft YaHei" w:eastAsia="微软雅黑"/>
+          <w:b w:val="0"/>
+          <w:color w:val="122737"/>
+          <w:sz w:val="21"/>
+        </w:rPr>
+        <w:t>选择“登录 / 身份识别”。</w:t>
+      </w:r>
+    </w:p>
+    <w:p>
+      <w:pPr>
+        <w:spacing w:before="80" w:after="40"/>
+        <w:jc w:val="center"/>
+      </w:pPr>
+      <w:r>
+        <w:drawing>
+          <wp:inline xmlns:a="http://schemas.openxmlformats.org/drawingml/2006/main" xmlns:pic="http://schemas.openxmlformats.org/drawingml/2006/picture">
+            <wp:extent cx="2096018" cy="4536000"/>
+            <wp:docPr id="2" name="Picture 2" descr="图 2　短信验证码登录" title="图 2　短信验证码登录"/>
+            <wp:cNvGraphicFramePr>
+              <a:graphicFrameLocks noChangeAspect="1"/>
+            </wp:cNvGraphicFramePr>
+            <a:graphic>
+              <a:graphicData uri="http://schemas.openxmlformats.org/drawingml/2006/picture">
+                <pic:pic>
+                  <pic:nvPicPr>
+                    <pic:cNvPr id="0" name="sms-login.png"/>
+                    <pic:cNvPicPr/>
+                  </pic:nvPicPr>
+                  <pic:blipFill>
+                    <a:blip r:embed="rId12"/>
+                    <a:stretch>
+                      <a:fillRect/>
+                    </a:stretch>
+                  </pic:blipFill>
+                  <pic:spPr>
+                    <a:xfrm>
+                      <a:off x="0" y="0"/>
+                      <a:ext cx="2096018" cy="4536000"/>
+                    </a:xfrm>
+                    <a:prstGeom prst="rect"/>
+                  </pic:spPr>
+                </pic:pic>
+              </a:graphicData>
+            </a:graphic>
+          </wp:inline>
+        </w:drawing>
+      </w:r>
+    </w:p>
+    <w:p>
+      <w:pPr>
+        <w:pStyle w:val="FigureCaption"/>
+        <w:jc w:val="center"/>
+      </w:pPr>
+      <w:r>
+        <w:t>图 2　短信验证码登录</w:t>
+      </w:r>
+    </w:p>
+    <w:p>
+      <w:pPr>
+        <w:spacing w:before="80" w:after="80"/>
+        <w:shd w:fill="EDF7F1"/>
+        <w:pBdr>
+          <w:top w:val="single" w:sz="7" w:space="7" w:color="087A63"/>
+          <w:left w:val="single" w:sz="7" w:space="7" w:color="087A63"/>
+          <w:bottom w:val="single" w:sz="7" w:space="7" w:color="087A63"/>
+          <w:right w:val="single" w:sz="7" w:space="7" w:color="087A63"/>
+        </w:pBdr>
+      </w:pPr>
+      <w:r>
+        <w:rPr>
+          <w:rFonts w:ascii="Microsoft YaHei" w:hAnsi="Microsoft YaHei" w:eastAsia="微软雅黑"/>
+          <w:b/>
+          <w:color w:val="006C56"/>
+          <w:sz w:val="20"/>
+        </w:rPr>
+        <w:t xml:space="preserve">完成标志　</w:t>
+      </w:r>
+      <w:r>
+        <w:rPr>
+          <w:rFonts w:ascii="Microsoft YaHei" w:hAnsi="Microsoft YaHei" w:eastAsia="微软雅黑"/>
+          <w:b w:val="0"/>
+          <w:color w:val="122737"/>
+          <w:sz w:val="20"/>
+        </w:rPr>
+        <w:t>页面进入首页并显示本人姓名和今日资格。登录状态有效时，下次打开可直接进入首页。</w:t>
+      </w:r>
+    </w:p>
+    <w:p>
+      <w:r>
+        <w:br w:type="page"/>
+      </w:r>
+    </w:p>
+    <w:p>
+      <w:pPr>
+        <w:pStyle w:val="Heading1"/>
+        <w:keepNext/>
+        <w:spacing w:before="200" w:after="100"/>
+      </w:pPr>
+      <w:bookmarkStart w:id="4" w:name="manual_section_03"/>
+      <w:r>
+        <w:rPr>
+          <w:rFonts w:ascii="Microsoft YaHei" w:hAnsi="Microsoft YaHei" w:eastAsia="微软雅黑"/>
+          <w:b/>
+          <w:color w:val="122737"/>
+          <w:sz w:val="30"/>
+        </w:rPr>
+        <w:t>3. 使用一次性人工码备用登录</w:t>
+      </w:r>
+      <w:bookmarkEnd w:id="4"/>
+    </w:p>
+    <w:p>
+      <w:pPr>
+        <w:spacing w:before="80" w:after="80"/>
+        <w:shd w:fill="EEF5F8"/>
+        <w:pBdr>
+          <w:top w:val="single" w:sz="7" w:space="7" w:color="087A63"/>
+          <w:left w:val="single" w:sz="7" w:space="7" w:color="087A63"/>
+          <w:bottom w:val="single" w:sz="7" w:space="7" w:color="087A63"/>
+          <w:right w:val="single" w:sz="7" w:space="7" w:color="087A63"/>
+        </w:pBdr>
+      </w:pPr>
+      <w:r>
+        <w:rPr>
+          <w:rFonts w:ascii="Microsoft YaHei" w:hAnsi="Microsoft YaHei" w:eastAsia="微软雅黑"/>
+          <w:b/>
+          <w:color w:val="006C56"/>
+          <w:sz w:val="20"/>
+        </w:rPr>
+        <w:t xml:space="preserve">用途　</w:t>
+      </w:r>
+      <w:r>
+        <w:rPr>
+          <w:rFonts w:ascii="Microsoft YaHei" w:hAnsi="Microsoft YaHei" w:eastAsia="微软雅黑"/>
+          <w:b w:val="0"/>
+          <w:color w:val="122737"/>
+          <w:sz w:val="20"/>
+        </w:rPr>
+        <w:t>短信暂时无法接收时，使用工作人员单独交付的一次性验证码登录。</w:t>
+      </w:r>
+    </w:p>
+    <w:p>
+      <w:pPr>
+        <w:keepNext/>
+        <w:spacing w:before="120" w:after="60"/>
+      </w:pPr>
+      <w:r>
+        <w:rPr>
+          <w:rFonts w:ascii="Microsoft YaHei" w:hAnsi="Microsoft YaHei" w:eastAsia="微软雅黑"/>
+          <w:b/>
+          <w:color w:val="006C56"/>
+          <w:sz w:val="21"/>
+        </w:rPr>
+        <w:t>操作步骤</w:t>
+      </w:r>
+    </w:p>
+    <w:p>
+      <w:pPr>
+        <w:numPr>
+          <w:ilvl w:val="0"/>
+          <w:numId w:val="12"/>
+        </w:numPr>
+      </w:pPr>
+      <w:r>
+        <w:rPr>
+          <w:rFonts w:ascii="Microsoft YaHei" w:hAnsi="Microsoft YaHei" w:eastAsia="微软雅黑"/>
+          <w:b w:val="0"/>
+          <w:color w:val="122737"/>
+          <w:sz w:val="21"/>
+        </w:rPr>
+        <w:t>在登录页输入本人手机号。</w:t>
+      </w:r>
+    </w:p>
+    <w:p>
+      <w:pPr>
+        <w:numPr>
+          <w:ilvl w:val="0"/>
+          <w:numId w:val="12"/>
+        </w:numPr>
+      </w:pPr>
+      <w:r>
+        <w:rPr>
+          <w:rFonts w:ascii="Microsoft YaHei" w:hAnsi="Microsoft YaHei" w:eastAsia="微软雅黑"/>
+          <w:b w:val="0"/>
+          <w:color w:val="122737"/>
+          <w:sz w:val="21"/>
+        </w:rPr>
+        <w:t>填写收到的 6 位一次性人工码。</w:t>
+      </w:r>
+    </w:p>
+    <w:p>
+      <w:pPr>
+        <w:numPr>
+          <w:ilvl w:val="0"/>
+          <w:numId w:val="12"/>
+        </w:numPr>
+      </w:pPr>
+      <w:r>
+        <w:rPr>
+          <w:rFonts w:ascii="Microsoft YaHei" w:hAnsi="Microsoft YaHei" w:eastAsia="微软雅黑"/>
+          <w:b w:val="0"/>
+          <w:color w:val="122737"/>
+          <w:sz w:val="21"/>
+        </w:rPr>
+        <w:t>勾选用户免责声明。</w:t>
+      </w:r>
+    </w:p>
+    <w:p>
+      <w:pPr>
+        <w:numPr>
+          <w:ilvl w:val="0"/>
+          <w:numId w:val="12"/>
+        </w:numPr>
+      </w:pPr>
+      <w:r>
+        <w:rPr>
+          <w:rFonts w:ascii="Microsoft YaHei" w:hAnsi="Microsoft YaHei" w:eastAsia="微软雅黑"/>
+          <w:b w:val="0"/>
+          <w:color w:val="122737"/>
+          <w:sz w:val="21"/>
+        </w:rPr>
+        <w:t>选择“登录 / 身份识别”。</w:t>
+      </w:r>
+    </w:p>
+    <w:p>
+      <w:pPr>
+        <w:spacing w:before="80" w:after="40"/>
+        <w:jc w:val="center"/>
+      </w:pPr>
+      <w:r>
+        <w:drawing>
+          <wp:inline xmlns:a="http://schemas.openxmlformats.org/drawingml/2006/main" xmlns:pic="http://schemas.openxmlformats.org/drawingml/2006/picture">
+            <wp:extent cx="2096018" cy="4536000"/>
+            <wp:docPr id="3" name="Picture 3" descr="图 3　一次性人工码备用登录" title="图 3　一次性人工码备用登录"/>
+            <wp:cNvGraphicFramePr>
+              <a:graphicFrameLocks noChangeAspect="1"/>
+            </wp:cNvGraphicFramePr>
+            <a:graphic>
+              <a:graphicData uri="http://schemas.openxmlformats.org/drawingml/2006/picture">
+                <pic:pic>
+                  <pic:nvPicPr>
+                    <pic:cNvPr id="0" name="manual-login.png"/>
+                    <pic:cNvPicPr/>
+                  </pic:nvPicPr>
+                  <pic:blipFill>
+                    <a:blip r:embed="rId13"/>
+                    <a:stretch>
+                      <a:fillRect/>
+                    </a:stretch>
+                  </pic:blipFill>
+                  <pic:spPr>
+                    <a:xfrm>
+                      <a:off x="0" y="0"/>
+                      <a:ext cx="2096018" cy="4536000"/>
+                    </a:xfrm>
+                    <a:prstGeom prst="rect"/>
+                  </pic:spPr>
+                </pic:pic>
+              </a:graphicData>
+            </a:graphic>
+          </wp:inline>
+        </w:drawing>
+      </w:r>
+    </w:p>
+    <w:p>
+      <w:pPr>
+        <w:pStyle w:val="FigureCaption"/>
+        <w:jc w:val="center"/>
+      </w:pPr>
+      <w:r>
+        <w:t>图 3　一次性人工码备用登录</w:t>
+      </w:r>
+    </w:p>
+    <w:p>
+      <w:pPr>
+        <w:spacing w:before="80" w:after="80"/>
+        <w:shd w:fill="EDF7F1"/>
+        <w:pBdr>
+          <w:top w:val="single" w:sz="7" w:space="7" w:color="087A63"/>
+          <w:left w:val="single" w:sz="7" w:space="7" w:color="087A63"/>
+          <w:bottom w:val="single" w:sz="7" w:space="7" w:color="087A63"/>
+          <w:right w:val="single" w:sz="7" w:space="7" w:color="087A63"/>
+        </w:pBdr>
+      </w:pPr>
+      <w:r>
+        <w:rPr>
+          <w:rFonts w:ascii="Microsoft YaHei" w:hAnsi="Microsoft YaHei" w:eastAsia="微软雅黑"/>
+          <w:b/>
+          <w:color w:val="006C56"/>
+          <w:sz w:val="20"/>
+        </w:rPr>
+        <w:t xml:space="preserve">完成标志　</w:t>
+      </w:r>
+      <w:r>
+        <w:rPr>
+          <w:rFonts w:ascii="Microsoft YaHei" w:hAnsi="Microsoft YaHei" w:eastAsia="微软雅黑"/>
+          <w:b w:val="0"/>
+          <w:color w:val="122737"/>
+          <w:sz w:val="20"/>
+        </w:rPr>
+        <w:t>成功进入首页；人工码随即失效，不能再次使用。</w:t>
+      </w:r>
+    </w:p>
+    <w:p>
+      <w:r>
+        <w:br w:type="page"/>
+      </w:r>
+    </w:p>
+    <w:p>
+      <w:pPr>
+        <w:pStyle w:val="Heading1"/>
+        <w:keepNext/>
+        <w:spacing w:before="200" w:after="100"/>
+      </w:pPr>
+      <w:bookmarkStart w:id="5" w:name="manual_section_04"/>
+      <w:r>
+        <w:rPr>
+          <w:rFonts w:ascii="Microsoft YaHei" w:hAnsi="Microsoft YaHei" w:eastAsia="微软雅黑"/>
+          <w:b/>
+          <w:color w:val="122737"/>
+          <w:sz w:val="30"/>
+        </w:rPr>
+        <w:t>4. 查看今天是否可以领取</w:t>
+      </w:r>
+      <w:bookmarkEnd w:id="5"/>
+    </w:p>
+    <w:p>
+      <w:pPr>
+        <w:spacing w:before="80" w:after="80"/>
+        <w:shd w:fill="EEF5F8"/>
+        <w:pBdr>
+          <w:top w:val="single" w:sz="7" w:space="7" w:color="087A63"/>
+          <w:left w:val="single" w:sz="7" w:space="7" w:color="087A63"/>
+          <w:bottom w:val="single" w:sz="7" w:space="7" w:color="087A63"/>
+          <w:right w:val="single" w:sz="7" w:space="7" w:color="087A63"/>
+        </w:pBdr>
+      </w:pPr>
+      <w:r>
+        <w:rPr>
+          <w:rFonts w:ascii="Microsoft YaHei" w:hAnsi="Microsoft YaHei" w:eastAsia="微软雅黑"/>
+          <w:b/>
+          <w:color w:val="006C56"/>
+          <w:sz w:val="20"/>
+        </w:rPr>
+        <w:t xml:space="preserve">用途　</w:t>
+      </w:r>
+      <w:r>
+        <w:rPr>
+          <w:rFonts w:ascii="Microsoft YaHei" w:hAnsi="Microsoft YaHei" w:eastAsia="微软雅黑"/>
+          <w:b w:val="0"/>
+          <w:color w:val="122737"/>
+          <w:sz w:val="20"/>
+        </w:rPr>
+        <w:t>在选择柜机前确认今日时段、剩余次数和可领取物资。</w:t>
+      </w:r>
+    </w:p>
+    <w:p>
+      <w:pPr>
+        <w:keepNext/>
+        <w:spacing w:before="120" w:after="60"/>
+      </w:pPr>
+      <w:r>
+        <w:rPr>
+          <w:rFonts w:ascii="Microsoft YaHei" w:hAnsi="Microsoft YaHei" w:eastAsia="微软雅黑"/>
+          <w:b/>
+          <w:color w:val="006C56"/>
+          <w:sz w:val="21"/>
+        </w:rPr>
+        <w:t>操作步骤</w:t>
+      </w:r>
+    </w:p>
+    <w:p>
+      <w:pPr>
+        <w:numPr>
+          <w:ilvl w:val="0"/>
+          <w:numId w:val="13"/>
+        </w:numPr>
+      </w:pPr>
+      <w:r>
+        <w:rPr>
+          <w:rFonts w:ascii="Microsoft YaHei" w:hAnsi="Microsoft YaHei" w:eastAsia="微软雅黑"/>
+          <w:b w:val="0"/>
+          <w:color w:val="122737"/>
+          <w:sz w:val="21"/>
+        </w:rPr>
+        <w:t>在首页查看“今日状态”。</w:t>
+      </w:r>
+    </w:p>
+    <w:p>
+      <w:pPr>
+        <w:numPr>
+          <w:ilvl w:val="0"/>
+          <w:numId w:val="13"/>
+        </w:numPr>
+      </w:pPr>
+      <w:r>
+        <w:rPr>
+          <w:rFonts w:ascii="Microsoft YaHei" w:hAnsi="Microsoft YaHei" w:eastAsia="微软雅黑"/>
+          <w:b w:val="0"/>
+          <w:color w:val="122737"/>
+          <w:sz w:val="21"/>
+        </w:rPr>
+        <w:t>核对当前时段和剩余次数。</w:t>
+      </w:r>
+    </w:p>
+    <w:p>
+      <w:pPr>
+        <w:numPr>
+          <w:ilvl w:val="0"/>
+          <w:numId w:val="13"/>
+        </w:numPr>
+      </w:pPr>
+      <w:r>
+        <w:rPr>
+          <w:rFonts w:ascii="Microsoft YaHei" w:hAnsi="Microsoft YaHei" w:eastAsia="微软雅黑"/>
+          <w:b w:val="0"/>
+          <w:color w:val="122737"/>
+          <w:sz w:val="21"/>
+        </w:rPr>
+        <w:t>查看页面列出的今日可领取物资。</w:t>
+      </w:r>
+    </w:p>
+    <w:p>
+      <w:pPr>
+        <w:numPr>
+          <w:ilvl w:val="0"/>
+          <w:numId w:val="13"/>
+        </w:numPr>
+      </w:pPr>
+      <w:r>
+        <w:rPr>
+          <w:rFonts w:ascii="Microsoft YaHei" w:hAnsi="Microsoft YaHei" w:eastAsia="微软雅黑"/>
+          <w:b w:val="0"/>
+          <w:color w:val="122737"/>
+          <w:sz w:val="21"/>
+        </w:rPr>
+        <w:t>有资格时选择“就近找柜机”。</w:t>
+      </w:r>
+    </w:p>
+    <w:p>
+      <w:pPr>
+        <w:spacing w:before="80" w:after="40"/>
+        <w:jc w:val="center"/>
+      </w:pPr>
+      <w:r>
+        <w:drawing>
+          <wp:inline xmlns:a="http://schemas.openxmlformats.org/drawingml/2006/main" xmlns:pic="http://schemas.openxmlformats.org/drawingml/2006/picture">
+            <wp:extent cx="2096018" cy="4536000"/>
+            <wp:docPr id="4" name="Picture 4" descr="图 4　首页资格和剩余次数" title="图 4　首页资格和剩余次数"/>
+            <wp:cNvGraphicFramePr>
+              <a:graphicFrameLocks noChangeAspect="1"/>
+            </wp:cNvGraphicFramePr>
+            <a:graphic>
+              <a:graphicData uri="http://schemas.openxmlformats.org/drawingml/2006/picture">
+                <pic:pic>
+                  <pic:nvPicPr>
+                    <pic:cNvPr id="0" name="home.png"/>
+                    <pic:cNvPicPr/>
+                  </pic:nvPicPr>
+                  <pic:blipFill>
+                    <a:blip r:embed="rId14"/>
+                    <a:stretch>
+                      <a:fillRect/>
+                    </a:stretch>
+                  </pic:blipFill>
+                  <pic:spPr>
+                    <a:xfrm>
+                      <a:off x="0" y="0"/>
+                      <a:ext cx="2096018" cy="4536000"/>
+                    </a:xfrm>
+                    <a:prstGeom prst="rect"/>
+                  </pic:spPr>
+                </pic:pic>
+              </a:graphicData>
+            </a:graphic>
+          </wp:inline>
+        </w:drawing>
+      </w:r>
+    </w:p>
+    <w:p>
+      <w:pPr>
+        <w:pStyle w:val="FigureCaption"/>
+        <w:jc w:val="center"/>
+      </w:pPr>
+      <w:r>
+        <w:t>图 4　首页资格和剩余次数</w:t>
+      </w:r>
+    </w:p>
+    <w:p>
+      <w:pPr>
+        <w:spacing w:before="80" w:after="80"/>
+        <w:shd w:fill="EDF7F1"/>
+        <w:pBdr>
+          <w:top w:val="single" w:sz="7" w:space="7" w:color="087A63"/>
+          <w:left w:val="single" w:sz="7" w:space="7" w:color="087A63"/>
+          <w:bottom w:val="single" w:sz="7" w:space="7" w:color="087A63"/>
+          <w:right w:val="single" w:sz="7" w:space="7" w:color="087A63"/>
+        </w:pBdr>
+      </w:pPr>
+      <w:r>
+        <w:rPr>
+          <w:rFonts w:ascii="Microsoft YaHei" w:hAnsi="Microsoft YaHei" w:eastAsia="微软雅黑"/>
+          <w:b/>
+          <w:color w:val="006C56"/>
+          <w:sz w:val="20"/>
+        </w:rPr>
+        <w:t xml:space="preserve">完成标志　</w:t>
+      </w:r>
+      <w:r>
+        <w:rPr>
+          <w:rFonts w:ascii="Microsoft YaHei" w:hAnsi="Microsoft YaHei" w:eastAsia="微软雅黑"/>
+          <w:b w:val="0"/>
+          <w:color w:val="122737"/>
+          <w:sz w:val="20"/>
+        </w:rPr>
+        <w:t>页面显示“今日可领取”，剩余次数大于 0。</w:t>
+      </w:r>
+    </w:p>
+    <w:p>
+      <w:r>
+        <w:br w:type="page"/>
+      </w:r>
+    </w:p>
+    <w:p>
+      <w:pPr>
+        <w:pStyle w:val="Heading1"/>
+        <w:keepNext/>
+        <w:spacing w:before="200" w:after="100"/>
+      </w:pPr>
+      <w:bookmarkStart w:id="6" w:name="manual_section_05"/>
+      <w:r>
+        <w:rPr>
+          <w:rFonts w:ascii="Microsoft YaHei" w:hAnsi="Microsoft YaHei" w:eastAsia="微软雅黑"/>
+          <w:b/>
+          <w:color w:val="122737"/>
+          <w:sz w:val="30"/>
+        </w:rPr>
+        <w:t>5. 找到可用柜机</w:t>
+      </w:r>
+      <w:bookmarkEnd w:id="6"/>
+    </w:p>
+    <w:p>
+      <w:pPr>
+        <w:spacing w:before="80" w:after="80"/>
+        <w:shd w:fill="EEF5F8"/>
+        <w:pBdr>
+          <w:top w:val="single" w:sz="7" w:space="7" w:color="087A63"/>
+          <w:left w:val="single" w:sz="7" w:space="7" w:color="087A63"/>
+          <w:bottom w:val="single" w:sz="7" w:space="7" w:color="087A63"/>
+          <w:right w:val="single" w:sz="7" w:space="7" w:color="087A63"/>
+        </w:pBdr>
+      </w:pPr>
+      <w:r>
+        <w:rPr>
+          <w:rFonts w:ascii="Microsoft YaHei" w:hAnsi="Microsoft YaHei" w:eastAsia="微软雅黑"/>
+          <w:b/>
+          <w:color w:val="006C56"/>
+          <w:sz w:val="20"/>
+        </w:rPr>
+        <w:t xml:space="preserve">用途　</w:t>
+      </w:r>
+      <w:r>
+        <w:rPr>
+          <w:rFonts w:ascii="Microsoft YaHei" w:hAnsi="Microsoft YaHei" w:eastAsia="微软雅黑"/>
+          <w:b w:val="0"/>
+          <w:color w:val="122737"/>
+          <w:sz w:val="20"/>
+        </w:rPr>
+        <w:t>从附近柜机中选择在线且有库存的服务点。</w:t>
+      </w:r>
+    </w:p>
+    <w:p>
+      <w:pPr>
+        <w:keepNext/>
+        <w:spacing w:before="120" w:after="60"/>
+      </w:pPr>
+      <w:r>
+        <w:rPr>
+          <w:rFonts w:ascii="Microsoft YaHei" w:hAnsi="Microsoft YaHei" w:eastAsia="微软雅黑"/>
+          <w:b/>
+          <w:color w:val="006C56"/>
+          <w:sz w:val="21"/>
+        </w:rPr>
+        <w:t>操作步骤</w:t>
+      </w:r>
+    </w:p>
+    <w:p>
+      <w:pPr>
+        <w:numPr>
+          <w:ilvl w:val="0"/>
+          <w:numId w:val="14"/>
+        </w:numPr>
+      </w:pPr>
+      <w:r>
+        <w:rPr>
+          <w:rFonts w:ascii="Microsoft YaHei" w:hAnsi="Microsoft YaHei" w:eastAsia="微软雅黑"/>
+          <w:b w:val="0"/>
+          <w:color w:val="122737"/>
+          <w:sz w:val="21"/>
+        </w:rPr>
+        <w:t>打开“附近柜机”。</w:t>
+      </w:r>
+    </w:p>
+    <w:p>
+      <w:pPr>
+        <w:numPr>
+          <w:ilvl w:val="0"/>
+          <w:numId w:val="14"/>
+        </w:numPr>
+      </w:pPr>
+      <w:r>
+        <w:rPr>
+          <w:rFonts w:ascii="Microsoft YaHei" w:hAnsi="Microsoft YaHei" w:eastAsia="微软雅黑"/>
+          <w:b w:val="0"/>
+          <w:color w:val="122737"/>
+          <w:sz w:val="21"/>
+        </w:rPr>
+        <w:t>可按物资名称筛选。</w:t>
+      </w:r>
+    </w:p>
+    <w:p>
+      <w:pPr>
+        <w:numPr>
+          <w:ilvl w:val="0"/>
+          <w:numId w:val="14"/>
+        </w:numPr>
+      </w:pPr>
+      <w:r>
+        <w:rPr>
+          <w:rFonts w:ascii="Microsoft YaHei" w:hAnsi="Microsoft YaHei" w:eastAsia="微软雅黑"/>
+          <w:b w:val="0"/>
+          <w:color w:val="122737"/>
+          <w:sz w:val="21"/>
+        </w:rPr>
+        <w:t>查看柜机位置、在线状态和现有物资。</w:t>
+      </w:r>
+    </w:p>
+    <w:p>
+      <w:pPr>
+        <w:numPr>
+          <w:ilvl w:val="0"/>
+          <w:numId w:val="14"/>
+        </w:numPr>
+      </w:pPr>
+      <w:r>
+        <w:rPr>
+          <w:rFonts w:ascii="Microsoft YaHei" w:hAnsi="Microsoft YaHei" w:eastAsia="微软雅黑"/>
+          <w:b w:val="0"/>
+          <w:color w:val="122737"/>
+          <w:sz w:val="21"/>
+        </w:rPr>
+        <w:t>选择目标柜机进入详情。</w:t>
+      </w:r>
+    </w:p>
+    <w:p>
+      <w:pPr>
+        <w:spacing w:before="80" w:after="40"/>
+        <w:jc w:val="center"/>
+      </w:pPr>
+      <w:r>
+        <w:drawing>
+          <wp:inline xmlns:a="http://schemas.openxmlformats.org/drawingml/2006/main" xmlns:pic="http://schemas.openxmlformats.org/drawingml/2006/picture">
+            <wp:extent cx="2096018" cy="4536000"/>
+            <wp:docPr id="5" name="Picture 5" descr="图 5　附近柜机列表" title="图 5　附近柜机列表"/>
+            <wp:cNvGraphicFramePr>
+              <a:graphicFrameLocks noChangeAspect="1"/>
+            </wp:cNvGraphicFramePr>
+            <a:graphic>
+              <a:graphicData uri="http://schemas.openxmlformats.org/drawingml/2006/picture">
+                <pic:pic>
+                  <pic:nvPicPr>
+                    <pic:cNvPr id="0" name="nearby.png"/>
+                    <pic:cNvPicPr/>
+                  </pic:nvPicPr>
+                  <pic:blipFill>
+                    <a:blip r:embed="rId15"/>
+                    <a:stretch>
+                      <a:fillRect/>
+                    </a:stretch>
+                  </pic:blipFill>
+                  <pic:spPr>
+                    <a:xfrm>
+                      <a:off x="0" y="0"/>
+                      <a:ext cx="2096018" cy="4536000"/>
+                    </a:xfrm>
+                    <a:prstGeom prst="rect"/>
+                  </pic:spPr>
+                </pic:pic>
+              </a:graphicData>
+            </a:graphic>
+          </wp:inline>
+        </w:drawing>
+      </w:r>
+    </w:p>
+    <w:p>
+      <w:pPr>
+        <w:pStyle w:val="FigureCaption"/>
+        <w:jc w:val="center"/>
+      </w:pPr>
+      <w:r>
+        <w:t>图 5　附近柜机列表</w:t>
+      </w:r>
+    </w:p>
+    <w:p>
+      <w:pPr>
+        <w:spacing w:before="80" w:after="80"/>
+        <w:shd w:fill="EDF7F1"/>
+        <w:pBdr>
+          <w:top w:val="single" w:sz="7" w:space="7" w:color="087A63"/>
+          <w:left w:val="single" w:sz="7" w:space="7" w:color="087A63"/>
+          <w:bottom w:val="single" w:sz="7" w:space="7" w:color="087A63"/>
+          <w:right w:val="single" w:sz="7" w:space="7" w:color="087A63"/>
+        </w:pBdr>
+      </w:pPr>
+      <w:r>
+        <w:rPr>
+          <w:rFonts w:ascii="Microsoft YaHei" w:hAnsi="Microsoft YaHei" w:eastAsia="微软雅黑"/>
+          <w:b/>
+          <w:color w:val="006C56"/>
+          <w:sz w:val="20"/>
+        </w:rPr>
+        <w:t xml:space="preserve">完成标志　</w:t>
+      </w:r>
+      <w:r>
+        <w:rPr>
+          <w:rFonts w:ascii="Microsoft YaHei" w:hAnsi="Microsoft YaHei" w:eastAsia="微软雅黑"/>
+          <w:b w:val="0"/>
+          <w:color w:val="122737"/>
+          <w:sz w:val="20"/>
+        </w:rPr>
+        <w:t>目标柜机显示“在线”，并列出计划领取的物资。</w:t>
+      </w:r>
+    </w:p>
+    <w:p>
+      <w:r>
+        <w:br w:type="page"/>
+      </w:r>
+    </w:p>
+    <w:p>
+      <w:pPr>
+        <w:pStyle w:val="Heading1"/>
+        <w:keepNext/>
+        <w:spacing w:before="200" w:after="100"/>
+      </w:pPr>
+      <w:bookmarkStart w:id="7" w:name="manual_section_06"/>
+      <w:r>
+        <w:rPr>
+          <w:rFonts w:ascii="Microsoft YaHei" w:hAnsi="Microsoft YaHei" w:eastAsia="微软雅黑"/>
+          <w:b/>
+          <w:color w:val="122737"/>
+          <w:sz w:val="30"/>
+        </w:rPr>
+        <w:t>6. 选择物资</w:t>
+      </w:r>
+      <w:bookmarkEnd w:id="7"/>
+    </w:p>
+    <w:p>
+      <w:pPr>
+        <w:spacing w:before="80" w:after="80"/>
+        <w:shd w:fill="EEF5F8"/>
+        <w:pBdr>
+          <w:top w:val="single" w:sz="7" w:space="7" w:color="087A63"/>
+          <w:left w:val="single" w:sz="7" w:space="7" w:color="087A63"/>
+          <w:bottom w:val="single" w:sz="7" w:space="7" w:color="087A63"/>
+          <w:right w:val="single" w:sz="7" w:space="7" w:color="087A63"/>
+        </w:pBdr>
+      </w:pPr>
+      <w:r>
+        <w:rPr>
+          <w:rFonts w:ascii="Microsoft YaHei" w:hAnsi="Microsoft YaHei" w:eastAsia="微软雅黑"/>
+          <w:b/>
+          <w:color w:val="006C56"/>
+          <w:sz w:val="20"/>
+        </w:rPr>
+        <w:t xml:space="preserve">用途　</w:t>
+      </w:r>
+      <w:r>
+        <w:rPr>
+          <w:rFonts w:ascii="Microsoft YaHei" w:hAnsi="Microsoft YaHei" w:eastAsia="微软雅黑"/>
+          <w:b w:val="0"/>
+          <w:color w:val="122737"/>
+          <w:sz w:val="20"/>
+        </w:rPr>
+        <w:t>按今日额度选定预约物资和数量。</w:t>
+      </w:r>
+    </w:p>
+    <w:p>
+      <w:pPr>
+        <w:keepNext/>
+        <w:spacing w:before="120" w:after="60"/>
+      </w:pPr>
+      <w:r>
+        <w:rPr>
+          <w:rFonts w:ascii="Microsoft YaHei" w:hAnsi="Microsoft YaHei" w:eastAsia="微软雅黑"/>
+          <w:b/>
+          <w:color w:val="006C56"/>
+          <w:sz w:val="21"/>
+        </w:rPr>
+        <w:t>操作步骤</w:t>
+      </w:r>
+    </w:p>
+    <w:p>
+      <w:pPr>
+        <w:numPr>
+          <w:ilvl w:val="0"/>
+          <w:numId w:val="15"/>
+        </w:numPr>
+      </w:pPr>
+      <w:r>
+        <w:rPr>
+          <w:rFonts w:ascii="Microsoft YaHei" w:hAnsi="Microsoft YaHei" w:eastAsia="微软雅黑"/>
+          <w:b w:val="0"/>
+          <w:color w:val="122737"/>
+          <w:sz w:val="21"/>
+        </w:rPr>
+        <w:t>在柜机详情查看提前预约规则。</w:t>
+      </w:r>
+    </w:p>
+    <w:p>
+      <w:pPr>
+        <w:numPr>
+          <w:ilvl w:val="0"/>
+          <w:numId w:val="15"/>
+        </w:numPr>
+      </w:pPr>
+      <w:r>
+        <w:rPr>
+          <w:rFonts w:ascii="Microsoft YaHei" w:hAnsi="Microsoft YaHei" w:eastAsia="微软雅黑"/>
+          <w:b w:val="0"/>
+          <w:color w:val="122737"/>
+          <w:sz w:val="21"/>
+        </w:rPr>
+        <w:t>在物资卡片中选择数量。</w:t>
+      </w:r>
+    </w:p>
+    <w:p>
+      <w:pPr>
+        <w:numPr>
+          <w:ilvl w:val="0"/>
+          <w:numId w:val="15"/>
+        </w:numPr>
+      </w:pPr>
+      <w:r>
+        <w:rPr>
+          <w:rFonts w:ascii="Microsoft YaHei" w:hAnsi="Microsoft YaHei" w:eastAsia="微软雅黑"/>
+          <w:b w:val="0"/>
+          <w:color w:val="122737"/>
+          <w:sz w:val="21"/>
+        </w:rPr>
+        <w:t>核对已选种类、件数和当前库存。</w:t>
+      </w:r>
+    </w:p>
+    <w:p>
+      <w:pPr>
+        <w:numPr>
+          <w:ilvl w:val="0"/>
+          <w:numId w:val="15"/>
+        </w:numPr>
+      </w:pPr>
+      <w:r>
+        <w:rPr>
+          <w:rFonts w:ascii="Microsoft YaHei" w:hAnsi="Microsoft YaHei" w:eastAsia="微软雅黑"/>
+          <w:b w:val="0"/>
+          <w:color w:val="122737"/>
+          <w:sz w:val="21"/>
+        </w:rPr>
+        <w:t>确认没有超过今日可领取数量。</w:t>
+      </w:r>
+    </w:p>
+    <w:p>
+      <w:pPr>
+        <w:spacing w:before="80" w:after="40"/>
+        <w:jc w:val="center"/>
+      </w:pPr>
+      <w:r>
+        <w:drawing>
+          <wp:inline xmlns:a="http://schemas.openxmlformats.org/drawingml/2006/main" xmlns:pic="http://schemas.openxmlformats.org/drawingml/2006/picture">
+            <wp:extent cx="2096018" cy="4536000"/>
+            <wp:docPr id="6" name="Picture 6" descr="图 6　选择预约物资" title="图 6　选择预约物资"/>
+            <wp:cNvGraphicFramePr>
+              <a:graphicFrameLocks noChangeAspect="1"/>
+            </wp:cNvGraphicFramePr>
+            <a:graphic>
+              <a:graphicData uri="http://schemas.openxmlformats.org/drawingml/2006/picture">
+                <pic:pic>
+                  <pic:nvPicPr>
+                    <pic:cNvPr id="0" name="select.png"/>
+                    <pic:cNvPicPr/>
+                  </pic:nvPicPr>
+                  <pic:blipFill>
+                    <a:blip r:embed="rId16"/>
+                    <a:stretch>
+                      <a:fillRect/>
+                    </a:stretch>
+                  </pic:blipFill>
+                  <pic:spPr>
+                    <a:xfrm>
+                      <a:off x="0" y="0"/>
+                      <a:ext cx="2096018" cy="4536000"/>
+                    </a:xfrm>
+                    <a:prstGeom prst="rect"/>
+                  </pic:spPr>
+                </pic:pic>
+              </a:graphicData>
+            </a:graphic>
+          </wp:inline>
+        </w:drawing>
+      </w:r>
+    </w:p>
+    <w:p>
+      <w:pPr>
+        <w:pStyle w:val="FigureCaption"/>
+        <w:jc w:val="center"/>
+      </w:pPr>
+      <w:r>
+        <w:t>图 6　选择预约物资</w:t>
+      </w:r>
+    </w:p>
+    <w:p>
+      <w:pPr>
+        <w:spacing w:before="80" w:after="80"/>
+        <w:shd w:fill="EDF7F1"/>
+        <w:pBdr>
+          <w:top w:val="single" w:sz="7" w:space="7" w:color="087A63"/>
+          <w:left w:val="single" w:sz="7" w:space="7" w:color="087A63"/>
+          <w:bottom w:val="single" w:sz="7" w:space="7" w:color="087A63"/>
+          <w:right w:val="single" w:sz="7" w:space="7" w:color="087A63"/>
+        </w:pBdr>
+      </w:pPr>
+      <w:r>
+        <w:rPr>
+          <w:rFonts w:ascii="Microsoft YaHei" w:hAnsi="Microsoft YaHei" w:eastAsia="微软雅黑"/>
+          <w:b/>
+          <w:color w:val="006C56"/>
+          <w:sz w:val="20"/>
+        </w:rPr>
+        <w:t xml:space="preserve">完成标志　</w:t>
+      </w:r>
+      <w:r>
+        <w:rPr>
+          <w:rFonts w:ascii="Microsoft YaHei" w:hAnsi="Microsoft YaHei" w:eastAsia="微软雅黑"/>
+          <w:b w:val="0"/>
+          <w:color w:val="122737"/>
+          <w:sz w:val="20"/>
+        </w:rPr>
+        <w:t>“已选种类”和“已选件数”显示本次计划领取的数量。</w:t>
+      </w:r>
+    </w:p>
+    <w:p>
+      <w:r>
+        <w:br w:type="page"/>
+      </w:r>
+    </w:p>
+    <w:p>
+      <w:pPr>
+        <w:pStyle w:val="Heading1"/>
+        <w:keepNext/>
+        <w:spacing w:before="200" w:after="100"/>
+      </w:pPr>
+      <w:bookmarkStart w:id="8" w:name="manual_section_07"/>
+      <w:r>
+        <w:rPr>
+          <w:rFonts w:ascii="Microsoft YaHei" w:hAnsi="Microsoft YaHei" w:eastAsia="微软雅黑"/>
+          <w:b/>
+          <w:color w:val="122737"/>
+          <w:sz w:val="30"/>
+        </w:rPr>
+        <w:t>7. 提交预约</w:t>
+      </w:r>
+      <w:bookmarkEnd w:id="8"/>
+    </w:p>
+    <w:p>
+      <w:pPr>
+        <w:spacing w:before="80" w:after="80"/>
+        <w:shd w:fill="EEF5F8"/>
+        <w:pBdr>
+          <w:top w:val="single" w:sz="7" w:space="7" w:color="087A63"/>
+          <w:left w:val="single" w:sz="7" w:space="7" w:color="087A63"/>
+          <w:bottom w:val="single" w:sz="7" w:space="7" w:color="087A63"/>
+          <w:right w:val="single" w:sz="7" w:space="7" w:color="087A63"/>
+        </w:pBdr>
+      </w:pPr>
+      <w:r>
+        <w:rPr>
+          <w:rFonts w:ascii="Microsoft YaHei" w:hAnsi="Microsoft YaHei" w:eastAsia="微软雅黑"/>
+          <w:b/>
+          <w:color w:val="006C56"/>
+          <w:sz w:val="20"/>
+        </w:rPr>
+        <w:t xml:space="preserve">用途　</w:t>
+      </w:r>
+      <w:r>
+        <w:rPr>
+          <w:rFonts w:ascii="Microsoft YaHei" w:hAnsi="Microsoft YaHei" w:eastAsia="微软雅黑"/>
+          <w:b w:val="0"/>
+          <w:color w:val="122737"/>
+          <w:sz w:val="20"/>
+        </w:rPr>
+        <w:t>为所选物资建立有时限的预约。</w:t>
+      </w:r>
+    </w:p>
+    <w:p>
+      <w:pPr>
+        <w:keepNext/>
+        <w:spacing w:before="120" w:after="60"/>
+      </w:pPr>
+      <w:r>
+        <w:rPr>
+          <w:rFonts w:ascii="Microsoft YaHei" w:hAnsi="Microsoft YaHei" w:eastAsia="微软雅黑"/>
+          <w:b/>
+          <w:color w:val="006C56"/>
+          <w:sz w:val="21"/>
+        </w:rPr>
+        <w:t>操作步骤</w:t>
+      </w:r>
+    </w:p>
+    <w:p>
+      <w:pPr>
+        <w:numPr>
+          <w:ilvl w:val="0"/>
+          <w:numId w:val="16"/>
+        </w:numPr>
+      </w:pPr>
+      <w:r>
+        <w:rPr>
+          <w:rFonts w:ascii="Microsoft YaHei" w:hAnsi="Microsoft YaHei" w:eastAsia="微软雅黑"/>
+          <w:b w:val="0"/>
+          <w:color w:val="122737"/>
+          <w:sz w:val="21"/>
+        </w:rPr>
+        <w:t>选择“提交预约取货”。</w:t>
+      </w:r>
+    </w:p>
+    <w:p>
+      <w:pPr>
+        <w:numPr>
+          <w:ilvl w:val="0"/>
+          <w:numId w:val="16"/>
+        </w:numPr>
+      </w:pPr>
+      <w:r>
+        <w:rPr>
+          <w:rFonts w:ascii="Microsoft YaHei" w:hAnsi="Microsoft YaHei" w:eastAsia="微软雅黑"/>
+          <w:b w:val="0"/>
+          <w:color w:val="122737"/>
+          <w:sz w:val="21"/>
+        </w:rPr>
+        <w:t>等待页面显示“预约成功”。</w:t>
+      </w:r>
+    </w:p>
+    <w:p>
+      <w:pPr>
+        <w:numPr>
+          <w:ilvl w:val="0"/>
+          <w:numId w:val="16"/>
+        </w:numPr>
+      </w:pPr>
+      <w:r>
+        <w:rPr>
+          <w:rFonts w:ascii="Microsoft YaHei" w:hAnsi="Microsoft YaHei" w:eastAsia="微软雅黑"/>
+          <w:b w:val="0"/>
+          <w:color w:val="122737"/>
+          <w:sz w:val="21"/>
+        </w:rPr>
+        <w:t>核对物资、数量和保留截止时间。</w:t>
+      </w:r>
+    </w:p>
+    <w:p>
+      <w:pPr>
+        <w:numPr>
+          <w:ilvl w:val="0"/>
+          <w:numId w:val="16"/>
+        </w:numPr>
+      </w:pPr>
+      <w:r>
+        <w:rPr>
+          <w:rFonts w:ascii="Microsoft YaHei" w:hAnsi="Microsoft YaHei" w:eastAsia="微软雅黑"/>
+          <w:b w:val="0"/>
+          <w:color w:val="122737"/>
+          <w:sz w:val="21"/>
+        </w:rPr>
+        <w:t>选择“我知道了”返回柜机详情。</w:t>
+      </w:r>
+    </w:p>
+    <w:p>
+      <w:pPr>
+        <w:spacing w:before="80" w:after="40"/>
+        <w:jc w:val="center"/>
+      </w:pPr>
+      <w:r>
+        <w:drawing>
+          <wp:inline xmlns:a="http://schemas.openxmlformats.org/drawingml/2006/main" xmlns:pic="http://schemas.openxmlformats.org/drawingml/2006/picture">
+            <wp:extent cx="2096018" cy="4536000"/>
+            <wp:docPr id="7" name="Picture 7" descr="图 7　预约成功" title="图 7　预约成功"/>
+            <wp:cNvGraphicFramePr>
+              <a:graphicFrameLocks noChangeAspect="1"/>
+            </wp:cNvGraphicFramePr>
+            <a:graphic>
+              <a:graphicData uri="http://schemas.openxmlformats.org/drawingml/2006/picture">
+                <pic:pic>
+                  <pic:nvPicPr>
+                    <pic:cNvPr id="0" name="reservation-success.png"/>
+                    <pic:cNvPicPr/>
+                  </pic:nvPicPr>
+                  <pic:blipFill>
+                    <a:blip r:embed="rId17"/>
+                    <a:stretch>
+                      <a:fillRect/>
+                    </a:stretch>
+                  </pic:blipFill>
+                  <pic:spPr>
+                    <a:xfrm>
+                      <a:off x="0" y="0"/>
+                      <a:ext cx="2096018" cy="4536000"/>
+                    </a:xfrm>
+                    <a:prstGeom prst="rect"/>
+                  </pic:spPr>
+                </pic:pic>
+              </a:graphicData>
+            </a:graphic>
+          </wp:inline>
+        </w:drawing>
+      </w:r>
+    </w:p>
+    <w:p>
+      <w:pPr>
+        <w:pStyle w:val="FigureCaption"/>
+        <w:jc w:val="center"/>
+      </w:pPr>
+      <w:r>
+        <w:t>图 7　预约成功</w:t>
+      </w:r>
+    </w:p>
+    <w:p>
+      <w:pPr>
+        <w:spacing w:before="80" w:after="80"/>
+        <w:shd w:fill="EDF7F1"/>
+        <w:pBdr>
+          <w:top w:val="single" w:sz="7" w:space="7" w:color="087A63"/>
+          <w:left w:val="single" w:sz="7" w:space="7" w:color="087A63"/>
+          <w:bottom w:val="single" w:sz="7" w:space="7" w:color="087A63"/>
+          <w:right w:val="single" w:sz="7" w:space="7" w:color="087A63"/>
+        </w:pBdr>
+      </w:pPr>
+      <w:r>
+        <w:rPr>
+          <w:rFonts w:ascii="Microsoft YaHei" w:hAnsi="Microsoft YaHei" w:eastAsia="微软雅黑"/>
+          <w:b/>
+          <w:color w:val="006C56"/>
+          <w:sz w:val="20"/>
+        </w:rPr>
+        <w:t xml:space="preserve">完成标志　</w:t>
+      </w:r>
+      <w:r>
+        <w:rPr>
+          <w:rFonts w:ascii="Microsoft YaHei" w:hAnsi="Microsoft YaHei" w:eastAsia="微软雅黑"/>
+          <w:b w:val="0"/>
+          <w:color w:val="122737"/>
+          <w:sz w:val="20"/>
+        </w:rPr>
+        <w:t>柜机详情出现“当前预约”，并显示预约物资和保留时间。</w:t>
+      </w:r>
+    </w:p>
+    <w:p>
+      <w:r>
+        <w:br w:type="page"/>
+      </w:r>
+    </w:p>
+    <w:p>
+      <w:pPr>
+        <w:pStyle w:val="Heading1"/>
+        <w:keepNext/>
+        <w:spacing w:before="200" w:after="100"/>
+      </w:pPr>
+      <w:bookmarkStart w:id="9" w:name="manual_section_08"/>
+      <w:r>
+        <w:rPr>
+          <w:rFonts w:ascii="Microsoft YaHei" w:hAnsi="Microsoft YaHei" w:eastAsia="微软雅黑"/>
+          <w:b/>
+          <w:color w:val="122737"/>
+          <w:sz w:val="30"/>
+        </w:rPr>
+        <w:t>8. 打开当前预约</w:t>
+      </w:r>
+      <w:bookmarkEnd w:id="9"/>
+    </w:p>
+    <w:p>
+      <w:pPr>
+        <w:spacing w:before="80" w:after="80"/>
+        <w:shd w:fill="EEF5F8"/>
+        <w:pBdr>
+          <w:top w:val="single" w:sz="7" w:space="7" w:color="087A63"/>
+          <w:left w:val="single" w:sz="7" w:space="7" w:color="087A63"/>
+          <w:bottom w:val="single" w:sz="7" w:space="7" w:color="087A63"/>
+          <w:right w:val="single" w:sz="7" w:space="7" w:color="087A63"/>
+        </w:pBdr>
+      </w:pPr>
+      <w:r>
+        <w:rPr>
+          <w:rFonts w:ascii="Microsoft YaHei" w:hAnsi="Microsoft YaHei" w:eastAsia="微软雅黑"/>
+          <w:b/>
+          <w:color w:val="006C56"/>
+          <w:sz w:val="20"/>
+        </w:rPr>
+        <w:t xml:space="preserve">用途　</w:t>
+      </w:r>
+      <w:r>
+        <w:rPr>
+          <w:rFonts w:ascii="Microsoft YaHei" w:hAnsi="Microsoft YaHei" w:eastAsia="微软雅黑"/>
+          <w:b w:val="0"/>
+          <w:color w:val="122737"/>
+          <w:sz w:val="20"/>
+        </w:rPr>
+        <w:t>在预约有效期内回到同一台柜机，开始现场领取。</w:t>
+      </w:r>
+    </w:p>
+    <w:p>
+      <w:pPr>
+        <w:keepNext/>
+        <w:spacing w:before="120" w:after="60"/>
+      </w:pPr>
+      <w:r>
+        <w:rPr>
+          <w:rFonts w:ascii="Microsoft YaHei" w:hAnsi="Microsoft YaHei" w:eastAsia="微软雅黑"/>
+          <w:b/>
+          <w:color w:val="006C56"/>
+          <w:sz w:val="21"/>
+        </w:rPr>
+        <w:t>操作步骤</w:t>
+      </w:r>
+    </w:p>
+    <w:p>
+      <w:pPr>
+        <w:numPr>
+          <w:ilvl w:val="0"/>
+          <w:numId w:val="17"/>
+        </w:numPr>
+      </w:pPr>
+      <w:r>
+        <w:rPr>
+          <w:rFonts w:ascii="Microsoft YaHei" w:hAnsi="Microsoft YaHei" w:eastAsia="微软雅黑"/>
+          <w:b w:val="0"/>
+          <w:color w:val="122737"/>
+          <w:sz w:val="21"/>
+        </w:rPr>
+        <w:t>到达预约对应的柜机。</w:t>
+      </w:r>
+    </w:p>
+    <w:p>
+      <w:pPr>
+        <w:numPr>
+          <w:ilvl w:val="0"/>
+          <w:numId w:val="17"/>
+        </w:numPr>
+      </w:pPr>
+      <w:r>
+        <w:rPr>
+          <w:rFonts w:ascii="Microsoft YaHei" w:hAnsi="Microsoft YaHei" w:eastAsia="微软雅黑"/>
+          <w:b w:val="0"/>
+          <w:color w:val="122737"/>
+          <w:sz w:val="21"/>
+        </w:rPr>
+        <w:t>在柜机详情刷新状态。</w:t>
+      </w:r>
+    </w:p>
+    <w:p>
+      <w:pPr>
+        <w:numPr>
+          <w:ilvl w:val="0"/>
+          <w:numId w:val="17"/>
+        </w:numPr>
+      </w:pPr>
+      <w:r>
+        <w:rPr>
+          <w:rFonts w:ascii="Microsoft YaHei" w:hAnsi="Microsoft YaHei" w:eastAsia="微软雅黑"/>
+          <w:b w:val="0"/>
+          <w:color w:val="122737"/>
+          <w:sz w:val="21"/>
+        </w:rPr>
+        <w:t>确认柜机显示“在线”。</w:t>
+      </w:r>
+    </w:p>
+    <w:p>
+      <w:pPr>
+        <w:numPr>
+          <w:ilvl w:val="0"/>
+          <w:numId w:val="17"/>
+        </w:numPr>
+      </w:pPr>
+      <w:r>
+        <w:rPr>
+          <w:rFonts w:ascii="Microsoft YaHei" w:hAnsi="Microsoft YaHei" w:eastAsia="微软雅黑"/>
+          <w:b w:val="0"/>
+          <w:color w:val="122737"/>
+          <w:sz w:val="21"/>
+        </w:rPr>
+        <w:t>在“当前预约”选择“用预约开柜”。</w:t>
+      </w:r>
+    </w:p>
+    <w:p>
+      <w:pPr>
+        <w:spacing w:before="80" w:after="40"/>
+        <w:jc w:val="center"/>
+      </w:pPr>
+      <w:r>
+        <w:drawing>
+          <wp:inline xmlns:a="http://schemas.openxmlformats.org/drawingml/2006/main" xmlns:pic="http://schemas.openxmlformats.org/drawingml/2006/picture">
+            <wp:extent cx="2096018" cy="4536000"/>
+            <wp:docPr id="8" name="Picture 8" descr="图 8　在线柜机与当前预约" title="图 8　在线柜机与当前预约"/>
+            <wp:cNvGraphicFramePr>
+              <a:graphicFrameLocks noChangeAspect="1"/>
+            </wp:cNvGraphicFramePr>
+            <a:graphic>
+              <a:graphicData uri="http://schemas.openxmlformats.org/drawingml/2006/picture">
+                <pic:pic>
+                  <pic:nvPicPr>
+                    <pic:cNvPr id="0" name="arrival.png"/>
+                    <pic:cNvPicPr/>
+                  </pic:nvPicPr>
+                  <pic:blipFill>
+                    <a:blip r:embed="rId18"/>
+                    <a:stretch>
+                      <a:fillRect/>
+                    </a:stretch>
+                  </pic:blipFill>
+                  <pic:spPr>
+                    <a:xfrm>
+                      <a:off x="0" y="0"/>
+                      <a:ext cx="2096018" cy="4536000"/>
+                    </a:xfrm>
+                    <a:prstGeom prst="rect"/>
+                  </pic:spPr>
+                </pic:pic>
+              </a:graphicData>
+            </a:graphic>
+          </wp:inline>
+        </w:drawing>
+      </w:r>
+    </w:p>
+    <w:p>
+      <w:pPr>
+        <w:pStyle w:val="FigureCaption"/>
+        <w:jc w:val="center"/>
+      </w:pPr>
+      <w:r>
+        <w:t>图 8　在线柜机与当前预约</w:t>
+      </w:r>
+    </w:p>
+    <w:p>
+      <w:pPr>
+        <w:spacing w:before="80" w:after="80"/>
+        <w:shd w:fill="EDF7F1"/>
+        <w:pBdr>
+          <w:top w:val="single" w:sz="7" w:space="7" w:color="087A63"/>
+          <w:left w:val="single" w:sz="7" w:space="7" w:color="087A63"/>
+          <w:bottom w:val="single" w:sz="7" w:space="7" w:color="087A63"/>
+          <w:right w:val="single" w:sz="7" w:space="7" w:color="087A63"/>
+        </w:pBdr>
+      </w:pPr>
+      <w:r>
+        <w:rPr>
+          <w:rFonts w:ascii="Microsoft YaHei" w:hAnsi="Microsoft YaHei" w:eastAsia="微软雅黑"/>
+          <w:b/>
+          <w:color w:val="006C56"/>
+          <w:sz w:val="20"/>
+        </w:rPr>
+        <w:t xml:space="preserve">完成标志　</w:t>
+      </w:r>
+      <w:r>
+        <w:rPr>
+          <w:rFonts w:ascii="Microsoft YaHei" w:hAnsi="Microsoft YaHei" w:eastAsia="微软雅黑"/>
+          <w:b w:val="0"/>
+          <w:color w:val="122737"/>
+          <w:sz w:val="20"/>
+        </w:rPr>
+        <w:t>页面进入开柜前核对，不再提示柜机离线或预约过期。</w:t>
+      </w:r>
+    </w:p>
+    <w:p>
+      <w:r>
+        <w:br w:type="page"/>
+      </w:r>
+    </w:p>
+    <w:p>
+      <w:pPr>
+        <w:pStyle w:val="Heading1"/>
+        <w:keepNext/>
+        <w:spacing w:before="200" w:after="100"/>
+      </w:pPr>
+      <w:bookmarkStart w:id="10" w:name="manual_section_09"/>
+      <w:r>
+        <w:rPr>
+          <w:rFonts w:ascii="Microsoft YaHei" w:hAnsi="Microsoft YaHei" w:eastAsia="微软雅黑"/>
+          <w:b/>
+          <w:color w:val="122737"/>
+          <w:sz w:val="30"/>
+        </w:rPr>
+        <w:t>9. 开柜前最后核对</w:t>
+      </w:r>
+      <w:bookmarkEnd w:id="10"/>
+    </w:p>
+    <w:p>
+      <w:pPr>
+        <w:spacing w:before="80" w:after="80"/>
+        <w:shd w:fill="EEF5F8"/>
+        <w:pBdr>
+          <w:top w:val="single" w:sz="7" w:space="7" w:color="087A63"/>
+          <w:left w:val="single" w:sz="7" w:space="7" w:color="087A63"/>
+          <w:bottom w:val="single" w:sz="7" w:space="7" w:color="087A63"/>
+          <w:right w:val="single" w:sz="7" w:space="7" w:color="087A63"/>
+        </w:pBdr>
+      </w:pPr>
+      <w:r>
+        <w:rPr>
+          <w:rFonts w:ascii="Microsoft YaHei" w:hAnsi="Microsoft YaHei" w:eastAsia="微软雅黑"/>
+          <w:b/>
+          <w:color w:val="006C56"/>
+          <w:sz w:val="20"/>
+        </w:rPr>
+        <w:t xml:space="preserve">用途　</w:t>
+      </w:r>
+      <w:r>
+        <w:rPr>
+          <w:rFonts w:ascii="Microsoft YaHei" w:hAnsi="Microsoft YaHei" w:eastAsia="微软雅黑"/>
+          <w:b w:val="0"/>
+          <w:color w:val="122737"/>
+          <w:sz w:val="20"/>
+        </w:rPr>
+        <w:t>在开门前再次确认现场柜机、柜门和预约物资。</w:t>
+      </w:r>
+    </w:p>
+    <w:p>
+      <w:pPr>
+        <w:keepNext/>
+        <w:spacing w:before="120" w:after="60"/>
+      </w:pPr>
+      <w:r>
+        <w:rPr>
+          <w:rFonts w:ascii="Microsoft YaHei" w:hAnsi="Microsoft YaHei" w:eastAsia="微软雅黑"/>
+          <w:b/>
+          <w:color w:val="006C56"/>
+          <w:sz w:val="21"/>
+        </w:rPr>
+        <w:t>操作步骤</w:t>
+      </w:r>
+    </w:p>
+    <w:p>
+      <w:pPr>
+        <w:numPr>
+          <w:ilvl w:val="0"/>
+          <w:numId w:val="18"/>
+        </w:numPr>
+      </w:pPr>
+      <w:r>
+        <w:rPr>
+          <w:rFonts w:ascii="Microsoft YaHei" w:hAnsi="Microsoft YaHei" w:eastAsia="微软雅黑"/>
+          <w:b w:val="0"/>
+          <w:color w:val="122737"/>
+          <w:sz w:val="21"/>
+        </w:rPr>
+        <w:t>核对自己已经站在正确柜机旁。</w:t>
+      </w:r>
+    </w:p>
+    <w:p>
+      <w:pPr>
+        <w:numPr>
+          <w:ilvl w:val="0"/>
+          <w:numId w:val="18"/>
+        </w:numPr>
+      </w:pPr>
+      <w:r>
+        <w:rPr>
+          <w:rFonts w:ascii="Microsoft YaHei" w:hAnsi="Microsoft YaHei" w:eastAsia="微软雅黑"/>
+          <w:b w:val="0"/>
+          <w:color w:val="122737"/>
+          <w:sz w:val="21"/>
+        </w:rPr>
+        <w:t>核对柜机名称、柜门和预约物资。</w:t>
+      </w:r>
+    </w:p>
+    <w:p>
+      <w:pPr>
+        <w:numPr>
+          <w:ilvl w:val="0"/>
+          <w:numId w:val="18"/>
+        </w:numPr>
+      </w:pPr>
+      <w:r>
+        <w:rPr>
+          <w:rFonts w:ascii="Microsoft YaHei" w:hAnsi="Microsoft YaHei" w:eastAsia="微软雅黑"/>
+          <w:b w:val="0"/>
+          <w:color w:val="122737"/>
+          <w:sz w:val="21"/>
+        </w:rPr>
+        <w:t>确认可以立即取货并及时关门。</w:t>
+      </w:r>
+    </w:p>
+    <w:p>
+      <w:pPr>
+        <w:numPr>
+          <w:ilvl w:val="0"/>
+          <w:numId w:val="18"/>
+        </w:numPr>
+      </w:pPr>
+      <w:r>
+        <w:rPr>
+          <w:rFonts w:ascii="Microsoft YaHei" w:hAnsi="Microsoft YaHei" w:eastAsia="微软雅黑"/>
+          <w:b w:val="0"/>
+          <w:color w:val="122737"/>
+          <w:sz w:val="21"/>
+        </w:rPr>
+        <w:t>选择“确认并开柜”。</w:t>
+      </w:r>
+    </w:p>
+    <w:p>
+      <w:pPr>
+        <w:spacing w:before="80" w:after="40"/>
+        <w:jc w:val="center"/>
+      </w:pPr>
+      <w:r>
+        <w:drawing>
+          <wp:inline xmlns:a="http://schemas.openxmlformats.org/drawingml/2006/main" xmlns:pic="http://schemas.openxmlformats.org/drawingml/2006/picture">
+            <wp:extent cx="2096018" cy="4536000"/>
+            <wp:docPr id="9" name="Picture 9" descr="图 9　开柜前核对" title="图 9　开柜前核对"/>
+            <wp:cNvGraphicFramePr>
+              <a:graphicFrameLocks noChangeAspect="1"/>
+            </wp:cNvGraphicFramePr>
+            <a:graphic>
+              <a:graphicData uri="http://schemas.openxmlformats.org/drawingml/2006/picture">
+                <pic:pic>
+                  <pic:nvPicPr>
+                    <pic:cNvPr id="0" name="pickup-confirm.png"/>
+                    <pic:cNvPicPr/>
+                  </pic:nvPicPr>
+                  <pic:blipFill>
+                    <a:blip r:embed="rId19"/>
+                    <a:stretch>
+                      <a:fillRect/>
+                    </a:stretch>
+                  </pic:blipFill>
+                  <pic:spPr>
+                    <a:xfrm>
+                      <a:off x="0" y="0"/>
+                      <a:ext cx="2096018" cy="4536000"/>
+                    </a:xfrm>
+                    <a:prstGeom prst="rect"/>
+                  </pic:spPr>
+                </pic:pic>
+              </a:graphicData>
+            </a:graphic>
+          </wp:inline>
+        </w:drawing>
+      </w:r>
+    </w:p>
+    <w:p>
+      <w:pPr>
+        <w:pStyle w:val="FigureCaption"/>
+        <w:jc w:val="center"/>
+      </w:pPr>
+      <w:r>
+        <w:t>图 9　开柜前核对</w:t>
+      </w:r>
+    </w:p>
+    <w:p>
+      <w:pPr>
+        <w:spacing w:before="80" w:after="80"/>
+        <w:shd w:fill="EDF7F1"/>
+        <w:pBdr>
+          <w:top w:val="single" w:sz="7" w:space="7" w:color="087A63"/>
+          <w:left w:val="single" w:sz="7" w:space="7" w:color="087A63"/>
+          <w:bottom w:val="single" w:sz="7" w:space="7" w:color="087A63"/>
+          <w:right w:val="single" w:sz="7" w:space="7" w:color="087A63"/>
+        </w:pBdr>
+      </w:pPr>
+      <w:r>
+        <w:rPr>
+          <w:rFonts w:ascii="Microsoft YaHei" w:hAnsi="Microsoft YaHei" w:eastAsia="微软雅黑"/>
+          <w:b/>
+          <w:color w:val="006C56"/>
+          <w:sz w:val="20"/>
+        </w:rPr>
+        <w:t xml:space="preserve">完成标志　</w:t>
+      </w:r>
+      <w:r>
+        <w:rPr>
+          <w:rFonts w:ascii="Microsoft YaHei" w:hAnsi="Microsoft YaHei" w:eastAsia="微软雅黑"/>
+          <w:b w:val="0"/>
+          <w:color w:val="122737"/>
+          <w:sz w:val="20"/>
+        </w:rPr>
+        <w:t>页面显示开门请求已提交；此时不重复点击开柜。</w:t>
+      </w:r>
+    </w:p>
+    <w:p>
+      <w:r>
+        <w:br w:type="page"/>
+      </w:r>
+    </w:p>
+    <w:p>
+      <w:pPr>
+        <w:pStyle w:val="Heading1"/>
+        <w:keepNext/>
+        <w:spacing w:before="200" w:after="100"/>
+      </w:pPr>
+      <w:bookmarkStart w:id="11" w:name="manual_section_10"/>
+      <w:r>
+        <w:rPr>
+          <w:rFonts w:ascii="Microsoft YaHei" w:hAnsi="Microsoft YaHei" w:eastAsia="微软雅黑"/>
+          <w:b/>
+          <w:color w:val="122737"/>
+          <w:sz w:val="30"/>
+        </w:rPr>
+        <w:t>10. 关门并查看领取结果</w:t>
+      </w:r>
+      <w:bookmarkEnd w:id="11"/>
+    </w:p>
+    <w:p>
+      <w:pPr>
+        <w:spacing w:before="80" w:after="80"/>
+        <w:shd w:fill="EEF5F8"/>
+        <w:pBdr>
+          <w:top w:val="single" w:sz="7" w:space="7" w:color="087A63"/>
+          <w:left w:val="single" w:sz="7" w:space="7" w:color="087A63"/>
+          <w:bottom w:val="single" w:sz="7" w:space="7" w:color="087A63"/>
+          <w:right w:val="single" w:sz="7" w:space="7" w:color="087A63"/>
+        </w:pBdr>
+      </w:pPr>
+      <w:r>
+        <w:rPr>
+          <w:rFonts w:ascii="Microsoft YaHei" w:hAnsi="Microsoft YaHei" w:eastAsia="微软雅黑"/>
+          <w:b/>
+          <w:color w:val="006C56"/>
+          <w:sz w:val="20"/>
+        </w:rPr>
+        <w:t xml:space="preserve">用途　</w:t>
+      </w:r>
+      <w:r>
+        <w:rPr>
+          <w:rFonts w:ascii="Microsoft YaHei" w:hAnsi="Microsoft YaHei" w:eastAsia="微软雅黑"/>
+          <w:b w:val="0"/>
+          <w:color w:val="122737"/>
+          <w:sz w:val="20"/>
+        </w:rPr>
+        <w:t>完成现场取货，确认系统记录与实际领取一致。</w:t>
+      </w:r>
+    </w:p>
+    <w:p>
+      <w:pPr>
+        <w:keepNext/>
+        <w:spacing w:before="120" w:after="60"/>
+      </w:pPr>
+      <w:r>
+        <w:rPr>
+          <w:rFonts w:ascii="Microsoft YaHei" w:hAnsi="Microsoft YaHei" w:eastAsia="微软雅黑"/>
+          <w:b/>
+          <w:color w:val="006C56"/>
+          <w:sz w:val="21"/>
+        </w:rPr>
+        <w:t>操作步骤</w:t>
+      </w:r>
+    </w:p>
+    <w:p>
+      <w:pPr>
+        <w:numPr>
+          <w:ilvl w:val="0"/>
+          <w:numId w:val="19"/>
+        </w:numPr>
+      </w:pPr>
+      <w:r>
+        <w:rPr>
+          <w:rFonts w:ascii="Microsoft YaHei" w:hAnsi="Microsoft YaHei" w:eastAsia="微软雅黑"/>
+          <w:b w:val="0"/>
+          <w:color w:val="122737"/>
+          <w:sz w:val="21"/>
+        </w:rPr>
+        <w:t>取出预约物资后立即关好柜门。</w:t>
+      </w:r>
+    </w:p>
+    <w:p>
+      <w:pPr>
+        <w:numPr>
+          <w:ilvl w:val="0"/>
+          <w:numId w:val="19"/>
+        </w:numPr>
+      </w:pPr>
+      <w:r>
+        <w:rPr>
+          <w:rFonts w:ascii="Microsoft YaHei" w:hAnsi="Microsoft YaHei" w:eastAsia="微软雅黑"/>
+          <w:b w:val="0"/>
+          <w:color w:val="122737"/>
+          <w:sz w:val="21"/>
+        </w:rPr>
+        <w:t>等待页面完成“取货关门”和“领取核对”。</w:t>
+      </w:r>
+    </w:p>
+    <w:p>
+      <w:pPr>
+        <w:numPr>
+          <w:ilvl w:val="0"/>
+          <w:numId w:val="19"/>
+        </w:numPr>
+      </w:pPr>
+      <w:r>
+        <w:rPr>
+          <w:rFonts w:ascii="Microsoft YaHei" w:hAnsi="Microsoft YaHei" w:eastAsia="微软雅黑"/>
+          <w:b w:val="0"/>
+          <w:color w:val="122737"/>
+          <w:sz w:val="21"/>
+        </w:rPr>
+        <w:t>核对计划领取与平台实际结果。</w:t>
+      </w:r>
+    </w:p>
+    <w:p>
+      <w:pPr>
+        <w:numPr>
+          <w:ilvl w:val="0"/>
+          <w:numId w:val="19"/>
+        </w:numPr>
+      </w:pPr>
+      <w:r>
+        <w:rPr>
+          <w:rFonts w:ascii="Microsoft YaHei" w:hAnsi="Microsoft YaHei" w:eastAsia="微软雅黑"/>
+          <w:b w:val="0"/>
+          <w:color w:val="122737"/>
+          <w:sz w:val="21"/>
+        </w:rPr>
+        <w:t>选择“确认取货”返回首页。</w:t>
+      </w:r>
+    </w:p>
+    <w:p>
+      <w:pPr>
+        <w:numPr>
+          <w:ilvl w:val="0"/>
+          <w:numId w:val="19"/>
+        </w:numPr>
+      </w:pPr>
+      <w:r>
+        <w:rPr>
+          <w:rFonts w:ascii="Microsoft YaHei" w:hAnsi="Microsoft YaHei" w:eastAsia="微软雅黑"/>
+          <w:b w:val="0"/>
+          <w:color w:val="122737"/>
+          <w:sz w:val="21"/>
+        </w:rPr>
+        <w:t>在“记录”中查看本次领取。</w:t>
+      </w:r>
+    </w:p>
+    <w:p>
+      <w:pPr>
+        <w:spacing w:before="80" w:after="40"/>
+        <w:jc w:val="center"/>
+      </w:pPr>
+      <w:r>
+        <w:drawing>
+          <wp:inline xmlns:a="http://schemas.openxmlformats.org/drawingml/2006/main" xmlns:pic="http://schemas.openxmlformats.org/drawingml/2006/picture">
+            <wp:extent cx="2096018" cy="4536000"/>
+            <wp:docPr id="10" name="Picture 10" descr="图 10　预约取货完成" title="图 10　预约取货完成"/>
+            <wp:cNvGraphicFramePr>
+              <a:graphicFrameLocks noChangeAspect="1"/>
+            </wp:cNvGraphicFramePr>
+            <a:graphic>
+              <a:graphicData uri="http://schemas.openxmlformats.org/drawingml/2006/picture">
+                <pic:pic>
+                  <pic:nvPicPr>
+                    <pic:cNvPr id="0" name="pickup-complete.png"/>
+                    <pic:cNvPicPr/>
+                  </pic:nvPicPr>
+                  <pic:blipFill>
+                    <a:blip r:embed="rId20"/>
+                    <a:stretch>
+                      <a:fillRect/>
+                    </a:stretch>
+                  </pic:blipFill>
+                  <pic:spPr>
+                    <a:xfrm>
+                      <a:off x="0" y="0"/>
+                      <a:ext cx="2096018" cy="4536000"/>
+                    </a:xfrm>
+                    <a:prstGeom prst="rect"/>
+                  </pic:spPr>
+                </pic:pic>
+              </a:graphicData>
+            </a:graphic>
+          </wp:inline>
+        </w:drawing>
+      </w:r>
+    </w:p>
+    <w:p>
+      <w:pPr>
+        <w:pStyle w:val="FigureCaption"/>
+        <w:jc w:val="center"/>
+      </w:pPr>
+      <w:r>
+        <w:t>图 10　预约取货完成</w:t>
+      </w:r>
+    </w:p>
+    <w:p>
+      <w:pPr>
+        <w:spacing w:before="80" w:after="80"/>
+        <w:shd w:fill="EDF7F1"/>
+        <w:pBdr>
+          <w:top w:val="single" w:sz="7" w:space="7" w:color="087A63"/>
+          <w:left w:val="single" w:sz="7" w:space="7" w:color="087A63"/>
+          <w:bottom w:val="single" w:sz="7" w:space="7" w:color="087A63"/>
+          <w:right w:val="single" w:sz="7" w:space="7" w:color="087A63"/>
+        </w:pBdr>
+      </w:pPr>
+      <w:r>
+        <w:rPr>
+          <w:rFonts w:ascii="Microsoft YaHei" w:hAnsi="Microsoft YaHei" w:eastAsia="微软雅黑"/>
+          <w:b/>
+          <w:color w:val="006C56"/>
+          <w:sz w:val="20"/>
+        </w:rPr>
+        <w:t xml:space="preserve">完成标志　</w:t>
+      </w:r>
+      <w:r>
+        <w:rPr>
+          <w:rFonts w:ascii="Microsoft YaHei" w:hAnsi="Microsoft YaHei" w:eastAsia="微软雅黑"/>
+          <w:b w:val="0"/>
+          <w:color w:val="122737"/>
+          <w:sz w:val="20"/>
+        </w:rPr>
+        <w:t>页面显示“预约取货完成”，记录中出现同一柜机、物资和时间。</w:t>
+      </w:r>
+    </w:p>
+    <w:p>
+      <w:r>
+        <w:br w:type="page"/>
+      </w:r>
+    </w:p>
+    <w:p>
+      <w:pPr>
+        <w:pStyle w:val="Heading1"/>
+        <w:spacing w:after="160"/>
+      </w:pPr>
+      <w:bookmarkStart w:id="12" w:name="manual_section_11"/>
+      <w:r>
+        <w:rPr>
+          <w:rFonts w:ascii="Microsoft YaHei" w:hAnsi="Microsoft YaHei" w:eastAsia="微软雅黑"/>
+          <w:b/>
+          <w:color w:val="122737"/>
+          <w:sz w:val="32"/>
+        </w:rPr>
+        <w:t>遇到问题</w:t>
+      </w:r>
+      <w:bookmarkEnd w:id="12"/>
+    </w:p>
+    <w:p>
+      <w:r>
+        <w:rPr>
+          <w:rFonts w:ascii="Microsoft YaHei" w:hAnsi="Microsoft YaHei" w:eastAsia="微软雅黑"/>
+          <w:b w:val="0"/>
+          <w:color w:val="586C7C"/>
+          <w:sz w:val="21"/>
+        </w:rPr>
+        <w:t>只保留会阻塞当前操作的问题。先按对应处理方式核对，再继续原任务。</w:t>
+      </w:r>
+    </w:p>
     <w:tbl>
       <w:tblPr>
-        <w:tblW w:type="dxa" w:w="9360"/>
-        <w:jc w:val="left"/>
+        <w:tblW w:type="dxa" w:w="10028"/>
         <w:tblLayout w:type="fixed"/>
         <w:tblLook w:firstColumn="1" w:firstRow="1" w:lastColumn="0" w:lastRow="0" w:noHBand="0" w:noVBand="1" w:val="04A0"/>
+        <w:jc w:val="left"/>
         <w:tblInd w:w="120" w:type="dxa"/>
-        <w:tblBorders>
-          <w:top w:val="single" w:sz="4" w:space="0" w:color="D6DEE6"/>
-          <w:left w:val="single" w:sz="4" w:space="0" w:color="D6DEE6"/>
-          <w:bottom w:val="single" w:sz="4" w:space="0" w:color="D6DEE6"/>
-          <w:right w:val="single" w:sz="4" w:space="0" w:color="D6DEE6"/>
-          <w:insideH w:val="single" w:sz="4" w:space="0" w:color="D6DEE6"/>
-          <w:insideV w:val="single" w:sz="4" w:space="0" w:color="D6DEE6"/>
-        </w:tblBorders>
       </w:tblPr>
       <w:tblGrid>
-        <w:gridCol w:w="2700"/>
-        <w:gridCol w:w="6660"/>
+        <w:gridCol w:w="2950"/>
+        <w:gridCol w:w="7078"/>
       </w:tblGrid>
       <w:tr>
         <w:trPr>
-          <w:tblHeader/>
+          <w:tblHeader w:val="true"/>
         </w:trPr>
         <w:tc>
           <w:tcPr>
-            <w:tcW w:type="dxa" w:w="2700"/>
+            <w:tcW w:type="dxa" w:w="2950"/>
             <w:tcMar>
               <w:top w:w="80" w:type="dxa"/>
               <w:bottom w:w="80" w:type="dxa"/>
               <w:start w:w="120" w:type="dxa"/>
               <w:end w:w="120" w:type="dxa"/>
             </w:tcMar>
-            <w:vAlign w:val="top"/>
-            <w:shd w:fill="E8EEF5"/>
+            <w:shd w:fill="075C4D"/>
+            <w:tcBorders>
+              <w:top w:val="single" w:sz="8" w:color="075C4D"/>
+              <w:left w:val="single" w:sz="8" w:color="075C4D"/>
+              <w:bottom w:val="single" w:sz="8" w:color="075C4D"/>
+              <w:right w:val="single" w:sz="8" w:color="075C4D"/>
+            </w:tcBorders>
           </w:tcPr>
           <w:p>
-            <w:pPr>
-              <w:spacing w:after="0"/>
-            </w:pPr>
             <w:r>
               <w:rPr>
-                <w:rFonts w:ascii="Calibri" w:hAnsi="Calibri" w:eastAsia="Microsoft YaHei"/>
+                <w:rFonts w:ascii="Microsoft YaHei" w:hAnsi="Microsoft YaHei" w:eastAsia="微软雅黑"/>
                 <w:b/>
-                <w:color w:val="1F4D78"/>
-                <w:sz w:val="21"/>
+                <w:color w:val="FFFFFF"/>
+                <w:sz w:val="20"/>
               </w:rPr>
-              <w:t>使用入口</w:t>
+              <w:t>现象</w:t>
             </w:r>
           </w:p>
         </w:tc>
         <w:tc>
           <w:tcPr>
-            <w:tcW w:type="dxa" w:w="6660"/>
+            <w:tcW w:type="dxa" w:w="7078"/>
             <w:tcMar>
               <w:top w:w="80" w:type="dxa"/>
               <w:bottom w:w="80" w:type="dxa"/>
               <w:start w:w="120" w:type="dxa"/>
               <w:end w:w="120" w:type="dxa"/>
             </w:tcMar>
-            <w:vAlign w:val="top"/>
+            <w:shd w:fill="075C4D"/>
+            <w:tcBorders>
+              <w:top w:val="single" w:sz="8" w:color="075C4D"/>
+              <w:left w:val="single" w:sz="8" w:color="075C4D"/>
+              <w:bottom w:val="single" w:sz="8" w:color="075C4D"/>
+              <w:right w:val="single" w:sz="8" w:color="075C4D"/>
+            </w:tcBorders>
           </w:tcPr>
           <w:p>
-            <w:pPr>
-              <w:spacing w:after="0" w:line="288" w:lineRule="auto"/>
-            </w:pPr>
             <w:r>
               <w:rPr>
-                <w:rFonts w:ascii="Calibri" w:hAnsi="Calibri" w:eastAsia="Microsoft YaHei"/>
-                <w:color w:val="0B2545"/>
-                <w:sz w:val="21"/>
+                <w:rFonts w:ascii="Microsoft YaHei" w:hAnsi="Microsoft YaHei" w:eastAsia="微软雅黑"/>
+                <w:b/>
+                <w:color w:val="FFFFFF"/>
+                <w:sz w:val="20"/>
               </w:rPr>
-              <w:t>移动端：https://vending.5gogogo.top/mobile/</w:t>
+              <w:t>处理方式</w:t>
             </w:r>
           </w:p>
         </w:tc>
@@ -198,54 +2582,67 @@
       <w:tr>
         <w:tc>
           <w:tcPr>
-            <w:tcW w:type="dxa" w:w="2700"/>
+            <w:tcW w:type="dxa" w:w="2950"/>
             <w:tcMar>
               <w:top w:w="80" w:type="dxa"/>
               <w:bottom w:w="80" w:type="dxa"/>
               <w:start w:w="120" w:type="dxa"/>
               <w:end w:w="120" w:type="dxa"/>
             </w:tcMar>
+            <w:shd w:fill="FFF7EA"/>
+            <w:tcBorders>
+              <w:top w:val="single" w:sz="6" w:color="D7E6DF"/>
+              <w:left w:val="single" w:sz="6" w:color="D7E6DF"/>
+              <w:bottom w:val="single" w:sz="6" w:color="D7E6DF"/>
+              <w:right w:val="single" w:sz="6" w:color="D7E6DF"/>
+            </w:tcBorders>
             <w:vAlign w:val="top"/>
-            <w:shd w:fill="E8EEF5"/>
           </w:tcPr>
           <w:p>
             <w:pPr>
-              <w:spacing w:after="0"/>
+              <w:spacing w:before="60" w:after="60"/>
             </w:pPr>
             <w:r>
               <w:rPr>
-                <w:rFonts w:ascii="Calibri" w:hAnsi="Calibri" w:eastAsia="Microsoft YaHei"/>
+                <w:rFonts w:ascii="Microsoft YaHei" w:hAnsi="Microsoft YaHei" w:eastAsia="微软雅黑"/>
                 <w:b/>
-                <w:color w:val="1F4D78"/>
-                <w:sz w:val="21"/>
+                <w:color w:val="122737"/>
+                <w:sz w:val="19"/>
               </w:rPr>
-              <w:t>登录方式</w:t>
+              <w:t>登记后仍不能登录</w:t>
             </w:r>
           </w:p>
         </w:tc>
         <w:tc>
           <w:tcPr>
-            <w:tcW w:type="dxa" w:w="6660"/>
+            <w:tcW w:type="dxa" w:w="7078"/>
             <w:tcMar>
               <w:top w:w="80" w:type="dxa"/>
               <w:bottom w:w="80" w:type="dxa"/>
               <w:start w:w="120" w:type="dxa"/>
               <w:end w:w="120" w:type="dxa"/>
             </w:tcMar>
+            <w:shd w:fill="FFF7EA"/>
+            <w:tcBorders>
+              <w:top w:val="single" w:sz="6" w:color="D7E6DF"/>
+              <w:left w:val="single" w:sz="6" w:color="D7E6DF"/>
+              <w:bottom w:val="single" w:sz="6" w:color="D7E6DF"/>
+              <w:right w:val="single" w:sz="6" w:color="D7E6DF"/>
+            </w:tcBorders>
             <w:vAlign w:val="top"/>
-            <w:shd w:fill="FAFBFC"/>
           </w:tcPr>
           <w:p>
             <w:pPr>
-              <w:spacing w:after="0" w:line="288" w:lineRule="auto"/>
+              <w:spacing w:before="60" w:after="60"/>
             </w:pPr>
             <w:r>
               <w:rPr>
-                <w:rFonts w:ascii="Calibri" w:hAnsi="Calibri" w:eastAsia="Microsoft YaHei"/>
-                <w:color w:val="0B2545"/>
-                <w:sz w:val="21"/>
+                <w:rFonts w:ascii="Microsoft YaHei" w:hAnsi="Microsoft YaHei" w:eastAsia="微软雅黑"/>
+                <w:b w:val="0"/>
+                <w:color w:val="122737"/>
+                <w:sz w:val="19"/>
               </w:rPr>
-              <w:t>本人手机号和实例管理员私下交付的 6 位一次性验证码。</w:t>
+              <w:t>申请可能仍在审核中；资料被驳回时按页面原因修改后重新提交。</w:t>
             </w:r>
           </w:p>
         </w:tc>
@@ -253,53 +2650,67 @@
       <w:tr>
         <w:tc>
           <w:tcPr>
-            <w:tcW w:type="dxa" w:w="2700"/>
+            <w:tcW w:type="dxa" w:w="2950"/>
             <w:tcMar>
               <w:top w:w="80" w:type="dxa"/>
               <w:bottom w:w="80" w:type="dxa"/>
               <w:start w:w="120" w:type="dxa"/>
               <w:end w:w="120" w:type="dxa"/>
             </w:tcMar>
+            <w:shd w:fill="FFFFFF"/>
+            <w:tcBorders>
+              <w:top w:val="single" w:sz="6" w:color="D7E6DF"/>
+              <w:left w:val="single" w:sz="6" w:color="D7E6DF"/>
+              <w:bottom w:val="single" w:sz="6" w:color="D7E6DF"/>
+              <w:right w:val="single" w:sz="6" w:color="D7E6DF"/>
+            </w:tcBorders>
             <w:vAlign w:val="top"/>
-            <w:shd w:fill="E8EEF5"/>
           </w:tcPr>
           <w:p>
             <w:pPr>
-              <w:spacing w:after="0"/>
+              <w:spacing w:before="60" w:after="60"/>
             </w:pPr>
             <w:r>
               <w:rPr>
-                <w:rFonts w:ascii="Calibri" w:hAnsi="Calibri" w:eastAsia="Microsoft YaHei"/>
+                <w:rFonts w:ascii="Microsoft YaHei" w:hAnsi="Microsoft YaHei" w:eastAsia="微软雅黑"/>
                 <w:b/>
-                <w:color w:val="1F4D78"/>
-                <w:sz w:val="21"/>
+                <w:color w:val="122737"/>
+                <w:sz w:val="19"/>
               </w:rPr>
-              <w:t>主要流程</w:t>
+              <w:t>收不到短信验证码</w:t>
             </w:r>
           </w:p>
         </w:tc>
         <w:tc>
           <w:tcPr>
-            <w:tcW w:type="dxa" w:w="6660"/>
+            <w:tcW w:type="dxa" w:w="7078"/>
             <w:tcMar>
               <w:top w:w="80" w:type="dxa"/>
               <w:bottom w:w="80" w:type="dxa"/>
               <w:start w:w="120" w:type="dxa"/>
               <w:end w:w="120" w:type="dxa"/>
             </w:tcMar>
+            <w:shd w:fill="FFFFFF"/>
+            <w:tcBorders>
+              <w:top w:val="single" w:sz="6" w:color="D7E6DF"/>
+              <w:left w:val="single" w:sz="6" w:color="D7E6DF"/>
+              <w:bottom w:val="single" w:sz="6" w:color="D7E6DF"/>
+              <w:right w:val="single" w:sz="6" w:color="D7E6DF"/>
+            </w:tcBorders>
             <w:vAlign w:val="top"/>
           </w:tcPr>
           <w:p>
             <w:pPr>
-              <w:spacing w:after="0" w:line="288" w:lineRule="auto"/>
+              <w:spacing w:before="60" w:after="60"/>
             </w:pPr>
             <w:r>
               <w:rPr>
-                <w:rFonts w:ascii="Calibri" w:hAnsi="Calibri" w:eastAsia="Microsoft YaHei"/>
-                <w:color w:val="0B2545"/>
-                <w:sz w:val="21"/>
+                <w:rFonts w:ascii="Microsoft YaHei" w:hAnsi="Microsoft YaHei" w:eastAsia="微软雅黑"/>
+                <w:b w:val="0"/>
+                <w:color w:val="122737"/>
+                <w:sz w:val="19"/>
               </w:rPr>
-              <w:t>登录 → 选择柜机和物资 → 提交预约 → 到柜领取 → 等待结果。</w:t>
+              <w:t>核对手机号和网络，等待倒计时结束后再获取一次；急需登录时可联系工作人员取得一次性人工码。</w:t>
             </w:r>
           </w:p>
         </w:tc>
@@ -307,274 +2718,67 @@
       <w:tr>
         <w:tc>
           <w:tcPr>
-            <w:tcW w:type="dxa" w:w="2700"/>
+            <w:tcW w:type="dxa" w:w="2950"/>
             <w:tcMar>
               <w:top w:w="80" w:type="dxa"/>
               <w:bottom w:w="80" w:type="dxa"/>
               <w:start w:w="120" w:type="dxa"/>
               <w:end w:w="120" w:type="dxa"/>
             </w:tcMar>
+            <w:shd w:fill="FFF7EA"/>
+            <w:tcBorders>
+              <w:top w:val="single" w:sz="6" w:color="D7E6DF"/>
+              <w:left w:val="single" w:sz="6" w:color="D7E6DF"/>
+              <w:bottom w:val="single" w:sz="6" w:color="D7E6DF"/>
+              <w:right w:val="single" w:sz="6" w:color="D7E6DF"/>
+            </w:tcBorders>
             <w:vAlign w:val="top"/>
-            <w:shd w:fill="E8EEF5"/>
           </w:tcPr>
           <w:p>
             <w:pPr>
-              <w:spacing w:after="0"/>
+              <w:spacing w:before="60" w:after="60"/>
             </w:pPr>
             <w:r>
               <w:rPr>
-                <w:rFonts w:ascii="Calibri" w:hAnsi="Calibri" w:eastAsia="Microsoft YaHei"/>
+                <w:rFonts w:ascii="Microsoft YaHei" w:hAnsi="Microsoft YaHei" w:eastAsia="微软雅黑"/>
                 <w:b/>
-                <w:color w:val="1F4D78"/>
-                <w:sz w:val="21"/>
+                <w:color w:val="122737"/>
+                <w:sz w:val="19"/>
               </w:rPr>
-              <w:t>付款</w:t>
+              <w:t>提示没有资格</w:t>
             </w:r>
           </w:p>
         </w:tc>
         <w:tc>
           <w:tcPr>
-            <w:tcW w:type="dxa" w:w="6660"/>
+            <w:tcW w:type="dxa" w:w="7078"/>
             <w:tcMar>
               <w:top w:w="80" w:type="dxa"/>
               <w:bottom w:w="80" w:type="dxa"/>
               <w:start w:w="120" w:type="dxa"/>
               <w:end w:w="120" w:type="dxa"/>
             </w:tcMar>
-            <w:vAlign w:val="top"/>
-            <w:shd w:fill="FAFBFC"/>
-          </w:tcPr>
-          <w:p>
-            <w:pPr>
-              <w:spacing w:after="0" w:line="288" w:lineRule="auto"/>
-            </w:pPr>
-            <w:r>
-              <w:rPr>
-                <w:rFonts w:ascii="Calibri" w:hAnsi="Calibri" w:eastAsia="Microsoft YaHei"/>
-                <w:color w:val="0B2545"/>
-                <w:sz w:val="21"/>
-              </w:rPr>
-              <w:t>当前预约取货流程不要求付款。</w:t>
-            </w:r>
-          </w:p>
-        </w:tc>
-      </w:tr>
-    </w:tbl>
-    <w:p>
-      <w:pPr>
-        <w:spacing w:after="0"/>
-      </w:pPr>
-    </w:p>
-    <w:p>
-      <w:pPr>
-        <w:pStyle w:val="Heading1"/>
-      </w:pPr>
-      <w:r>
-        <w:t>第一次使用</w:t>
-      </w:r>
-    </w:p>
-    <w:p>
-      <w:pPr>
-        <w:spacing w:before="0" w:after="80" w:line="300" w:lineRule="auto"/>
-        <w:numPr>
-          <w:ilvl w:val="0"/>
-          <w:numId w:val="10"/>
-        </w:numPr>
-      </w:pPr>
-      <w:r>
-        <w:rPr>
-          <w:rFonts w:ascii="Calibri" w:hAnsi="Calibri" w:eastAsia="Microsoft YaHei"/>
-          <w:color w:val="0B2545"/>
-          <w:sz w:val="22"/>
-        </w:rPr>
-        <w:t>首次使用前，请联系当前实例管理员完成资料建档、审核和启用。</w:t>
-      </w:r>
-    </w:p>
-    <w:p>
-      <w:pPr>
-        <w:spacing w:before="0" w:after="80" w:line="300" w:lineRule="auto"/>
-        <w:numPr>
-          <w:ilvl w:val="0"/>
-          <w:numId w:val="10"/>
-        </w:numPr>
-      </w:pPr>
-      <w:r>
-        <w:rPr>
-          <w:rFonts w:ascii="Calibri" w:hAnsi="Calibri" w:eastAsia="Microsoft YaHei"/>
-          <w:color w:val="0B2545"/>
-          <w:sz w:val="22"/>
-        </w:rPr>
-        <w:t>打开移动端，输入本人手机号。</w:t>
-      </w:r>
-    </w:p>
-    <w:p>
-      <w:pPr>
-        <w:spacing w:before="0" w:after="80" w:line="300" w:lineRule="auto"/>
-        <w:numPr>
-          <w:ilvl w:val="0"/>
-          <w:numId w:val="10"/>
-        </w:numPr>
-      </w:pPr>
-      <w:r>
-        <w:rPr>
-          <w:rFonts w:ascii="Calibri" w:hAnsi="Calibri" w:eastAsia="Microsoft YaHei"/>
-          <w:color w:val="0B2545"/>
-          <w:sz w:val="22"/>
-        </w:rPr>
-        <w:t>输入实例管理员私下交付的 6 位一次性验证码。</w:t>
-      </w:r>
-    </w:p>
-    <w:p>
-      <w:pPr>
-        <w:spacing w:before="0" w:after="80" w:line="300" w:lineRule="auto"/>
-        <w:numPr>
-          <w:ilvl w:val="0"/>
-          <w:numId w:val="10"/>
-        </w:numPr>
-      </w:pPr>
-      <w:r>
-        <w:rPr>
-          <w:rFonts w:ascii="Calibri" w:hAnsi="Calibri" w:eastAsia="Microsoft YaHei"/>
-          <w:color w:val="0B2545"/>
-          <w:sz w:val="22"/>
-        </w:rPr>
-        <w:t>阅读页面提示并勾选免责声明，然后选择登录。</w:t>
-      </w:r>
-    </w:p>
-    <w:p>
-      <w:pPr>
-        <w:spacing w:before="0" w:after="80" w:line="300" w:lineRule="auto"/>
-        <w:numPr>
-          <w:ilvl w:val="0"/>
-          <w:numId w:val="10"/>
-        </w:numPr>
-      </w:pPr>
-      <w:r>
-        <w:t>验证码使用一次后立即失效；过期、被撤销或输错达到上限时，请联系实例管理员重新签发。</w:t>
-      </w:r>
-    </w:p>
-    <w:tbl>
-      <w:tblPr>
-        <w:tblW w:type="dxa" w:w="9360"/>
-        <w:jc w:val="left"/>
-        <w:tblLayout w:type="fixed"/>
-        <w:tblLook w:firstColumn="1" w:firstRow="1" w:lastColumn="0" w:lastRow="0" w:noHBand="0" w:noVBand="1" w:val="04A0"/>
-        <w:tblInd w:w="120" w:type="dxa"/>
-        <w:tblBorders>
-          <w:top w:val="single" w:sz="4" w:space="0" w:color="E4E9EE"/>
-          <w:left w:val="single" w:sz="4" w:space="0" w:color="E4E9EE"/>
-          <w:bottom w:val="single" w:sz="4" w:space="0" w:color="E4E9EE"/>
-          <w:right w:val="single" w:sz="4" w:space="0" w:color="E4E9EE"/>
-          <w:insideH w:val="single" w:sz="4" w:space="0" w:color="E4E9EE"/>
-          <w:insideV w:val="single" w:sz="4" w:space="0" w:color="E4E9EE"/>
-        </w:tblBorders>
-      </w:tblPr>
-      <w:tblGrid>
-        <w:gridCol w:w="4680"/>
-        <w:gridCol w:w="4680"/>
-      </w:tblGrid>
-      <w:tr>
-        <w:tc>
-          <w:tcPr>
-            <w:tcW w:type="dxa" w:w="4680"/>
-            <w:tcMar>
-              <w:top w:w="80" w:type="dxa"/>
-              <w:bottom w:w="80" w:type="dxa"/>
-              <w:start w:w="120" w:type="dxa"/>
-              <w:end w:w="120" w:type="dxa"/>
-            </w:tcMar>
+            <w:shd w:fill="FFF7EA"/>
+            <w:tcBorders>
+              <w:top w:val="single" w:sz="6" w:color="D7E6DF"/>
+              <w:left w:val="single" w:sz="6" w:color="D7E6DF"/>
+              <w:bottom w:val="single" w:sz="6" w:color="D7E6DF"/>
+              <w:right w:val="single" w:sz="6" w:color="D7E6DF"/>
+            </w:tcBorders>
             <w:vAlign w:val="top"/>
           </w:tcPr>
           <w:p>
             <w:pPr>
-              <w:spacing w:after="40"/>
-              <w:jc w:val="center"/>
+              <w:spacing w:before="60" w:after="60"/>
             </w:pPr>
             <w:r>
-              <w:drawing>
-                <wp:inline xmlns:a="http://schemas.openxmlformats.org/drawingml/2006/main" xmlns:pic="http://schemas.openxmlformats.org/drawingml/2006/picture">
-                  <wp:extent cx="1920240" cy="4155596"/>
-                  <wp:docPr id="1" name="身份识别页" title="身份识别页" descr="移动端身份识别页，提示用户输入本人手机号。"/>
-                  <wp:cNvGraphicFramePr>
-                    <a:graphicFrameLocks noChangeAspect="1"/>
-                  </wp:cNvGraphicFramePr>
-                  <a:graphic>
-                    <a:graphicData uri="http://schemas.openxmlformats.org/drawingml/2006/picture">
-                      <pic:pic>
-                        <pic:nvPicPr>
-                          <pic:cNvPr id="0" name="app-public-login-390x844-20260729.png"/>
-                          <pic:cNvPicPr/>
-                        </pic:nvPicPr>
-                        <pic:blipFill>
-                          <a:blip r:embed="rId11"/>
-                          <a:stretch>
-                            <a:fillRect/>
-                          </a:stretch>
-                        </pic:blipFill>
-                        <pic:spPr>
-                          <a:xfrm>
-                            <a:off x="0" y="0"/>
-                            <a:ext cx="1920240" cy="4155596"/>
-                          </a:xfrm>
-                          <a:prstGeom prst="rect"/>
-                        </pic:spPr>
-                      </pic:pic>
-                    </a:graphicData>
-                  </a:graphic>
-                </wp:inline>
-              </w:drawing>
-            </w:r>
-          </w:p>
-        </w:tc>
-        <w:tc>
-          <w:tcPr>
-            <w:tcW w:type="dxa" w:w="4680"/>
-            <w:tcMar>
-              <w:top w:w="80" w:type="dxa"/>
-              <w:bottom w:w="80" w:type="dxa"/>
-              <w:start w:w="120" w:type="dxa"/>
-              <w:end w:w="120" w:type="dxa"/>
-            </w:tcMar>
-            <w:vAlign w:val="top"/>
-          </w:tcPr>
-          <w:p>
-            <w:pPr>
-              <w:spacing w:after="40"/>
-              <w:jc w:val="center"/>
-            </w:pPr>
-            <w:r>
-              <w:drawing>
-                <wp:inline xmlns:a="http://schemas.openxmlformats.org/drawingml/2006/main" xmlns:pic="http://schemas.openxmlformats.org/drawingml/2006/picture">
-                  <wp:extent cx="1920240" cy="4155596"/>
-                  <wp:docPr id="2" name="一次性验证码登录页" title="一次性验证码登录页" descr="移动端一次性验证码登录页，提示用户输入 6 位验证码。"/>
-                  <wp:cNvGraphicFramePr>
-                    <a:graphicFrameLocks noChangeAspect="1"/>
-                  </wp:cNvGraphicFramePr>
-                  <a:graphic>
-                    <a:graphicData uri="http://schemas.openxmlformats.org/drawingml/2006/picture">
-                      <pic:pic>
-                        <pic:nvPicPr>
-                          <pic:cNvPr id="0" name="app-public-manual-login-390x844-20260729.png"/>
-                          <pic:cNvPicPr/>
-                        </pic:nvPicPr>
-                        <pic:blipFill>
-                          <a:blip r:embed="rId12"/>
-                          <a:stretch>
-                            <a:fillRect/>
-                          </a:stretch>
-                        </pic:blipFill>
-                        <pic:spPr>
-                          <a:xfrm>
-                            <a:off x="0" y="0"/>
-                            <a:ext cx="1920240" cy="4155596"/>
-                          </a:xfrm>
-                          <a:prstGeom prst="rect"/>
-                        </pic:spPr>
-                      </pic:pic>
-                    </a:graphicData>
-                  </a:graphic>
-                </wp:inline>
-              </w:drawing>
+              <w:rPr>
+                <w:rFonts w:ascii="Microsoft YaHei" w:hAnsi="Microsoft YaHei" w:eastAsia="微软雅黑"/>
+                <w:b w:val="0"/>
+                <w:color w:val="122737"/>
+                <w:sz w:val="19"/>
+              </w:rPr>
+              <w:t>核对今日时段、剩余次数和资料状态。</w:t>
             </w:r>
           </w:p>
         </w:tc>
@@ -582,380 +2786,67 @@
       <w:tr>
         <w:tc>
           <w:tcPr>
-            <w:tcW w:type="dxa" w:w="4680"/>
+            <w:tcW w:type="dxa" w:w="2950"/>
             <w:tcMar>
               <w:top w:w="80" w:type="dxa"/>
               <w:bottom w:w="80" w:type="dxa"/>
               <w:start w:w="120" w:type="dxa"/>
               <w:end w:w="120" w:type="dxa"/>
             </w:tcMar>
+            <w:shd w:fill="FFFFFF"/>
+            <w:tcBorders>
+              <w:top w:val="single" w:sz="6" w:color="D7E6DF"/>
+              <w:left w:val="single" w:sz="6" w:color="D7E6DF"/>
+              <w:bottom w:val="single" w:sz="6" w:color="D7E6DF"/>
+              <w:right w:val="single" w:sz="6" w:color="D7E6DF"/>
+            </w:tcBorders>
             <w:vAlign w:val="top"/>
           </w:tcPr>
           <w:p>
             <w:pPr>
-              <w:spacing w:after="0"/>
-              <w:jc w:val="center"/>
+              <w:spacing w:before="60" w:after="60"/>
             </w:pPr>
             <w:r>
               <w:rPr>
-                <w:rFonts w:ascii="Calibri" w:hAnsi="Calibri" w:eastAsia="Microsoft YaHei"/>
-                <w:color w:val="5B6C7E"/>
-                <w:sz w:val="18"/>
+                <w:rFonts w:ascii="Microsoft YaHei" w:hAnsi="Microsoft YaHei" w:eastAsia="微软雅黑"/>
+                <w:b/>
+                <w:color w:val="122737"/>
+                <w:sz w:val="19"/>
               </w:rPr>
-              <w:t>身份识别页</w:t>
+              <w:t>预约过期</w:t>
             </w:r>
           </w:p>
         </w:tc>
         <w:tc>
           <w:tcPr>
-            <w:tcW w:type="dxa" w:w="4680"/>
+            <w:tcW w:type="dxa" w:w="7078"/>
             <w:tcMar>
               <w:top w:w="80" w:type="dxa"/>
               <w:bottom w:w="80" w:type="dxa"/>
               <w:start w:w="120" w:type="dxa"/>
               <w:end w:w="120" w:type="dxa"/>
             </w:tcMar>
+            <w:shd w:fill="FFFFFF"/>
+            <w:tcBorders>
+              <w:top w:val="single" w:sz="6" w:color="D7E6DF"/>
+              <w:left w:val="single" w:sz="6" w:color="D7E6DF"/>
+              <w:bottom w:val="single" w:sz="6" w:color="D7E6DF"/>
+              <w:right w:val="single" w:sz="6" w:color="D7E6DF"/>
+            </w:tcBorders>
             <w:vAlign w:val="top"/>
           </w:tcPr>
           <w:p>
             <w:pPr>
-              <w:spacing w:after="0"/>
-              <w:jc w:val="center"/>
+              <w:spacing w:before="60" w:after="60"/>
             </w:pPr>
             <w:r>
               <w:rPr>
-                <w:rFonts w:ascii="Calibri" w:hAnsi="Calibri" w:eastAsia="Microsoft YaHei"/>
-                <w:color w:val="5B6C7E"/>
-                <w:sz w:val="18"/>
+                <w:rFonts w:ascii="Microsoft YaHei" w:hAnsi="Microsoft YaHei" w:eastAsia="微软雅黑"/>
+                <w:b w:val="0"/>
+                <w:color w:val="122737"/>
+                <w:sz w:val="19"/>
               </w:rPr>
-              <w:t>一次性验证码登录页</w:t>
-            </w:r>
-          </w:p>
-        </w:tc>
-      </w:tr>
-    </w:tbl>
-    <w:p>
-      <w:pPr>
-        <w:spacing w:after="0"/>
-      </w:pPr>
-    </w:p>
-    <w:tbl>
-      <w:tblPr>
-        <w:tblW w:type="dxa" w:w="9360"/>
-        <w:jc w:val="left"/>
-        <w:tblLayout w:type="fixed"/>
-        <w:tblLook w:firstColumn="1" w:firstRow="1" w:lastColumn="0" w:lastRow="0" w:noHBand="0" w:noVBand="1" w:val="04A0"/>
-        <w:tblInd w:w="120" w:type="dxa"/>
-        <w:tblBorders>
-          <w:top w:val="single" w:sz="4" w:space="0" w:color="B8D7C8"/>
-          <w:left w:val="single" w:sz="4" w:space="0" w:color="B8D7C8"/>
-          <w:bottom w:val="single" w:sz="4" w:space="0" w:color="B8D7C8"/>
-          <w:right w:val="single" w:sz="4" w:space="0" w:color="B8D7C8"/>
-          <w:insideH w:val="single" w:sz="4" w:space="0" w:color="B8D7C8"/>
-          <w:insideV w:val="single" w:sz="4" w:space="0" w:color="B8D7C8"/>
-        </w:tblBorders>
-      </w:tblPr>
-      <w:tblGrid>
-        <w:gridCol w:w="9360"/>
-      </w:tblGrid>
-      <w:tr>
-        <w:tc>
-          <w:tcPr>
-            <w:tcW w:type="dxa" w:w="9360"/>
-            <w:tcMar>
-              <w:top w:w="80" w:type="dxa"/>
-              <w:bottom w:w="80" w:type="dxa"/>
-              <w:start w:w="120" w:type="dxa"/>
-              <w:end w:w="120" w:type="dxa"/>
-            </w:tcMar>
-            <w:vAlign w:val="top"/>
-            <w:shd w:fill="E8F5EE"/>
-          </w:tcPr>
-          <w:p>
-            <w:pPr>
-              <w:spacing w:before="40" w:after="40" w:line="300" w:lineRule="auto"/>
-            </w:pPr>
-            <w:r>
-              <w:rPr>
-                <w:rFonts w:ascii="Calibri" w:hAnsi="Calibri" w:eastAsia="Microsoft YaHei"/>
-                <w:b/>
-                <w:color w:val="0F766E"/>
-                <w:sz w:val="21"/>
-              </w:rPr>
-              <w:t>人工验证码不会发送短信，也不会自动创建账号。不能登录时先确认本人已经建档并启用。</w:t>
-            </w:r>
-          </w:p>
-        </w:tc>
-      </w:tr>
-    </w:tbl>
-    <w:p>
-      <w:pPr>
-        <w:spacing w:after="0"/>
-      </w:pPr>
-    </w:p>
-    <w:p>
-      <w:pPr>
-        <w:pStyle w:val="Heading1"/>
-      </w:pPr>
-      <w:r>
-        <w:t>预约物资</w:t>
-      </w:r>
-    </w:p>
-    <w:p>
-      <w:pPr>
-        <w:spacing w:before="0" w:after="80" w:line="300" w:lineRule="auto"/>
-        <w:numPr>
-          <w:ilvl w:val="0"/>
-          <w:numId w:val="11"/>
-        </w:numPr>
-      </w:pPr>
-      <w:r>
-        <w:rPr>
-          <w:rFonts w:ascii="Calibri" w:hAnsi="Calibri" w:eastAsia="Microsoft YaHei"/>
-          <w:color w:val="0B2545"/>
-          <w:sz w:val="22"/>
-        </w:rPr>
-        <w:t>在首页查看当天是否开放领取。</w:t>
-      </w:r>
-    </w:p>
-    <w:p>
-      <w:pPr>
-        <w:spacing w:before="0" w:after="80" w:line="300" w:lineRule="auto"/>
-        <w:numPr>
-          <w:ilvl w:val="0"/>
-          <w:numId w:val="11"/>
-        </w:numPr>
-      </w:pPr>
-      <w:r>
-        <w:rPr>
-          <w:rFonts w:ascii="Calibri" w:hAnsi="Calibri" w:eastAsia="Microsoft YaHei"/>
-          <w:color w:val="0B2545"/>
-          <w:sz w:val="22"/>
-        </w:rPr>
-        <w:t>选择在线柜机和可预约物资。</w:t>
-      </w:r>
-    </w:p>
-    <w:p>
-      <w:pPr>
-        <w:spacing w:before="0" w:after="80" w:line="300" w:lineRule="auto"/>
-        <w:numPr>
-          <w:ilvl w:val="0"/>
-          <w:numId w:val="11"/>
-        </w:numPr>
-      </w:pPr>
-      <w:r>
-        <w:rPr>
-          <w:rFonts w:ascii="Calibri" w:hAnsi="Calibri" w:eastAsia="Microsoft YaHei"/>
-          <w:color w:val="0B2545"/>
-          <w:sz w:val="22"/>
-        </w:rPr>
-        <w:t>选择数量，核对柜机、物资和预约保留时间。</w:t>
-      </w:r>
-    </w:p>
-    <w:p>
-      <w:pPr>
-        <w:spacing w:before="0" w:after="80" w:line="300" w:lineRule="auto"/>
-        <w:numPr>
-          <w:ilvl w:val="0"/>
-          <w:numId w:val="11"/>
-        </w:numPr>
-      </w:pPr>
-      <w:r>
-        <w:rPr>
-          <w:rFonts w:ascii="Calibri" w:hAnsi="Calibri" w:eastAsia="Microsoft YaHei"/>
-          <w:color w:val="0B2545"/>
-          <w:sz w:val="22"/>
-        </w:rPr>
-        <w:t>提交预约，并在“当前预约”确认状态。</w:t>
-      </w:r>
-    </w:p>
-    <w:p>
-      <w:pPr>
-        <w:spacing w:before="0" w:after="80" w:line="300" w:lineRule="auto"/>
-        <w:numPr>
-          <w:ilvl w:val="0"/>
-          <w:numId w:val="11"/>
-        </w:numPr>
-      </w:pPr>
-      <w:r>
-        <w:rPr>
-          <w:rFonts w:ascii="Calibri" w:hAnsi="Calibri" w:eastAsia="Microsoft YaHei"/>
-          <w:color w:val="0B2545"/>
-          <w:sz w:val="22"/>
-        </w:rPr>
-        <w:t>没有在线柜机、没有可用库存或不在开放时段时，页面不会提供可提交的预约。</w:t>
-      </w:r>
-    </w:p>
-    <w:tbl>
-      <w:tblPr>
-        <w:tblW w:type="dxa" w:w="9360"/>
-        <w:jc w:val="left"/>
-        <w:tblLayout w:type="fixed"/>
-        <w:tblLook w:firstColumn="1" w:firstRow="1" w:lastColumn="0" w:lastRow="0" w:noHBand="0" w:noVBand="1" w:val="04A0"/>
-        <w:tblInd w:w="120" w:type="dxa"/>
-        <w:tblBorders>
-          <w:top w:val="single" w:sz="4" w:space="0" w:color="B8D7C8"/>
-          <w:left w:val="single" w:sz="4" w:space="0" w:color="B8D7C8"/>
-          <w:bottom w:val="single" w:sz="4" w:space="0" w:color="B8D7C8"/>
-          <w:right w:val="single" w:sz="4" w:space="0" w:color="B8D7C8"/>
-          <w:insideH w:val="single" w:sz="4" w:space="0" w:color="B8D7C8"/>
-          <w:insideV w:val="single" w:sz="4" w:space="0" w:color="B8D7C8"/>
-        </w:tblBorders>
-      </w:tblPr>
-      <w:tblGrid>
-        <w:gridCol w:w="9360"/>
-      </w:tblGrid>
-      <w:tr>
-        <w:tc>
-          <w:tcPr>
-            <w:tcW w:type="dxa" w:w="9360"/>
-            <w:tcMar>
-              <w:top w:w="80" w:type="dxa"/>
-              <w:bottom w:w="80" w:type="dxa"/>
-              <w:start w:w="120" w:type="dxa"/>
-              <w:end w:w="120" w:type="dxa"/>
-            </w:tcMar>
-            <w:vAlign w:val="top"/>
-            <w:shd w:fill="FFF7E6"/>
-          </w:tcPr>
-          <w:p>
-            <w:pPr>
-              <w:spacing w:before="40" w:after="40" w:line="300" w:lineRule="auto"/>
-            </w:pPr>
-            <w:r>
-              <w:t>预约取货不需要付款。如果页面出现付款要求，请先暂停操作并联系实例管理员。</w:t>
-            </w:r>
-          </w:p>
-        </w:tc>
-      </w:tr>
-    </w:tbl>
-    <w:p>
-      <w:pPr>
-        <w:spacing w:after="0"/>
-      </w:pPr>
-    </w:p>
-    <w:tbl>
-      <w:tblPr>
-        <w:tblW w:type="dxa" w:w="9360"/>
-        <w:jc w:val="left"/>
-        <w:tblLayout w:type="fixed"/>
-        <w:tblLook w:firstColumn="1" w:firstRow="1" w:lastColumn="0" w:lastRow="0" w:noHBand="0" w:noVBand="1" w:val="04A0"/>
-        <w:tblInd w:w="120" w:type="dxa"/>
-        <w:tblBorders>
-          <w:top w:val="single" w:sz="4" w:space="0" w:color="E4E9EE"/>
-          <w:left w:val="single" w:sz="4" w:space="0" w:color="E4E9EE"/>
-          <w:bottom w:val="single" w:sz="4" w:space="0" w:color="E4E9EE"/>
-          <w:right w:val="single" w:sz="4" w:space="0" w:color="E4E9EE"/>
-          <w:insideH w:val="single" w:sz="4" w:space="0" w:color="E4E9EE"/>
-          <w:insideV w:val="single" w:sz="4" w:space="0" w:color="E4E9EE"/>
-        </w:tblBorders>
-      </w:tblPr>
-      <w:tblGrid>
-        <w:gridCol w:w="4680"/>
-        <w:gridCol w:w="4680"/>
-      </w:tblGrid>
-      <w:tr>
-        <w:tc>
-          <w:tcPr>
-            <w:tcW w:type="dxa" w:w="4680"/>
-            <w:tcMar>
-              <w:top w:w="80" w:type="dxa"/>
-              <w:bottom w:w="80" w:type="dxa"/>
-              <w:start w:w="120" w:type="dxa"/>
-              <w:end w:w="120" w:type="dxa"/>
-            </w:tcMar>
-            <w:vAlign w:val="top"/>
-          </w:tcPr>
-          <w:p>
-            <w:pPr>
-              <w:spacing w:after="40"/>
-              <w:jc w:val="center"/>
-            </w:pPr>
-            <w:r>
-              <w:drawing>
-                <wp:inline xmlns:a="http://schemas.openxmlformats.org/drawingml/2006/main" xmlns:pic="http://schemas.openxmlformats.org/drawingml/2006/picture">
-                  <wp:extent cx="1920240" cy="4155596"/>
-                  <wp:docPr id="3" name="预约进行中示意" title="预约进行中示意" descr="移动端预约进行中的页面示意，显示柜机、物资和预约状态。"/>
-                  <wp:cNvGraphicFramePr>
-                    <a:graphicFrameLocks noChangeAspect="1"/>
-                  </wp:cNvGraphicFramePr>
-                  <a:graphic>
-                    <a:graphicData uri="http://schemas.openxmlformats.org/drawingml/2006/picture">
-                      <pic:pic>
-                        <pic:nvPicPr>
-                          <pic:cNvPr id="0" name="app-local-isolated-reservation-active-390x844-20260728.png"/>
-                          <pic:cNvPicPr/>
-                        </pic:nvPicPr>
-                        <pic:blipFill>
-                          <a:blip r:embed="rId13"/>
-                          <a:stretch>
-                            <a:fillRect/>
-                          </a:stretch>
-                        </pic:blipFill>
-                        <pic:spPr>
-                          <a:xfrm>
-                            <a:off x="0" y="0"/>
-                            <a:ext cx="1920240" cy="4155596"/>
-                          </a:xfrm>
-                          <a:prstGeom prst="rect"/>
-                        </pic:spPr>
-                      </pic:pic>
-                    </a:graphicData>
-                  </a:graphic>
-                </wp:inline>
-              </w:drawing>
-            </w:r>
-          </w:p>
-        </w:tc>
-        <w:tc>
-          <w:tcPr>
-            <w:tcW w:type="dxa" w:w="4680"/>
-            <w:tcMar>
-              <w:top w:w="80" w:type="dxa"/>
-              <w:bottom w:w="80" w:type="dxa"/>
-              <w:start w:w="120" w:type="dxa"/>
-              <w:end w:w="120" w:type="dxa"/>
-            </w:tcMar>
-            <w:vAlign w:val="top"/>
-          </w:tcPr>
-          <w:p>
-            <w:pPr>
-              <w:spacing w:after="40"/>
-              <w:jc w:val="center"/>
-            </w:pPr>
-            <w:r>
-              <w:drawing>
-                <wp:inline xmlns:a="http://schemas.openxmlformats.org/drawingml/2006/main" xmlns:pic="http://schemas.openxmlformats.org/drawingml/2006/picture">
-                  <wp:extent cx="1920240" cy="4155596"/>
-                  <wp:docPr id="4" name="预约提交成功示意" title="预约提交成功示意" descr="移动端预约提交成功的页面示意，显示当前预约和到柜提示。"/>
-                  <wp:cNvGraphicFramePr>
-                    <a:graphicFrameLocks noChangeAspect="1"/>
-                  </wp:cNvGraphicFramePr>
-                  <a:graphic>
-                    <a:graphicData uri="http://schemas.openxmlformats.org/drawingml/2006/picture">
-                      <pic:pic>
-                        <pic:nvPicPr>
-                          <pic:cNvPr id="0" name="app-local-isolated-reservation-success-390x844-20260728.png"/>
-                          <pic:cNvPicPr/>
-                        </pic:nvPicPr>
-                        <pic:blipFill>
-                          <a:blip r:embed="rId14"/>
-                          <a:stretch>
-                            <a:fillRect/>
-                          </a:stretch>
-                        </pic:blipFill>
-                        <pic:spPr>
-                          <a:xfrm>
-                            <a:off x="0" y="0"/>
-                            <a:ext cx="1920240" cy="4155596"/>
-                          </a:xfrm>
-                          <a:prstGeom prst="rect"/>
-                        </pic:spPr>
-                      </pic:pic>
-                    </a:graphicData>
-                  </a:graphic>
-                </wp:inline>
-              </w:drawing>
+              <w:t>过期预约不能继续开柜，可重新选择仍有库存的物资预约。</w:t>
             </w:r>
           </w:p>
         </w:tc>
@@ -963,503 +2854,77 @@
       <w:tr>
         <w:tc>
           <w:tcPr>
-            <w:tcW w:type="dxa" w:w="4680"/>
+            <w:tcW w:type="dxa" w:w="2950"/>
             <w:tcMar>
               <w:top w:w="80" w:type="dxa"/>
               <w:bottom w:w="80" w:type="dxa"/>
               <w:start w:w="120" w:type="dxa"/>
               <w:end w:w="120" w:type="dxa"/>
             </w:tcMar>
+            <w:shd w:fill="FFF7EA"/>
+            <w:tcBorders>
+              <w:top w:val="single" w:sz="6" w:color="D7E6DF"/>
+              <w:left w:val="single" w:sz="6" w:color="D7E6DF"/>
+              <w:bottom w:val="single" w:sz="6" w:color="D7E6DF"/>
+              <w:right w:val="single" w:sz="6" w:color="D7E6DF"/>
+            </w:tcBorders>
             <w:vAlign w:val="top"/>
           </w:tcPr>
           <w:p>
             <w:pPr>
-              <w:spacing w:after="0"/>
-              <w:jc w:val="center"/>
+              <w:spacing w:before="60" w:after="60"/>
             </w:pPr>
             <w:r>
               <w:rPr>
-                <w:rFonts w:ascii="Calibri" w:hAnsi="Calibri" w:eastAsia="Microsoft YaHei"/>
-                <w:color w:val="5B6C7E"/>
-                <w:sz w:val="18"/>
+                <w:rFonts w:ascii="Microsoft YaHei" w:hAnsi="Microsoft YaHei" w:eastAsia="微软雅黑"/>
+                <w:b/>
+                <w:color w:val="122737"/>
+                <w:sz w:val="19"/>
               </w:rPr>
-              <w:t>预约进行中示意</w:t>
+              <w:t>开门后结果一直待确认</w:t>
             </w:r>
           </w:p>
         </w:tc>
         <w:tc>
           <w:tcPr>
-            <w:tcW w:type="dxa" w:w="4680"/>
+            <w:tcW w:type="dxa" w:w="7078"/>
             <w:tcMar>
               <w:top w:w="80" w:type="dxa"/>
               <w:bottom w:w="80" w:type="dxa"/>
               <w:start w:w="120" w:type="dxa"/>
               <w:end w:w="120" w:type="dxa"/>
             </w:tcMar>
+            <w:shd w:fill="FFF7EA"/>
+            <w:tcBorders>
+              <w:top w:val="single" w:sz="6" w:color="D7E6DF"/>
+              <w:left w:val="single" w:sz="6" w:color="D7E6DF"/>
+              <w:bottom w:val="single" w:sz="6" w:color="D7E6DF"/>
+              <w:right w:val="single" w:sz="6" w:color="D7E6DF"/>
+            </w:tcBorders>
             <w:vAlign w:val="top"/>
           </w:tcPr>
           <w:p>
             <w:pPr>
-              <w:spacing w:after="0"/>
-              <w:jc w:val="center"/>
+              <w:spacing w:before="60" w:after="60"/>
             </w:pPr>
             <w:r>
               <w:rPr>
-                <w:rFonts w:ascii="Calibri" w:hAnsi="Calibri" w:eastAsia="Microsoft YaHei"/>
-                <w:color w:val="5B6C7E"/>
-                <w:sz w:val="18"/>
+                <w:rFonts w:ascii="Microsoft YaHei" w:hAnsi="Microsoft YaHei" w:eastAsia="微软雅黑"/>
+                <w:b w:val="0"/>
+                <w:color w:val="122737"/>
+                <w:sz w:val="19"/>
               </w:rPr>
-              <w:t>预约提交成功示意</w:t>
+              <w:t>不重复开门，保持柜门关闭并联系工作人员核对处理结果。</w:t>
             </w:r>
           </w:p>
         </w:tc>
       </w:tr>
     </w:tbl>
-    <w:p>
-      <w:pPr>
-        <w:spacing w:after="0"/>
-      </w:pPr>
-    </w:p>
-    <w:p>
-      <w:pPr>
-        <w:pStyle w:val="Heading1"/>
-      </w:pPr>
-      <w:r>
-        <w:t>到柜领取</w:t>
-      </w:r>
-    </w:p>
-    <w:p>
-      <w:pPr>
-        <w:spacing w:before="0" w:after="80" w:line="300" w:lineRule="auto"/>
-        <w:numPr>
-          <w:ilvl w:val="0"/>
-          <w:numId w:val="12"/>
-        </w:numPr>
-      </w:pPr>
-      <w:r>
-        <w:rPr>
-          <w:rFonts w:ascii="Calibri" w:hAnsi="Calibri" w:eastAsia="Microsoft YaHei"/>
-          <w:color w:val="0B2545"/>
-          <w:sz w:val="22"/>
-        </w:rPr>
-        <w:t>在预约有效期内到达页面显示的柜机。</w:t>
-      </w:r>
-    </w:p>
-    <w:p>
-      <w:pPr>
-        <w:spacing w:before="0" w:after="80" w:line="300" w:lineRule="auto"/>
-        <w:numPr>
-          <w:ilvl w:val="0"/>
-          <w:numId w:val="12"/>
-        </w:numPr>
-      </w:pPr>
-      <w:r>
-        <w:rPr>
-          <w:rFonts w:ascii="Calibri" w:hAnsi="Calibri" w:eastAsia="Microsoft YaHei"/>
-          <w:color w:val="0B2545"/>
-          <w:sz w:val="22"/>
-        </w:rPr>
-        <w:t>打开“当前预约”，再次核对柜机、物资和保留状态。</w:t>
-      </w:r>
-    </w:p>
-    <w:p>
-      <w:pPr>
-        <w:spacing w:before="0" w:after="80" w:line="300" w:lineRule="auto"/>
-        <w:numPr>
-          <w:ilvl w:val="0"/>
-          <w:numId w:val="12"/>
-        </w:numPr>
-      </w:pPr>
-      <w:r>
-        <w:rPr>
-          <w:rFonts w:ascii="Calibri" w:hAnsi="Calibri" w:eastAsia="Microsoft YaHei"/>
-          <w:color w:val="0B2545"/>
-          <w:sz w:val="22"/>
-        </w:rPr>
-        <w:t>按页面提示完成距离确认和开柜确认。</w:t>
-      </w:r>
-    </w:p>
-    <w:p>
-      <w:pPr>
-        <w:spacing w:before="0" w:after="80" w:line="300" w:lineRule="auto"/>
-        <w:numPr>
-          <w:ilvl w:val="0"/>
-          <w:numId w:val="12"/>
-        </w:numPr>
-      </w:pPr>
-      <w:r>
-        <w:rPr>
-          <w:rFonts w:ascii="Calibri" w:hAnsi="Calibri" w:eastAsia="Microsoft YaHei"/>
-          <w:color w:val="0B2545"/>
-          <w:sz w:val="22"/>
-        </w:rPr>
-        <w:t>取出物资并关好柜门。</w:t>
-      </w:r>
-    </w:p>
-    <w:p>
-      <w:pPr>
-        <w:spacing w:before="0" w:after="80" w:line="300" w:lineRule="auto"/>
-        <w:numPr>
-          <w:ilvl w:val="0"/>
-          <w:numId w:val="12"/>
-        </w:numPr>
-      </w:pPr>
-      <w:r>
-        <w:rPr>
-          <w:rFonts w:ascii="Calibri" w:hAnsi="Calibri" w:eastAsia="Microsoft YaHei"/>
-          <w:color w:val="0B2545"/>
-          <w:sz w:val="22"/>
-        </w:rPr>
-        <w:t>等待页面显示最终结果后再离开。</w:t>
-      </w:r>
-    </w:p>
-    <w:tbl>
-      <w:tblPr>
-        <w:tblW w:type="dxa" w:w="9360"/>
-        <w:jc w:val="left"/>
-        <w:tblLayout w:type="fixed"/>
-        <w:tblLook w:firstColumn="1" w:firstRow="1" w:lastColumn="0" w:lastRow="0" w:noHBand="0" w:noVBand="1" w:val="04A0"/>
-        <w:tblInd w:w="120" w:type="dxa"/>
-        <w:tblBorders>
-          <w:top w:val="single" w:sz="4" w:space="0" w:color="B8D7C8"/>
-          <w:left w:val="single" w:sz="4" w:space="0" w:color="B8D7C8"/>
-          <w:bottom w:val="single" w:sz="4" w:space="0" w:color="B8D7C8"/>
-          <w:right w:val="single" w:sz="4" w:space="0" w:color="B8D7C8"/>
-          <w:insideH w:val="single" w:sz="4" w:space="0" w:color="B8D7C8"/>
-          <w:insideV w:val="single" w:sz="4" w:space="0" w:color="B8D7C8"/>
-        </w:tblBorders>
-      </w:tblPr>
-      <w:tblGrid>
-        <w:gridCol w:w="9360"/>
-      </w:tblGrid>
-      <w:tr>
-        <w:tc>
-          <w:tcPr>
-            <w:tcW w:type="dxa" w:w="9360"/>
-            <w:tcMar>
-              <w:top w:w="80" w:type="dxa"/>
-              <w:bottom w:w="80" w:type="dxa"/>
-              <w:start w:w="120" w:type="dxa"/>
-              <w:end w:w="120" w:type="dxa"/>
-            </w:tcMar>
-            <w:vAlign w:val="top"/>
-            <w:shd w:fill="E8F5EE"/>
-          </w:tcPr>
-          <w:p>
-            <w:pPr>
-              <w:spacing w:before="40" w:after="40" w:line="300" w:lineRule="auto"/>
-            </w:pPr>
-            <w:r>
-              <w:t>页面尚未确认结果时，请先不要重复开柜。保留当前页面，记下时间和柜机编号，再联系实例管理员。</w:t>
-            </w:r>
-          </w:p>
-        </w:tc>
-      </w:tr>
-    </w:tbl>
-    <w:p>
-      <w:pPr>
-        <w:spacing w:after="0"/>
-      </w:pPr>
-    </w:p>
-    <w:p>
-      <w:pPr>
-        <w:pStyle w:val="Heading1"/>
-      </w:pPr>
-      <w:r>
-        <w:t>常见问题</w:t>
-      </w:r>
-    </w:p>
-    <w:tbl>
-      <w:tblPr>
-        <w:tblW w:type="dxa" w:w="9360"/>
-        <w:jc w:val="left"/>
-        <w:tblLayout w:type="fixed"/>
-        <w:tblLook w:firstColumn="1" w:firstRow="1" w:lastColumn="0" w:lastRow="0" w:noHBand="0" w:noVBand="1" w:val="04A0"/>
-        <w:tblInd w:w="120" w:type="dxa"/>
-        <w:tblBorders>
-          <w:top w:val="single" w:sz="4" w:space="0" w:color="D6DEE6"/>
-          <w:left w:val="single" w:sz="4" w:space="0" w:color="D6DEE6"/>
-          <w:bottom w:val="single" w:sz="4" w:space="0" w:color="D6DEE6"/>
-          <w:right w:val="single" w:sz="4" w:space="0" w:color="D6DEE6"/>
-          <w:insideH w:val="single" w:sz="4" w:space="0" w:color="D6DEE6"/>
-          <w:insideV w:val="single" w:sz="4" w:space="0" w:color="D6DEE6"/>
-        </w:tblBorders>
-      </w:tblPr>
-      <w:tblGrid>
-        <w:gridCol w:w="2700"/>
-        <w:gridCol w:w="6660"/>
-      </w:tblGrid>
-      <w:tr>
-        <w:trPr>
-          <w:tblHeader/>
-        </w:trPr>
-        <w:tc>
-          <w:tcPr>
-            <w:tcW w:type="dxa" w:w="2700"/>
-            <w:tcMar>
-              <w:top w:w="80" w:type="dxa"/>
-              <w:bottom w:w="80" w:type="dxa"/>
-              <w:start w:w="120" w:type="dxa"/>
-              <w:end w:w="120" w:type="dxa"/>
-            </w:tcMar>
-            <w:vAlign w:val="top"/>
-            <w:shd w:fill="E8EEF5"/>
-          </w:tcPr>
-          <w:p>
-            <w:pPr>
-              <w:spacing w:after="0"/>
-            </w:pPr>
-            <w:r>
-              <w:rPr>
-                <w:rFonts w:ascii="Calibri" w:hAnsi="Calibri" w:eastAsia="Microsoft YaHei"/>
-                <w:b/>
-                <w:color w:val="1F4D78"/>
-                <w:sz w:val="21"/>
-              </w:rPr>
-              <w:t>无法登录</w:t>
-            </w:r>
-          </w:p>
-        </w:tc>
-        <w:tc>
-          <w:tcPr>
-            <w:tcW w:type="dxa" w:w="6660"/>
-            <w:tcMar>
-              <w:top w:w="80" w:type="dxa"/>
-              <w:bottom w:w="80" w:type="dxa"/>
-              <w:start w:w="120" w:type="dxa"/>
-              <w:end w:w="120" w:type="dxa"/>
-            </w:tcMar>
-            <w:vAlign w:val="top"/>
-          </w:tcPr>
-          <w:p>
-            <w:pPr>
-              <w:spacing w:after="0" w:line="288" w:lineRule="auto"/>
-            </w:pPr>
-            <w:r>
-              <w:t>请确认手机号属于本人且已建档启用；验证码需要是本次签发且尚未使用的验证码。</w:t>
-            </w:r>
-          </w:p>
-        </w:tc>
-      </w:tr>
-      <w:tr>
-        <w:tc>
-          <w:tcPr>
-            <w:tcW w:type="dxa" w:w="2700"/>
-            <w:tcMar>
-              <w:top w:w="80" w:type="dxa"/>
-              <w:bottom w:w="80" w:type="dxa"/>
-              <w:start w:w="120" w:type="dxa"/>
-              <w:end w:w="120" w:type="dxa"/>
-            </w:tcMar>
-            <w:vAlign w:val="top"/>
-            <w:shd w:fill="E8EEF5"/>
-          </w:tcPr>
-          <w:p>
-            <w:pPr>
-              <w:spacing w:after="0"/>
-            </w:pPr>
-            <w:r>
-              <w:rPr>
-                <w:rFonts w:ascii="Calibri" w:hAnsi="Calibri" w:eastAsia="Microsoft YaHei"/>
-                <w:b/>
-                <w:color w:val="1F4D78"/>
-                <w:sz w:val="21"/>
-              </w:rPr>
-              <w:t>附近柜机为空</w:t>
-            </w:r>
-          </w:p>
-        </w:tc>
-        <w:tc>
-          <w:tcPr>
-            <w:tcW w:type="dxa" w:w="6660"/>
-            <w:tcMar>
-              <w:top w:w="80" w:type="dxa"/>
-              <w:bottom w:w="80" w:type="dxa"/>
-              <w:start w:w="120" w:type="dxa"/>
-              <w:end w:w="120" w:type="dxa"/>
-            </w:tcMar>
-            <w:vAlign w:val="top"/>
-            <w:shd w:fill="FAFBFC"/>
-          </w:tcPr>
-          <w:p>
-            <w:pPr>
-              <w:spacing w:after="0" w:line="288" w:lineRule="auto"/>
-            </w:pPr>
-            <w:r>
-              <w:rPr>
-                <w:rFonts w:ascii="Calibri" w:hAnsi="Calibri" w:eastAsia="Microsoft YaHei"/>
-                <w:color w:val="0B2545"/>
-                <w:sz w:val="21"/>
-              </w:rPr>
-              <w:t>可能没有在线柜机或没有可预约库存，请稍后刷新或联系实例管理员。</w:t>
-            </w:r>
-          </w:p>
-        </w:tc>
-      </w:tr>
-      <w:tr>
-        <w:tc>
-          <w:tcPr>
-            <w:tcW w:type="dxa" w:w="2700"/>
-            <w:tcMar>
-              <w:top w:w="80" w:type="dxa"/>
-              <w:bottom w:w="80" w:type="dxa"/>
-              <w:start w:w="120" w:type="dxa"/>
-              <w:end w:w="120" w:type="dxa"/>
-            </w:tcMar>
-            <w:vAlign w:val="top"/>
-            <w:shd w:fill="E8EEF5"/>
-          </w:tcPr>
-          <w:p>
-            <w:pPr>
-              <w:spacing w:after="0"/>
-            </w:pPr>
-            <w:r>
-              <w:rPr>
-                <w:rFonts w:ascii="Calibri" w:hAnsi="Calibri" w:eastAsia="Microsoft YaHei"/>
-                <w:b/>
-                <w:color w:val="1F4D78"/>
-                <w:sz w:val="21"/>
-              </w:rPr>
-              <w:t>预约按钮不可用</w:t>
-            </w:r>
-          </w:p>
-        </w:tc>
-        <w:tc>
-          <w:tcPr>
-            <w:tcW w:type="dxa" w:w="6660"/>
-            <w:tcMar>
-              <w:top w:w="80" w:type="dxa"/>
-              <w:bottom w:w="80" w:type="dxa"/>
-              <w:start w:w="120" w:type="dxa"/>
-              <w:end w:w="120" w:type="dxa"/>
-            </w:tcMar>
-            <w:vAlign w:val="top"/>
-          </w:tcPr>
-          <w:p>
-            <w:pPr>
-              <w:spacing w:after="0" w:line="288" w:lineRule="auto"/>
-            </w:pPr>
-            <w:r>
-              <w:rPr>
-                <w:rFonts w:ascii="Calibri" w:hAnsi="Calibri" w:eastAsia="Microsoft YaHei"/>
-                <w:color w:val="0B2545"/>
-                <w:sz w:val="21"/>
-              </w:rPr>
-              <w:t>核对开放时段、剩余额度、库存和当前预约状态。</w:t>
-            </w:r>
-          </w:p>
-        </w:tc>
-      </w:tr>
-      <w:tr>
-        <w:tc>
-          <w:tcPr>
-            <w:tcW w:type="dxa" w:w="2700"/>
-            <w:tcMar>
-              <w:top w:w="80" w:type="dxa"/>
-              <w:bottom w:w="80" w:type="dxa"/>
-              <w:start w:w="120" w:type="dxa"/>
-              <w:end w:w="120" w:type="dxa"/>
-            </w:tcMar>
-            <w:vAlign w:val="top"/>
-            <w:shd w:fill="E8EEF5"/>
-          </w:tcPr>
-          <w:p>
-            <w:pPr>
-              <w:spacing w:after="0"/>
-            </w:pPr>
-            <w:r>
-              <w:rPr>
-                <w:rFonts w:ascii="Calibri" w:hAnsi="Calibri" w:eastAsia="Microsoft YaHei"/>
-                <w:b/>
-                <w:color w:val="1F4D78"/>
-                <w:sz w:val="21"/>
-              </w:rPr>
-              <w:t>开柜结果未确认</w:t>
-            </w:r>
-          </w:p>
-        </w:tc>
-        <w:tc>
-          <w:tcPr>
-            <w:tcW w:type="dxa" w:w="6660"/>
-            <w:tcMar>
-              <w:top w:w="80" w:type="dxa"/>
-              <w:bottom w:w="80" w:type="dxa"/>
-              <w:start w:w="120" w:type="dxa"/>
-              <w:end w:w="120" w:type="dxa"/>
-            </w:tcMar>
-            <w:vAlign w:val="top"/>
-            <w:shd w:fill="FAFBFC"/>
-          </w:tcPr>
-          <w:p>
-            <w:pPr>
-              <w:spacing w:after="0" w:line="288" w:lineRule="auto"/>
-            </w:pPr>
-            <w:r>
-              <w:t>请先不要重复开柜，保留页面并联系实例管理员。</w:t>
-            </w:r>
-          </w:p>
-        </w:tc>
-      </w:tr>
-      <w:tr>
-        <w:tc>
-          <w:tcPr>
-            <w:tcW w:type="dxa" w:w="2700"/>
-            <w:tcMar>
-              <w:top w:w="80" w:type="dxa"/>
-              <w:bottom w:w="80" w:type="dxa"/>
-              <w:start w:w="120" w:type="dxa"/>
-              <w:end w:w="120" w:type="dxa"/>
-            </w:tcMar>
-            <w:vAlign w:val="top"/>
-            <w:shd w:fill="E8EEF5"/>
-          </w:tcPr>
-          <w:p>
-            <w:pPr>
-              <w:spacing w:after="0"/>
-            </w:pPr>
-            <w:r>
-              <w:rPr>
-                <w:rFonts w:ascii="Calibri" w:hAnsi="Calibri" w:eastAsia="Microsoft YaHei"/>
-                <w:b/>
-                <w:color w:val="1F4D78"/>
-                <w:sz w:val="21"/>
-              </w:rPr>
-              <w:t>页面要求付款</w:t>
-            </w:r>
-          </w:p>
-        </w:tc>
-        <w:tc>
-          <w:tcPr>
-            <w:tcW w:type="dxa" w:w="6660"/>
-            <w:tcMar>
-              <w:top w:w="80" w:type="dxa"/>
-              <w:bottom w:w="80" w:type="dxa"/>
-              <w:start w:w="120" w:type="dxa"/>
-              <w:end w:w="120" w:type="dxa"/>
-            </w:tcMar>
-            <w:vAlign w:val="top"/>
-          </w:tcPr>
-          <w:p>
-            <w:pPr>
-              <w:spacing w:after="0" w:line="288" w:lineRule="auto"/>
-            </w:pPr>
-            <w:r>
-              <w:t>请先暂停操作，并联系实例管理员核对预约设置。</w:t>
-            </w:r>
-          </w:p>
-        </w:tc>
-      </w:tr>
-    </w:tbl>
-    <w:p>
-      <w:pPr>
-        <w:spacing w:after="0"/>
-      </w:pPr>
-    </w:p>
     <w:sectPr>
       <w:headerReference w:type="default" r:id="rId9"/>
       <w:footerReference w:type="default" r:id="rId10"/>
-      <w:pgSz w:w="12240" w:h="15840"/>
-      <w:pgMar w:top="1440" w:right="1440" w:bottom="1440" w:left="1440" w:header="708" w:footer="708" w:gutter="0"/>
+      <w:pgSz w:w="11906" w:h="16838"/>
+      <w:pgMar w:top="822" w:right="879" w:bottom="822" w:left="879" w:header="369" w:footer="369" w:gutter="0"/>
       <w:cols w:space="720"/>
       <w:docGrid w:linePitch="360"/>
     </w:sectPr>
@@ -1472,22 +2937,26 @@
   <w:p>
     <w:pPr>
       <w:pStyle w:val="Footer"/>
-      <w:jc w:val="right"/>
+      <w:jc w:val="center"/>
     </w:pPr>
     <w:r>
       <w:rPr>
-        <w:rFonts w:ascii="Calibri" w:hAnsi="Calibri" w:eastAsia="Microsoft YaHei"/>
-        <w:color w:val="5B6C7E"/>
-        <w:sz w:val="18"/>
+        <w:rFonts w:ascii="Microsoft YaHei" w:hAnsi="Microsoft YaHei" w:eastAsia="微软雅黑"/>
+        <w:b w:val="0"/>
+        <w:color w:val="586C7C"/>
+        <w:sz w:val="17"/>
       </w:rPr>
       <w:t xml:space="preserve">第 </w:t>
+      <w:fldChar w:fldCharType="begin"/>
+      <w:instrText xml:space="preserve"> PAGE </w:instrText>
+      <w:fldChar w:fldCharType="end"/>
     </w:r>
-    <w:fldSimple w:instr="PAGE"/>
     <w:r>
       <w:rPr>
-        <w:rFonts w:ascii="Calibri" w:hAnsi="Calibri" w:eastAsia="Microsoft YaHei"/>
-        <w:color w:val="5B6C7E"/>
-        <w:sz w:val="18"/>
+        <w:rFonts w:ascii="Microsoft YaHei" w:hAnsi="Microsoft YaHei" w:eastAsia="微软雅黑"/>
+        <w:b w:val="0"/>
+        <w:color w:val="586C7C"/>
+        <w:sz w:val="17"/>
       </w:rPr>
       <w:t xml:space="preserve"> 页</w:t>
     </w:r>
@@ -1500,16 +2969,16 @@
   <w:p>
     <w:pPr>
       <w:pStyle w:val="Header"/>
-      <w:jc w:val="left"/>
+      <w:jc w:val="right"/>
     </w:pPr>
     <w:r>
       <w:rPr>
-        <w:rFonts w:ascii="Calibri" w:hAnsi="Calibri" w:eastAsia="Microsoft YaHei"/>
-        <w:b/>
-        <w:color w:val="5B6C7E"/>
-        <w:sz w:val="18"/>
-      </w:rPr>
-      <w:t>公益智助柜 · App 用户使用手册</w:t>
+        <w:rFonts w:ascii="Microsoft YaHei" w:hAnsi="Microsoft YaHei" w:eastAsia="微软雅黑"/>
+        <w:b/>
+        <w:color w:val="326F5E"/>
+        <w:sz w:val="17"/>
+      </w:rPr>
+      <w:t>公益智助柜　App 用户使用手册</w:t>
     </w:r>
   </w:p>
 </w:hdr>
@@ -1517,6 +2986,27 @@
 
 <file path=word/numbering.xml><?xml version="1.0" encoding="utf-8"?>
 <w:numbering xmlns:wpc="http://schemas.microsoft.com/office/word/2010/wordprocessingCanvas" xmlns:mo="http://schemas.microsoft.com/office/mac/office/2008/main" xmlns:mc="http://schemas.openxmlformats.org/markup-compatibility/2006" xmlns:mv="urn:schemas-microsoft-com:mac:vml" xmlns:o="urn:schemas-microsoft-com:office:office" xmlns:r="http://schemas.openxmlformats.org/officeDocument/2006/relationships" xmlns:m="http://schemas.openxmlformats.org/officeDocument/2006/math" xmlns:v="urn:schemas-microsoft-com:vml" xmlns:wp14="http://schemas.microsoft.com/office/word/2010/wordprocessingDrawing" xmlns:wp="http://schemas.openxmlformats.org/drawingml/2006/wordprocessingDrawing" xmlns:w10="urn:schemas-microsoft-com:office:word" xmlns:w="http://schemas.openxmlformats.org/wordprocessingml/2006/main" xmlns:w14="http://schemas.microsoft.com/office/word/2010/wordml" xmlns:wpg="http://schemas.microsoft.com/office/word/2010/wordprocessingGroup" xmlns:wpi="http://schemas.microsoft.com/office/word/2010/wordprocessingInk" xmlns:wne="http://schemas.microsoft.com/office/word/2006/wordml" xmlns:wps="http://schemas.microsoft.com/office/word/2010/wordprocessingShape" mc:Ignorable="w14 wp14">
+  <w:abstractNum w:abstractNumId="9">
+    <w:multiLevelType w:val="singleLevel"/>
+    <w:lvl w:ilvl="0">
+      <w:start w:val="1"/>
+      <w:numFmt w:val="decimal"/>
+      <w:lvlText w:val="%1."/>
+      <w:lvlJc w:val="left"/>
+      <w:pPr>
+        <w:tabs>
+          <w:tab w:val="num" w:pos="540"/>
+        </w:tabs>
+        <w:ind w:left="540" w:hanging="270"/>
+        <w:spacing w:after="80" w:line="300" w:lineRule="auto"/>
+      </w:pPr>
+      <w:rPr>
+        <w:rFonts w:ascii="Microsoft YaHei" w:hAnsi="Microsoft YaHei" w:eastAsia="微软雅黑"/>
+        <w:b/>
+        <w:color w:val="087A63"/>
+      </w:rPr>
+    </w:lvl>
+  </w:abstractNum>
   <w:abstractNum w:abstractNumId="0">
     <w:nsid w:val="FFFFFF7C"/>
     <w:multiLevelType w:val="singleLevel"/>
@@ -1715,74 +3205,35 @@
   <w:num w:numId="9">
     <w:abstractNumId w:val="0"/>
   </w:num>
-  <w:abstractNum w:abstractNumId="9">
-    <w:nsid w:val="00000009"/>
-    <w:tmpl w:val="10000009"/>
-    <w:multiLevelType w:val="singleLevel"/>
-    <w:lvl w:ilvl="0">
-      <w:start w:val="1"/>
-      <w:numFmt w:val="decimal"/>
-      <w:lvlText w:val="%1."/>
-      <w:suff w:val="tab"/>
-      <w:pPr>
-        <w:tabs>
-          <w:tab w:val="num" w:pos="540"/>
-        </w:tabs>
-        <w:ind w:left="540" w:hanging="270"/>
-      </w:pPr>
-    </w:lvl>
-  </w:abstractNum>
   <w:num w:numId="10">
     <w:abstractNumId w:val="9"/>
-    <w:lvlOverride w:ilvl="0">
-      <w:startOverride w:val="1"/>
-    </w:lvlOverride>
   </w:num>
-  <w:abstractNum w:abstractNumId="10">
-    <w:nsid w:val="0000000A"/>
-    <w:tmpl w:val="1000000A"/>
-    <w:multiLevelType w:val="singleLevel"/>
-    <w:lvl w:ilvl="0">
-      <w:start w:val="1"/>
-      <w:numFmt w:val="decimal"/>
-      <w:lvlText w:val="%1."/>
-      <w:suff w:val="tab"/>
-      <w:pPr>
-        <w:tabs>
-          <w:tab w:val="num" w:pos="540"/>
-        </w:tabs>
-        <w:ind w:left="540" w:hanging="270"/>
-      </w:pPr>
-    </w:lvl>
-  </w:abstractNum>
   <w:num w:numId="11">
-    <w:abstractNumId w:val="10"/>
-    <w:lvlOverride w:ilvl="0">
-      <w:startOverride w:val="1"/>
-    </w:lvlOverride>
+    <w:abstractNumId w:val="9"/>
   </w:num>
-  <w:abstractNum w:abstractNumId="11">
-    <w:nsid w:val="0000000B"/>
-    <w:tmpl w:val="1000000B"/>
-    <w:multiLevelType w:val="singleLevel"/>
-    <w:lvl w:ilvl="0">
-      <w:start w:val="1"/>
-      <w:numFmt w:val="decimal"/>
-      <w:lvlText w:val="%1."/>
-      <w:suff w:val="tab"/>
-      <w:pPr>
-        <w:tabs>
-          <w:tab w:val="num" w:pos="540"/>
-        </w:tabs>
-        <w:ind w:left="540" w:hanging="270"/>
-      </w:pPr>
-    </w:lvl>
-  </w:abstractNum>
   <w:num w:numId="12">
-    <w:abstractNumId w:val="11"/>
-    <w:lvlOverride w:ilvl="0">
-      <w:startOverride w:val="1"/>
-    </w:lvlOverride>
+    <w:abstractNumId w:val="9"/>
+  </w:num>
+  <w:num w:numId="13">
+    <w:abstractNumId w:val="9"/>
+  </w:num>
+  <w:num w:numId="14">
+    <w:abstractNumId w:val="9"/>
+  </w:num>
+  <w:num w:numId="15">
+    <w:abstractNumId w:val="9"/>
+  </w:num>
+  <w:num w:numId="16">
+    <w:abstractNumId w:val="9"/>
+  </w:num>
+  <w:num w:numId="17">
+    <w:abstractNumId w:val="9"/>
+  </w:num>
+  <w:num w:numId="18">
+    <w:abstractNumId w:val="9"/>
+  </w:num>
+  <w:num w:numId="19">
+    <w:abstractNumId w:val="9"/>
   </w:num>
 </w:numbering>
 </file>
@@ -1948,11 +3399,12 @@
     <w:qFormat/>
     <w:rsid w:val="00FC693F"/>
     <w:pPr>
-      <w:spacing w:before="0" w:after="120" w:line="300" w:lineRule="auto"/>
+      <w:spacing w:after="80" w:line="300" w:lineRule="auto"/>
     </w:pPr>
     <w:rPr>
-      <w:rFonts w:ascii="Calibri" w:hAnsi="Calibri" w:eastAsia="Microsoft YaHei"/>
-      <w:sz w:val="22"/>
+      <w:rFonts w:ascii="Microsoft YaHei" w:hAnsi="Microsoft YaHei" w:eastAsia="微软雅黑"/>
+      <w:color w:val="122737"/>
+      <w:sz w:val="21"/>
     </w:rPr>
   </w:style>
   <w:style w:type="paragraph" w:styleId="Header">
@@ -2010,15 +3462,15 @@
     <w:pPr>
       <w:keepNext/>
       <w:keepLines/>
-      <w:spacing w:before="360" w:after="200" w:line="240" w:lineRule="auto"/>
+      <w:spacing w:before="480" w:after="0"/>
       <w:outlineLvl w:val="0"/>
     </w:pPr>
     <w:rPr>
-      <w:rFonts w:asciiTheme="majorHAnsi" w:eastAsiaTheme="majorEastAsia" w:hAnsiTheme="majorHAnsi" w:cstheme="majorBidi" w:ascii="Calibri" w:hAnsi="Calibri" w:eastAsia="Microsoft YaHei"/>
+      <w:rFonts w:asciiTheme="majorHAnsi" w:eastAsiaTheme="majorEastAsia" w:hAnsiTheme="majorHAnsi" w:cstheme="majorBidi" w:ascii="Microsoft YaHei" w:hAnsi="Microsoft YaHei" w:eastAsia="微软雅黑"/>
       <w:b/>
       <w:bCs/>
-      <w:color w:val="2E74B5"/>
-      <w:sz w:val="32"/>
+      <w:color w:val="122737"/>
+      <w:sz w:val="30"/>
       <w:szCs w:val="28"/>
     </w:rPr>
   </w:style>
@@ -2034,14 +3486,14 @@
     <w:pPr>
       <w:keepNext/>
       <w:keepLines/>
-      <w:spacing w:before="280" w:after="140" w:line="240" w:lineRule="auto"/>
+      <w:spacing w:before="200" w:after="0"/>
       <w:outlineLvl w:val="1"/>
     </w:pPr>
     <w:rPr>
-      <w:rFonts w:asciiTheme="majorHAnsi" w:eastAsiaTheme="majorEastAsia" w:hAnsiTheme="majorHAnsi" w:cstheme="majorBidi" w:ascii="Calibri" w:hAnsi="Calibri" w:eastAsia="Microsoft YaHei"/>
+      <w:rFonts w:asciiTheme="majorHAnsi" w:eastAsiaTheme="majorEastAsia" w:hAnsiTheme="majorHAnsi" w:cstheme="majorBidi" w:ascii="Microsoft YaHei" w:hAnsi="Microsoft YaHei" w:eastAsia="微软雅黑"/>
       <w:b/>
       <w:bCs/>
-      <w:color w:val="2E74B5"/>
+      <w:color w:val="122737"/>
       <w:sz w:val="26"/>
       <w:szCs w:val="26"/>
     </w:rPr>
@@ -2058,15 +3510,14 @@
     <w:pPr>
       <w:keepNext/>
       <w:keepLines/>
-      <w:spacing w:before="200" w:after="100" w:line="240" w:lineRule="auto"/>
+      <w:spacing w:before="200" w:after="0"/>
       <w:outlineLvl w:val="2"/>
     </w:pPr>
     <w:rPr>
-      <w:rFonts w:asciiTheme="majorHAnsi" w:eastAsiaTheme="majorEastAsia" w:hAnsiTheme="majorHAnsi" w:cstheme="majorBidi" w:ascii="Calibri" w:hAnsi="Calibri" w:eastAsia="Microsoft YaHei"/>
+      <w:rFonts w:asciiTheme="majorHAnsi" w:eastAsiaTheme="majorEastAsia" w:hAnsiTheme="majorHAnsi" w:cstheme="majorBidi"/>
       <w:b/>
       <w:bCs/>
-      <w:color w:val="1F4D78"/>
-      <w:sz w:val="24"/>
+      <w:color w:val="4F81BD" w:themeColor="accent1"/>
     </w:rPr>
   </w:style>
   <w:style w:type="paragraph" w:styleId="Heading4">
@@ -2304,11 +3755,12 @@
       <w:contextualSpacing/>
     </w:pPr>
     <w:rPr>
-      <w:rFonts w:asciiTheme="majorHAnsi" w:eastAsiaTheme="majorEastAsia" w:hAnsiTheme="majorHAnsi" w:cstheme="majorBidi"/>
-      <w:color w:val="17365D" w:themeColor="text2" w:themeShade="BF"/>
+      <w:rFonts w:asciiTheme="majorHAnsi" w:eastAsiaTheme="majorEastAsia" w:hAnsiTheme="majorHAnsi" w:cstheme="majorBidi" w:ascii="Microsoft YaHei" w:hAnsi="Microsoft YaHei" w:eastAsia="微软雅黑"/>
+      <w:b/>
+      <w:color w:val="122737"/>
       <w:spacing w:val="5"/>
       <w:kern w:val="28"/>
-      <w:sz w:val="52"/>
+      <w:sz w:val="40"/>
       <w:szCs w:val="52"/>
     </w:rPr>
   </w:style>
@@ -2743,14 +4195,12 @@
     <w:qFormat/>
     <w:rsid w:val="00FC693F"/>
     <w:pPr>
-      <w:spacing w:line="240" w:lineRule="auto" w:before="80" w:after="160"/>
-      <w:jc w:val="center"/>
+      <w:spacing w:line="240" w:lineRule="auto"/>
     </w:pPr>
     <w:rPr>
-      <w:rFonts w:ascii="Calibri" w:hAnsi="Calibri" w:eastAsia="Microsoft YaHei"/>
       <w:b/>
       <w:bCs/>
-      <w:color w:val="5B6C7E"/>
+      <w:color w:val="4F81BD" w:themeColor="accent1"/>
       <w:sz w:val="18"/>
       <w:szCs w:val="18"/>
     </w:rPr>
@@ -13639,6 +15089,17 @@
         <w:shd w:val="clear" w:color="auto" w:fill="FBCAA2" w:themeFill="accent6" w:themeFillTint="7F"/>
       </w:tcPr>
     </w:tblStylePr>
+  </w:style>
+  <w:style w:type="paragraph" w:customStyle="1" w:styleId="FigureCaption">
+    <w:name w:val="Figure Caption"/>
+    <w:pPr>
+      <w:spacing w:after="140"/>
+    </w:pPr>
+    <w:rPr>
+      <w:rFonts w:ascii="Microsoft YaHei" w:hAnsi="Microsoft YaHei" w:eastAsia="微软雅黑"/>
+      <w:color w:val="586C7C"/>
+      <w:sz w:val="17"/>
+    </w:rPr>
   </w:style>
 </w:styles>
 </file>

</xml_diff>

<commit_message>
feat(operations): recover missing settlements and reservations
</commit_message>
<xml_diff>
--- a/docs/用户手册/公益智助柜App用户使用手册.docx
+++ b/docs/用户手册/公益智助柜App用户使用手册.docx
@@ -54,7 +54,7 @@
           <w:color w:val="586C7C"/>
           <w:sz w:val="17"/>
         </w:rPr>
-        <w:t>版本日期：2026 年 8 月 7 日　｜　按任务查找，图中编号对应操作顺序</w:t>
+        <w:t>版本日期：2026 年 8 月 9 日　｜　按任务查找，图中编号对应操作顺序</w:t>
       </w:r>
     </w:p>
     <w:p>
@@ -296,6 +296,7 @@
       <w:pPr>
         <w:pStyle w:val="Heading1"/>
         <w:keepNext/>
+        <w:pageBreakBefore w:val="0"/>
         <w:spacing w:before="200" w:after="100"/>
       </w:pPr>
       <w:bookmarkStart w:id="2" w:name="manual_section_01"/>
@@ -520,14 +521,10 @@
       </w:r>
     </w:p>
     <w:p>
-      <w:r>
-        <w:br w:type="page"/>
-      </w:r>
-    </w:p>
-    <w:p>
       <w:pPr>
         <w:pStyle w:val="Heading1"/>
         <w:keepNext/>
+        <w:pageBreakBefore/>
         <w:spacing w:before="200" w:after="100"/>
       </w:pPr>
       <w:bookmarkStart w:id="3" w:name="manual_section_02"/>
@@ -735,14 +732,10 @@
       </w:r>
     </w:p>
     <w:p>
-      <w:r>
-        <w:br w:type="page"/>
-      </w:r>
-    </w:p>
-    <w:p>
       <w:pPr>
         <w:pStyle w:val="Heading1"/>
         <w:keepNext/>
+        <w:pageBreakBefore/>
         <w:spacing w:before="200" w:after="100"/>
       </w:pPr>
       <w:bookmarkStart w:id="4" w:name="manual_section_03"/>
@@ -950,14 +943,10 @@
       </w:r>
     </w:p>
     <w:p>
-      <w:r>
-        <w:br w:type="page"/>
-      </w:r>
-    </w:p>
-    <w:p>
       <w:pPr>
         <w:pStyle w:val="Heading1"/>
         <w:keepNext/>
+        <w:pageBreakBefore/>
         <w:spacing w:before="200" w:after="100"/>
       </w:pPr>
       <w:bookmarkStart w:id="5" w:name="manual_section_04"/>
@@ -1165,14 +1154,10 @@
       </w:r>
     </w:p>
     <w:p>
-      <w:r>
-        <w:br w:type="page"/>
-      </w:r>
-    </w:p>
-    <w:p>
       <w:pPr>
         <w:pStyle w:val="Heading1"/>
         <w:keepNext/>
+        <w:pageBreakBefore/>
         <w:spacing w:before="200" w:after="100"/>
       </w:pPr>
       <w:bookmarkStart w:id="6" w:name="manual_section_05"/>
@@ -1380,14 +1365,10 @@
       </w:r>
     </w:p>
     <w:p>
-      <w:r>
-        <w:br w:type="page"/>
-      </w:r>
-    </w:p>
-    <w:p>
       <w:pPr>
         <w:pStyle w:val="Heading1"/>
         <w:keepNext/>
+        <w:pageBreakBefore/>
         <w:spacing w:before="200" w:after="100"/>
       </w:pPr>
       <w:bookmarkStart w:id="7" w:name="manual_section_06"/>
@@ -1595,14 +1576,10 @@
       </w:r>
     </w:p>
     <w:p>
-      <w:r>
-        <w:br w:type="page"/>
-      </w:r>
-    </w:p>
-    <w:p>
       <w:pPr>
         <w:pStyle w:val="Heading1"/>
         <w:keepNext/>
+        <w:pageBreakBefore/>
         <w:spacing w:before="200" w:after="100"/>
       </w:pPr>
       <w:bookmarkStart w:id="8" w:name="manual_section_07"/>
@@ -1810,14 +1787,10 @@
       </w:r>
     </w:p>
     <w:p>
-      <w:r>
-        <w:br w:type="page"/>
-      </w:r>
-    </w:p>
-    <w:p>
       <w:pPr>
         <w:pStyle w:val="Heading1"/>
         <w:keepNext/>
+        <w:pageBreakBefore/>
         <w:spacing w:before="200" w:after="100"/>
       </w:pPr>
       <w:bookmarkStart w:id="9" w:name="manual_section_08"/>
@@ -2025,14 +1998,10 @@
       </w:r>
     </w:p>
     <w:p>
-      <w:r>
-        <w:br w:type="page"/>
-      </w:r>
-    </w:p>
-    <w:p>
       <w:pPr>
         <w:pStyle w:val="Heading1"/>
         <w:keepNext/>
+        <w:pageBreakBefore/>
         <w:spacing w:before="200" w:after="100"/>
       </w:pPr>
       <w:bookmarkStart w:id="10" w:name="manual_section_09"/>
@@ -2240,14 +2209,10 @@
       </w:r>
     </w:p>
     <w:p>
-      <w:r>
-        <w:br w:type="page"/>
-      </w:r>
-    </w:p>
-    <w:p>
       <w:pPr>
         <w:pStyle w:val="Heading1"/>
         <w:keepNext/>
+        <w:pageBreakBefore/>
         <w:spacing w:before="200" w:after="100"/>
       </w:pPr>
       <w:bookmarkStart w:id="11" w:name="manual_section_10"/>
@@ -2472,13 +2437,9 @@
       </w:r>
     </w:p>
     <w:p>
-      <w:r>
-        <w:br w:type="page"/>
-      </w:r>
-    </w:p>
-    <w:p>
       <w:pPr>
         <w:pStyle w:val="Heading1"/>
+        <w:pageBreakBefore/>
         <w:spacing w:after="160"/>
       </w:pPr>
       <w:bookmarkStart w:id="12" w:name="manual_section_11"/>
@@ -3207,33 +3168,63 @@
   </w:num>
   <w:num w:numId="10">
     <w:abstractNumId w:val="9"/>
+    <w:lvlOverride w:ilvl="0">
+      <w:startOverride w:val="1"/>
+    </w:lvlOverride>
   </w:num>
   <w:num w:numId="11">
     <w:abstractNumId w:val="9"/>
+    <w:lvlOverride w:ilvl="0">
+      <w:startOverride w:val="1"/>
+    </w:lvlOverride>
   </w:num>
   <w:num w:numId="12">
     <w:abstractNumId w:val="9"/>
+    <w:lvlOverride w:ilvl="0">
+      <w:startOverride w:val="1"/>
+    </w:lvlOverride>
   </w:num>
   <w:num w:numId="13">
     <w:abstractNumId w:val="9"/>
+    <w:lvlOverride w:ilvl="0">
+      <w:startOverride w:val="1"/>
+    </w:lvlOverride>
   </w:num>
   <w:num w:numId="14">
     <w:abstractNumId w:val="9"/>
+    <w:lvlOverride w:ilvl="0">
+      <w:startOverride w:val="1"/>
+    </w:lvlOverride>
   </w:num>
   <w:num w:numId="15">
     <w:abstractNumId w:val="9"/>
+    <w:lvlOverride w:ilvl="0">
+      <w:startOverride w:val="1"/>
+    </w:lvlOverride>
   </w:num>
   <w:num w:numId="16">
     <w:abstractNumId w:val="9"/>
+    <w:lvlOverride w:ilvl="0">
+      <w:startOverride w:val="1"/>
+    </w:lvlOverride>
   </w:num>
   <w:num w:numId="17">
     <w:abstractNumId w:val="9"/>
+    <w:lvlOverride w:ilvl="0">
+      <w:startOverride w:val="1"/>
+    </w:lvlOverride>
   </w:num>
   <w:num w:numId="18">
     <w:abstractNumId w:val="9"/>
+    <w:lvlOverride w:ilvl="0">
+      <w:startOverride w:val="1"/>
+    </w:lvlOverride>
   </w:num>
   <w:num w:numId="19">
     <w:abstractNumId w:val="9"/>
+    <w:lvlOverride w:ilvl="0">
+      <w:startOverride w:val="1"/>
+    </w:lvlOverride>
   </w:num>
 </w:numbering>
 </file>

</xml_diff>